<commit_message>
F2-E2 v2 enxuta, anexo só com as quatro perguntas e versões editadas no Word
Co-Authored-By: Claude Opus 5.5 <noreply@anthropic.com>
</commit_message>
<xml_diff>
--- a/02_Fase2_O_Mercado/F2-E2_Auditoria_do_Ativo/F2-E2_Auditoria_do_Ativo_v2.docx
+++ b/02_Fase2_O_Mercado/F2-E2_Auditoria_do_Ativo/F2-E2_Auditoria_do_Ativo_v2.docx
@@ -46,7 +46,7 @@
     <w:p>
       <w:pPr/>
       <w:r>
-        <w:t>A parte exclusiva da base são 5,9 milhões de registros de clientes. Desses, 35,4% vêm de contratos com autorização frágil para treinamento, e nenhum dos seis contratos de dados passou por revisão jurídica desde a assinatura. Em campo, de cada 10 pacientes com 60 anos ou mais de CEP D/E que precisavam de prioridade, 3 foram classificados como baixa prioridade, e quem mediu isso foi o hospital. Das cinco afirmações que a Lumis divulga ao mercado, nenhuma passa numa auditoria do jeito que é divulgada.</w:t>
+        <w:t>Um terço dos dados de clientes vem de contratos que não autorizam com clareza o treino do modelo, e nenhum contrato de dados foi revisado pelo jurídico. Em campo, de cada 10 idosos de CEP D/E que precisavam de prioridade, 3 ficaram para trás, e quem descobriu foi o hospital. Nenhuma das cinco afirmações que a Lumis divulga ao mercado resiste a uma auditoria do jeito que é divulgada.</w:t>
       </w:r>
     </w:p>
     <w:p>
@@ -55,10 +55,10 @@
         <w:rPr>
           <w:b/>
         </w:rPr>
-        <w:t>Pedido ao conselho.</w:t>
+        <w:t>Pedido ao conselho:</w:t>
       </w:r>
       <w:r>
-        <w:t xml:space="preserve"> Duas decisões agora: restringir a recomendação automática para pacientes com 60 anos ou mais de CEP C e D/E, com o custo descrito na seção 5, e tirar do material comercial os números que não se sustentam. A regularização dos contratos e os cinco indicadores de gestão seguem com prazo e responsável.</w:t>
+        <w:t xml:space="preserve"> Restringir a recomendação automática para pacientes com 60 anos ou mais de CEP C e D/E, com o custo descrito na seção 5. E tirar do material comercial os números que não se sustentam.</w:t>
       </w:r>
     </w:p>
     <w:p>
@@ -72,16 +72,7 @@
     <w:p>
       <w:pPr/>
       <w:r>
-        <w:t xml:space="preserve">A base de treinamento soma 22,0 milhões de registros. O DATASUS responde por 63,6% e os dados sintéticos gerados pela própria Lumis por 9,5%. O DATASUS tem uso autorizado, só que está aberto a qualquer concorrente. O que é exclusivo da Lumis são os 26,8% vindos de clientes, e é nessa parte que estão as fragilidades </w:t>
-      </w:r>
-      <w:r>
-        <w:rPr>
-          <w:rStyle w:val="TagFonte"/>
-        </w:rPr>
-        <w:t>[fonte: Cap. 2, Quadro 7]</w:t>
-      </w:r>
-      <w:r>
-        <w:t>.</w:t>
+        <w:t>Dois terços da base são do DATASUS, que é público e está aberto a qualquer concorrente. O que só a Lumis tem são os dados de clientes, pouco mais de um quarto da base, e é nessa parte que estão os problemas.</w:t>
       </w:r>
     </w:p>
     <w:tbl>
@@ -98,11 +89,10 @@
         <w:tblLayout w:type="fixed"/>
       </w:tblPr>
       <w:tblGrid>
-        <w:gridCol w:w="1701"/>
-        <w:gridCol w:w="1757"/>
-        <w:gridCol w:w="2097"/>
-        <w:gridCol w:w="963"/>
-        <w:gridCol w:w="2551"/>
+        <w:gridCol w:w="1927"/>
+        <w:gridCol w:w="2835"/>
+        <w:gridCol w:w="1134"/>
+        <w:gridCol w:w="3175"/>
       </w:tblGrid>
       <w:tr>
         <w:trPr>
@@ -111,7 +101,7 @@
         </w:trPr>
         <w:tc>
           <w:tcPr>
-            <w:tcW w:type="dxa" w:w="1701"/>
+            <w:tcW w:type="dxa" w:w="1928"/>
             <w:shd w:val="clear" w:color="auto" w:fill="0F2D3A"/>
           </w:tcPr>
           <w:p>
@@ -130,26 +120,7 @@
         </w:tc>
         <w:tc>
           <w:tcPr>
-            <w:tcW w:type="dxa" w:w="1757"/>
-            <w:shd w:val="clear" w:color="auto" w:fill="0F2D3A"/>
-          </w:tcPr>
-          <w:p>
-            <w:pPr>
-              <w:pStyle w:val="LumisTabela"/>
-              <w:keepNext/>
-            </w:pPr>
-            <w:r>
-              <w:rPr>
-                <w:b/>
-                <w:color w:val="FFFFFF"/>
-              </w:rPr>
-              <w:t>Volume e período</w:t>
-            </w:r>
-          </w:p>
-        </w:tc>
-        <w:tc>
-          <w:tcPr>
-            <w:tcW w:type="dxa" w:w="2098"/>
+            <w:tcW w:type="dxa" w:w="2835"/>
             <w:shd w:val="clear" w:color="auto" w:fill="0F2D3A"/>
           </w:tcPr>
           <w:p>
@@ -168,7 +139,7 @@
         </w:tc>
         <w:tc>
           <w:tcPr>
-            <w:tcW w:type="dxa" w:w="964"/>
+            <w:tcW w:type="dxa" w:w="1134"/>
             <w:shd w:val="clear" w:color="auto" w:fill="0F2D3A"/>
           </w:tcPr>
           <w:p>
@@ -187,7 +158,7 @@
         </w:tc>
         <w:tc>
           <w:tcPr>
-            <w:tcW w:type="dxa" w:w="2551"/>
+            <w:tcW w:type="dxa" w:w="3175"/>
             <w:shd w:val="clear" w:color="auto" w:fill="0F2D3A"/>
           </w:tcPr>
           <w:p>
@@ -211,7 +182,7 @@
         </w:trPr>
         <w:tc>
           <w:tcPr>
-            <w:tcW w:type="dxa" w:w="1701"/>
+            <w:tcW w:type="dxa" w:w="1928"/>
           </w:tcPr>
           <w:p>
             <w:pPr>
@@ -227,20 +198,7 @@
         </w:tc>
         <w:tc>
           <w:tcPr>
-            <w:tcW w:type="dxa" w:w="1757"/>
-          </w:tcPr>
-          <w:p>
-            <w:pPr>
-              <w:pStyle w:val="LumisTabela"/>
-            </w:pPr>
-            <w:r>
-              <w:t>890 mil sinistros, 2021 a 2026</w:t>
-            </w:r>
-          </w:p>
-        </w:tc>
-        <w:tc>
-          <w:tcPr>
-            <w:tcW w:type="dxa" w:w="2098"/>
+            <w:tcW w:type="dxa" w:w="2835"/>
           </w:tcPr>
           <w:p>
             <w:pPr>
@@ -253,7 +211,7 @@
         </w:tc>
         <w:tc>
           <w:tcPr>
-            <w:tcW w:type="dxa" w:w="964"/>
+            <w:tcW w:type="dxa" w:w="1134"/>
           </w:tcPr>
           <w:p>
             <w:pPr>
@@ -266,7 +224,7 @@
         </w:tc>
         <w:tc>
           <w:tcPr>
-            <w:tcW w:type="dxa" w:w="2551"/>
+            <w:tcW w:type="dxa" w:w="3175"/>
           </w:tcPr>
           <w:p>
             <w:pPr>
@@ -284,7 +242,7 @@
         </w:trPr>
         <w:tc>
           <w:tcPr>
-            <w:tcW w:type="dxa" w:w="1701"/>
+            <w:tcW w:type="dxa" w:w="1928"/>
             <w:shd w:val="clear" w:color="auto" w:fill="F1F6F4"/>
           </w:tcPr>
           <w:p>
@@ -301,7 +259,7 @@
         </w:tc>
         <w:tc>
           <w:tcPr>
-            <w:tcW w:type="dxa" w:w="1757"/>
+            <w:tcW w:type="dxa" w:w="2835"/>
             <w:shd w:val="clear" w:color="auto" w:fill="F1F6F4"/>
           </w:tcPr>
           <w:p>
@@ -309,13 +267,13 @@
               <w:pStyle w:val="LumisTabela"/>
             </w:pPr>
             <w:r>
-              <w:t>1,2 mi atendimentos, 2019 a 2026</w:t>
-            </w:r>
-          </w:p>
-        </w:tc>
-        <w:tc>
-          <w:tcPr>
-            <w:tcW w:type="dxa" w:w="2098"/>
+              <w:t>Cláusula genérica: "melhoria contínua do serviço"</w:t>
+            </w:r>
+          </w:p>
+        </w:tc>
+        <w:tc>
+          <w:tcPr>
+            <w:tcW w:type="dxa" w:w="1134"/>
             <w:shd w:val="clear" w:color="auto" w:fill="F1F6F4"/>
           </w:tcPr>
           <w:p>
@@ -323,27 +281,13 @@
               <w:pStyle w:val="LumisTabela"/>
             </w:pPr>
             <w:r>
-              <w:t>Cláusula genérica: "melhoria contínua do serviço"</w:t>
-            </w:r>
-          </w:p>
-        </w:tc>
-        <w:tc>
-          <w:tcPr>
-            <w:tcW w:type="dxa" w:w="964"/>
-            <w:shd w:val="clear" w:color="auto" w:fill="F1F6F4"/>
-          </w:tcPr>
-          <w:p>
-            <w:pPr>
-              <w:pStyle w:val="LumisTabela"/>
-            </w:pPr>
-            <w:r>
               <w:t>03/2027</w:t>
             </w:r>
           </w:p>
         </w:tc>
         <w:tc>
           <w:tcPr>
-            <w:tcW w:type="dxa" w:w="2551"/>
+            <w:tcW w:type="dxa" w:w="3175"/>
             <w:shd w:val="clear" w:color="auto" w:fill="F1F6F4"/>
           </w:tcPr>
           <w:p>
@@ -362,7 +306,7 @@
         </w:trPr>
         <w:tc>
           <w:tcPr>
-            <w:tcW w:type="dxa" w:w="1701"/>
+            <w:tcW w:type="dxa" w:w="1928"/>
           </w:tcPr>
           <w:p>
             <w:pPr>
@@ -374,27 +318,11 @@
               </w:rPr>
               <w:t>Rede Sanare</w:t>
             </w:r>
-            <w:r>
-              <w:t xml:space="preserve"> (7 unidades)</w:t>
-            </w:r>
-          </w:p>
-        </w:tc>
-        <w:tc>
-          <w:tcPr>
-            <w:tcW w:type="dxa" w:w="1757"/>
-          </w:tcPr>
-          <w:p>
-            <w:pPr>
-              <w:pStyle w:val="LumisTabela"/>
-            </w:pPr>
-            <w:r>
-              <w:t>3,4 mi atendimentos, 2020 a 2026</w:t>
-            </w:r>
-          </w:p>
-        </w:tc>
-        <w:tc>
-          <w:tcPr>
-            <w:tcW w:type="dxa" w:w="2098"/>
+          </w:p>
+        </w:tc>
+        <w:tc>
+          <w:tcPr>
+            <w:tcW w:type="dxa" w:w="2835"/>
           </w:tcPr>
           <w:p>
             <w:pPr>
@@ -407,7 +335,7 @@
         </w:tc>
         <w:tc>
           <w:tcPr>
-            <w:tcW w:type="dxa" w:w="964"/>
+            <w:tcW w:type="dxa" w:w="1134"/>
           </w:tcPr>
           <w:p>
             <w:pPr>
@@ -420,20 +348,14 @@
         </w:tc>
         <w:tc>
           <w:tcPr>
-            <w:tcW w:type="dxa" w:w="2551"/>
-          </w:tcPr>
-          <w:p>
-            <w:pPr>
-              <w:pStyle w:val="LumisTabela"/>
-            </w:pPr>
-            <w:r>
-              <w:t xml:space="preserve">Autoriza com condição. Se o treino cumpre a condição </w:t>
-            </w:r>
-            <w:r>
-              <w:rPr>
-                <w:rStyle w:val="TagNoconsta"/>
-              </w:rPr>
-              <w:t>[não consta]</w:t>
+            <w:tcW w:type="dxa" w:w="3175"/>
+          </w:tcPr>
+          <w:p>
+            <w:pPr>
+              <w:pStyle w:val="LumisTabela"/>
+            </w:pPr>
+            <w:r>
+              <w:t>Autoriza com condição.</w:t>
             </w:r>
           </w:p>
         </w:tc>
@@ -444,7 +366,7 @@
         </w:trPr>
         <w:tc>
           <w:tcPr>
-            <w:tcW w:type="dxa" w:w="1701"/>
+            <w:tcW w:type="dxa" w:w="1928"/>
             <w:shd w:val="clear" w:color="auto" w:fill="F1F6F4"/>
           </w:tcPr>
           <w:p>
@@ -461,7 +383,7 @@
         </w:tc>
         <w:tc>
           <w:tcPr>
-            <w:tcW w:type="dxa" w:w="1757"/>
+            <w:tcW w:type="dxa" w:w="2835"/>
             <w:shd w:val="clear" w:color="auto" w:fill="F1F6F4"/>
           </w:tcPr>
           <w:p>
@@ -469,13 +391,13 @@
               <w:pStyle w:val="LumisTabela"/>
             </w:pPr>
             <w:r>
-              <w:t>410 mil operações, 2023 a 2026</w:t>
-            </w:r>
-          </w:p>
-        </w:tc>
-        <w:tc>
-          <w:tcPr>
-            <w:tcW w:type="dxa" w:w="2098"/>
+              <w:t>Sim, com auditoria anual do cliente</w:t>
+            </w:r>
+          </w:p>
+        </w:tc>
+        <w:tc>
+          <w:tcPr>
+            <w:tcW w:type="dxa" w:w="1134"/>
             <w:shd w:val="clear" w:color="auto" w:fill="F1F6F4"/>
           </w:tcPr>
           <w:p>
@@ -483,13 +405,13 @@
               <w:pStyle w:val="LumisTabela"/>
             </w:pPr>
             <w:r>
-              <w:t>Sim, com auditoria anual do cliente</w:t>
-            </w:r>
-          </w:p>
-        </w:tc>
-        <w:tc>
-          <w:tcPr>
-            <w:tcW w:type="dxa" w:w="964"/>
+              <w:t>05/2028</w:t>
+            </w:r>
+          </w:p>
+        </w:tc>
+        <w:tc>
+          <w:tcPr>
+            <w:tcW w:type="dxa" w:w="3175"/>
             <w:shd w:val="clear" w:color="auto" w:fill="F1F6F4"/>
           </w:tcPr>
           <w:p>
@@ -497,21 +419,7 @@
               <w:pStyle w:val="LumisTabela"/>
             </w:pPr>
             <w:r>
-              <w:t>05/2028</w:t>
-            </w:r>
-          </w:p>
-        </w:tc>
-        <w:tc>
-          <w:tcPr>
-            <w:tcW w:type="dxa" w:w="2551"/>
-            <w:shd w:val="clear" w:color="auto" w:fill="F1F6F4"/>
-          </w:tcPr>
-          <w:p>
-            <w:pPr>
-              <w:pStyle w:val="LumisTabela"/>
-            </w:pPr>
-            <w:r>
-              <w:t>Autoriza com condição. Sigilo bancário pede atenção própria</w:t>
+              <w:t>Autoriza com condição.</w:t>
             </w:r>
           </w:p>
         </w:tc>
@@ -522,53 +430,43 @@
         </w:trPr>
         <w:tc>
           <w:tcPr>
-            <w:tcW w:type="dxa" w:w="1701"/>
-          </w:tcPr>
-          <w:p>
-            <w:pPr>
-              <w:pStyle w:val="LumisTabela"/>
+            <w:tcW w:type="dxa" w:w="1928"/>
+          </w:tcPr>
+          <w:p>
+            <w:pPr>
+              <w:pStyle w:val="LumisTabela"/>
+              <w:keepNext/>
             </w:pPr>
             <w:r>
               <w:rPr>
                 <w:b/>
               </w:rPr>
-              <w:t>DATASUS</w:t>
-            </w:r>
-          </w:p>
-        </w:tc>
-        <w:tc>
-          <w:tcPr>
-            <w:tcW w:type="dxa" w:w="1757"/>
-          </w:tcPr>
-          <w:p>
-            <w:pPr>
-              <w:pStyle w:val="LumisTabela"/>
-            </w:pPr>
-            <w:r>
-              <w:t>14,0 mi registros, 2015 a 2024</w:t>
-            </w:r>
-          </w:p>
-        </w:tc>
-        <w:tc>
-          <w:tcPr>
-            <w:tcW w:type="dxa" w:w="2098"/>
-          </w:tcPr>
-          <w:p>
-            <w:pPr>
-              <w:pStyle w:val="LumisTabela"/>
-            </w:pPr>
-            <w:r>
-              <w:t>Uso público</w:t>
-            </w:r>
-          </w:p>
-        </w:tc>
-        <w:tc>
-          <w:tcPr>
-            <w:tcW w:type="dxa" w:w="964"/>
-          </w:tcPr>
-          <w:p>
-            <w:pPr>
-              <w:pStyle w:val="LumisTabela"/>
+              <w:t>DATASUS e sintéticos</w:t>
+            </w:r>
+          </w:p>
+        </w:tc>
+        <w:tc>
+          <w:tcPr>
+            <w:tcW w:type="dxa" w:w="2835"/>
+          </w:tcPr>
+          <w:p>
+            <w:pPr>
+              <w:pStyle w:val="LumisTabela"/>
+              <w:keepNext/>
+            </w:pPr>
+            <w:r>
+              <w:t>Uso público e geração própria</w:t>
+            </w:r>
+          </w:p>
+        </w:tc>
+        <w:tc>
+          <w:tcPr>
+            <w:tcW w:type="dxa" w:w="1134"/>
+          </w:tcPr>
+          <w:p>
+            <w:pPr>
+              <w:pStyle w:val="LumisTabela"/>
+              <w:keepNext/>
             </w:pPr>
             <w:r>
               <w:t>Não se aplica</w:t>
@@ -577,26 +475,7 @@
         </w:tc>
         <w:tc>
           <w:tcPr>
-            <w:tcW w:type="dxa" w:w="2551"/>
-          </w:tcPr>
-          <w:p>
-            <w:pPr>
-              <w:pStyle w:val="LumisTabela"/>
-            </w:pPr>
-            <w:r>
-              <w:t>Autorizado e aberto a todos</w:t>
-            </w:r>
-          </w:p>
-        </w:tc>
-      </w:tr>
-      <w:tr>
-        <w:trPr>
-          <w:cantSplit/>
-        </w:trPr>
-        <w:tc>
-          <w:tcPr>
-            <w:tcW w:type="dxa" w:w="1701"/>
-            <w:shd w:val="clear" w:color="auto" w:fill="F1F6F4"/>
+            <w:tcW w:type="dxa" w:w="3175"/>
           </w:tcPr>
           <w:p>
             <w:pPr>
@@ -604,76 +483,7 @@
               <w:keepNext/>
             </w:pPr>
             <w:r>
-              <w:rPr>
-                <w:b/>
-              </w:rPr>
-              <w:t>Sintéticos internos</w:t>
-            </w:r>
-          </w:p>
-        </w:tc>
-        <w:tc>
-          <w:tcPr>
-            <w:tcW w:type="dxa" w:w="1757"/>
-            <w:shd w:val="clear" w:color="auto" w:fill="F1F6F4"/>
-          </w:tcPr>
-          <w:p>
-            <w:pPr>
-              <w:pStyle w:val="LumisTabela"/>
-              <w:keepNext/>
-            </w:pPr>
-            <w:r>
-              <w:t>2,1 mi registros, 2024 a 2026</w:t>
-            </w:r>
-          </w:p>
-        </w:tc>
-        <w:tc>
-          <w:tcPr>
-            <w:tcW w:type="dxa" w:w="2098"/>
-            <w:shd w:val="clear" w:color="auto" w:fill="F1F6F4"/>
-          </w:tcPr>
-          <w:p>
-            <w:pPr>
-              <w:pStyle w:val="LumisTabela"/>
-              <w:keepNext/>
-            </w:pPr>
-            <w:r>
-              <w:t>Geração própria</w:t>
-            </w:r>
-          </w:p>
-        </w:tc>
-        <w:tc>
-          <w:tcPr>
-            <w:tcW w:type="dxa" w:w="964"/>
-            <w:shd w:val="clear" w:color="auto" w:fill="F1F6F4"/>
-          </w:tcPr>
-          <w:p>
-            <w:pPr>
-              <w:pStyle w:val="LumisTabela"/>
-              <w:keepNext/>
-            </w:pPr>
-            <w:r>
-              <w:t>Não se aplica</w:t>
-            </w:r>
-          </w:p>
-        </w:tc>
-        <w:tc>
-          <w:tcPr>
-            <w:tcW w:type="dxa" w:w="2551"/>
-            <w:shd w:val="clear" w:color="auto" w:fill="F1F6F4"/>
-          </w:tcPr>
-          <w:p>
-            <w:pPr>
-              <w:pStyle w:val="LumisTabela"/>
-              <w:keepNext/>
-            </w:pPr>
-            <w:r>
-              <w:t xml:space="preserve">De que dados foram gerados </w:t>
-            </w:r>
-            <w:r>
-              <w:rPr>
-                <w:rStyle w:val="TagNoconsta"/>
-              </w:rPr>
-              <w:t>[não consta]</w:t>
+              <w:t>Autorizados. O DATASUS é aberto a todos</w:t>
             </w:r>
           </w:p>
         </w:tc>
@@ -684,13 +494,7 @@
         <w:pStyle w:val="Legenda"/>
       </w:pPr>
       <w:r>
-        <w:t>Tabela 1. As seis fontes da base de treinamento, da mais frágil para a mais segura. Fonte: Cap. 2, Quadro 7; leitura da equipe.</w:t>
-      </w:r>
-    </w:p>
-    <w:p>
-      <w:pPr/>
-      <w:r>
-        <w:t>Os pontos frágeis são quatro:</w:t>
+        <w:t>Tabela 1. As fontes da base de treinamento, da mais frágil para a mais segura. Fonte: Cap. 2, Quadro 7; leitura da equipe.</w:t>
       </w:r>
     </w:p>
     <w:p>
@@ -701,19 +505,10 @@
         <w:rPr>
           <w:b/>
         </w:rPr>
-        <w:t>Autorização.</w:t>
+        <w:t>Os contratos mais frágeis são os que vencem primeiro.</w:t>
       </w:r>
       <w:r>
-        <w:t xml:space="preserve"> Prisma e Vila Ipê somam 2,09 milhões de registros, 35,4% dos dados de clientes. Nenhum dos seis instrumentos passou por revisão jurídica, e a política de privacidade para dados de saúde está em elaboração desde 2024, sem versão aprovada </w:t>
-      </w:r>
-      <w:r>
-        <w:rPr>
-          <w:rStyle w:val="TagFonte"/>
-        </w:rPr>
-        <w:t>[fonte: Cap. 2, Quadros 7 e 17]</w:t>
-      </w:r>
-      <w:r>
-        <w:t>. O modelo atual já foi treinado com esses dados, então o risco existe hoje, antes de qualquer vencimento.</w:t>
+        <w:t xml:space="preserve"> Prisma e Vila Ipê somam um terço dos dados de clientes. Nenhum dos seis contratos de dados passou por revisão jurídica, e o modelo atual já foi treinado com esses dados. O risco existe hoje, antes de qualquer vencimento.</w:t>
       </w:r>
     </w:p>
     <w:p>
@@ -727,16 +522,7 @@
         <w:t>Base legal.</w:t>
       </w:r>
       <w:r>
-        <w:t xml:space="preserve"> Dado de saúde é dado pessoal sensível, e a LGPD pede finalidade específica e informada ao titular³. Uma cláusula de "melhoria contínua do serviço" dificilmente cobre treinar um produto vendido a outros clientes. Quem trata dados em nome do cliente só pode usá-los para a finalidade definida por ele⁴. Ao treinar o próprio modelo, a Lumis passa a decidir uma finalidade própria e precisaria de base legal própria </w:t>
-      </w:r>
-      <w:r>
-        <w:rPr>
-          <w:rStyle w:val="TagHiptese"/>
-        </w:rPr>
-        <w:t>[hipótese]</w:t>
-      </w:r>
-      <w:r>
-        <w:t>.</w:t>
+        <w:t xml:space="preserve"> Dado de saúde é dado pessoal sensível, e a LGPD pede finalidade específica e informada ao titular². Uma cláusula de "melhoria contínua do serviço" dificilmente cobre treinar um produto vendido a outros clientes. Quem trata dados em nome do cliente só pode usá-los para a finalidade definida por ele³. Ao treinar o próprio modelo, a Lumis passa a decidir uma finalidade própria e precisaria de base legal própria.</w:t>
       </w:r>
     </w:p>
     <w:p>
@@ -747,33 +533,10 @@
         <w:rPr>
           <w:b/>
         </w:rPr>
-        <w:t>Prazo.</w:t>
+        <w:t>Dados anteriores à empresa.</w:t>
       </w:r>
       <w:r>
-        <w:t xml:space="preserve"> As duas fontes frágeis são as que vencem primeiro: Prisma em 12/2026 e Vila Ipê em 03/2027. O Vila Ipê é, ao mesmo tempo, fonte de dados e o cliente que mandou a notificação formal sobre o viés </w:t>
-      </w:r>
-      <w:r>
-        <w:rPr>
-          <w:rStyle w:val="TagFonte"/>
-        </w:rPr>
-        <w:t>[fonte: Cap. 2, Quadros 7 e 14]</w:t>
-      </w:r>
-      <w:r>
-        <w:t>.</w:t>
-      </w:r>
-    </w:p>
-    <w:p>
-      <w:pPr>
-        <w:pStyle w:val="Commarcadores"/>
-      </w:pPr>
-      <w:r>
-        <w:rPr>
-          <w:b/>
-        </w:rPr>
-        <w:t>Histórico anterior ao contrato.</w:t>
-      </w:r>
-      <w:r>
-        <w:t xml:space="preserve"> A Lumis foi fundada em 2022, mas os dados do Vila Ipê começam em 2019, os da Sanare em 2020 e o contrato da Prisma é de 2021 </w:t>
+        <w:t xml:space="preserve"> A Lumis foi fundada em 2022, e parte dos dados de clientes começa em 2019 </w:t>
       </w:r>
       <w:r>
         <w:rPr>
@@ -782,7 +545,7 @@
         <w:t>[fonte: Cap. 2, Quadros 3 e 7]</w:t>
       </w:r>
       <w:r>
-        <w:t xml:space="preserve">. Se esse histórico chegou à Lumis e sob que cláusula </w:t>
+        <w:t xml:space="preserve">. Sob que cláusula esse histórico chegou </w:t>
       </w:r>
       <w:r>
         <w:rPr>
@@ -797,69 +560,7 @@
     <w:p>
       <w:pPr/>
       <w:r>
-        <w:rPr>
-          <w:b/>
-        </w:rPr>
-        <w:t>O que é defensável hoje.</w:t>
-      </w:r>
-      <w:r>
-        <w:t xml:space="preserve"> No máximo os 3,81 milhões de registros da Sanare e do Meridiano, 64,6% dos dados de clientes, que têm autorização expressa. Mesmo essa parte depende de condições que ninguém verificou </w:t>
-      </w:r>
-      <w:r>
-        <w:rPr>
-          <w:rStyle w:val="TagFonte"/>
-        </w:rPr>
-        <w:t>[fonte: conta da equipe sobre o Quadro 7]</w:t>
-      </w:r>
-      <w:r>
-        <w:t>. Com autorização expressa e parecer jurídico, a parcela é zero.</w:t>
-      </w:r>
-    </w:p>
-    <w:p>
-      <w:pPr/>
-      <w:r>
-        <w:rPr>
-          <w:b/>
-        </w:rPr>
-        <w:t>Tamanho do risco.</w:t>
-      </w:r>
-      <w:r>
-        <w:t xml:space="preserve"> Se Prisma e Vila Ipê pagam perto do ticket médio de R$ 1,084 milhão, os dois contratos valem cerca de R$ 2,2 milhões por ano, uns 5% do ARR </w:t>
-      </w:r>
-      <w:r>
-        <w:rPr>
-          <w:rStyle w:val="TagHiptese"/>
-        </w:rPr>
-        <w:t>[hipótese]</w:t>
-      </w:r>
-      <w:r>
-        <w:t xml:space="preserve">. A LGPD prevê multa de até 2% do faturamento, limitada a R$ 50 milhões por infração, e também a eliminação dos dados³. O custo maior tende a ser retirar dados e retreinar o modelo </w:t>
-      </w:r>
-      <w:r>
-        <w:rPr>
-          <w:rStyle w:val="TagHiptese"/>
-        </w:rPr>
-        <w:t>[hipótese]</w:t>
-      </w:r>
-      <w:r>
-        <w:t xml:space="preserve">, e esse custo </w:t>
-      </w:r>
-      <w:r>
-        <w:rPr>
-          <w:rStyle w:val="TagNoconsta"/>
-        </w:rPr>
-        <w:t>[não consta]</w:t>
-      </w:r>
-      <w:r>
-        <w:t>.</w:t>
-      </w:r>
-    </w:p>
-    <w:p>
-      <w:pPr>
-        <w:pStyle w:val="LumisNota"/>
-      </w:pPr>
-      <w:r>
-        <w:t>O Cap. 2 diz em um trecho que são três os contratos com cláusula que ninguém releu, e o Quadro 5 fala em dois. Seguimos o Quadro 7, que mostra dois.</w:t>
+        <w:t>O que é defensável hoje são os dados da Sanare e do Meridiano, e mesmo eles dependem de condições que ninguém verificou. A recomendação é ter o parecer da DPO sobre os seis contratos antes do próximo treino, renegociar Prisma e Vila Ipê antes do vencimento, incluindo o histórico, e aprovar a política de dados de saúde, parada desde 2024.</w:t>
       </w:r>
     </w:p>
     <w:p>
@@ -873,16 +574,7 @@
     <w:p>
       <w:pPr/>
       <w:r>
-        <w:t xml:space="preserve">As duas variáveis de maior peso no modelo são o número de atendimentos nos últimos 24 meses (18,4%) e o custo acumulado de procedimentos (15,1%). A empresa diz que elas medem necessidade de cuidado e gravidade </w:t>
-      </w:r>
-      <w:r>
-        <w:rPr>
-          <w:rStyle w:val="TagFonte"/>
-        </w:rPr>
-        <w:t>[fonte: Cap. 2, Quadro 8]</w:t>
-      </w:r>
-      <w:r>
-        <w:t xml:space="preserve">. Elas medem quem conseguiu ser atendido e quanto isso custou. Esse é o caso de variável proxy que o próprio capítulo descreve: quem usa gasto com saúde como indicador de gravidade mede "quem teve mais acesso a atendimento", e "foi exatamente isso que aconteceu no incidente da Fase 1" </w:t>
+        <w:t xml:space="preserve">As duas variáveis que mais pesam no modelo, número de atendimentos e custo acumulado, deveriam medir necessidade de cuidado e gravidade. Na prática, medem quem conseguiu ser atendido e quanto isso custou. Quem teve menos acesso parece menos grave para o modelo. O capítulo descreve esse caso e diz que "foi exatamente isso que aconteceu no incidente da Fase 1" </w:t>
       </w:r>
       <w:r>
         <w:rPr>
@@ -897,7 +589,13 @@
     <w:p>
       <w:pPr/>
       <w:r>
-        <w:t>Juntas, as duas somam 33,5% do peso do modelo. Numa população desigual, o paciente que teve menos acesso parece menos grave para o modelo do que é. Um caso real mostra o mesmo mecanismo: nos Estados Unidos, um algoritmo que usava custo no lugar de necessidade dava o mesmo escore a pacientes negros que estavam mais doentes que pacientes brancos¹.</w:t>
+        <w:rPr>
+          <w:b/>
+        </w:rPr>
+        <w:t>Um caso real com o mesmo erro.</w:t>
+      </w:r>
+      <w:r>
+        <w:t xml:space="preserve"> Em 2019, pesquisadores publicaram na revista Science a análise de um algoritmo comercial usado nos Estados Unidos para escolher pacientes para cuidado extra¹. O algoritmo previa quanto cada paciente ia custar, e não quão doente estava. Como pacientes negros tinham menos acesso a atendimento, gastavam menos e recebiam o mesmo escore que pacientes brancos mais saudáveis. Com a medida corrigida, a parcela de pacientes negros indicados para cuidado extra mais que dobraria. Na Lumis, o mecanismo é o mesmo, e quem fica para trás é quem tem menos acesso, como os idosos de CEP D/E. O caso não faz parte da história da Lumis e entra como comparação.</w:t>
       </w:r>
     </w:p>
     <w:tbl>
@@ -914,10 +612,10 @@
         <w:tblLayout w:type="fixed"/>
       </w:tblPr>
       <w:tblGrid>
-        <w:gridCol w:w="2154"/>
-        <w:gridCol w:w="1701"/>
-        <w:gridCol w:w="2154"/>
-        <w:gridCol w:w="3061"/>
+        <w:gridCol w:w="1814"/>
+        <w:gridCol w:w="2041"/>
+        <w:gridCol w:w="2268"/>
+        <w:gridCol w:w="2948"/>
       </w:tblGrid>
       <w:tr>
         <w:trPr>
@@ -926,7 +624,7 @@
         </w:trPr>
         <w:tc>
           <w:tcPr>
-            <w:tcW w:type="dxa" w:w="2154"/>
+            <w:tcW w:type="dxa" w:w="1814"/>
             <w:shd w:val="clear" w:color="auto" w:fill="0F2D3A"/>
           </w:tcPr>
           <w:p>
@@ -939,13 +637,13 @@
                 <w:b/>
                 <w:color w:val="FFFFFF"/>
               </w:rPr>
-              <w:t>Variável (peso)</w:t>
-            </w:r>
-          </w:p>
-        </w:tc>
-        <w:tc>
-          <w:tcPr>
-            <w:tcW w:type="dxa" w:w="1701"/>
+              <w:t>Variável</w:t>
+            </w:r>
+          </w:p>
+        </w:tc>
+        <w:tc>
+          <w:tcPr>
+            <w:tcW w:type="dxa" w:w="2041"/>
             <w:shd w:val="clear" w:color="auto" w:fill="0F2D3A"/>
           </w:tcPr>
           <w:p>
@@ -964,7 +662,7 @@
         </w:tc>
         <w:tc>
           <w:tcPr>
-            <w:tcW w:type="dxa" w:w="2154"/>
+            <w:tcW w:type="dxa" w:w="2268"/>
             <w:shd w:val="clear" w:color="auto" w:fill="0F2D3A"/>
           </w:tcPr>
           <w:p>
@@ -983,7 +681,7 @@
         </w:tc>
         <w:tc>
           <w:tcPr>
-            <w:tcW w:type="dxa" w:w="3061"/>
+            <w:tcW w:type="dxa" w:w="2948"/>
             <w:shd w:val="clear" w:color="auto" w:fill="0F2D3A"/>
           </w:tcPr>
           <w:p>
@@ -996,7 +694,7 @@
                 <w:b/>
                 <w:color w:val="FFFFFF"/>
               </w:rPr>
-              <w:t>Distorção possível</w:t>
+              <w:t>Efeito</w:t>
             </w:r>
           </w:p>
         </w:tc>
@@ -1007,20 +705,20 @@
         </w:trPr>
         <w:tc>
           <w:tcPr>
-            <w:tcW w:type="dxa" w:w="2154"/>
-          </w:tcPr>
-          <w:p>
-            <w:pPr>
-              <w:pStyle w:val="LumisTabela"/>
-            </w:pPr>
-            <w:r>
-              <w:t>Nº de atendimentos em 24 meses (18,4%)</w:t>
-            </w:r>
-          </w:p>
-        </w:tc>
-        <w:tc>
-          <w:tcPr>
-            <w:tcW w:type="dxa" w:w="1701"/>
+            <w:tcW w:type="dxa" w:w="1814"/>
+          </w:tcPr>
+          <w:p>
+            <w:pPr>
+              <w:pStyle w:val="LumisTabela"/>
+            </w:pPr>
+            <w:r>
+              <w:t>Nº de atendimentos</w:t>
+            </w:r>
+          </w:p>
+        </w:tc>
+        <w:tc>
+          <w:tcPr>
+            <w:tcW w:type="dxa" w:w="2041"/>
           </w:tcPr>
           <w:p>
             <w:pPr>
@@ -1033,7 +731,7 @@
         </w:tc>
         <w:tc>
           <w:tcPr>
-            <w:tcW w:type="dxa" w:w="2154"/>
+            <w:tcW w:type="dxa" w:w="2268"/>
           </w:tcPr>
           <w:p>
             <w:pPr>
@@ -1046,7 +744,7 @@
         </w:tc>
         <w:tc>
           <w:tcPr>
-            <w:tcW w:type="dxa" w:w="3061"/>
+            <w:tcW w:type="dxa" w:w="2948"/>
           </w:tcPr>
           <w:p>
             <w:pPr>
@@ -1064,7 +762,7 @@
         </w:trPr>
         <w:tc>
           <w:tcPr>
-            <w:tcW w:type="dxa" w:w="2154"/>
+            <w:tcW w:type="dxa" w:w="1814"/>
             <w:shd w:val="clear" w:color="auto" w:fill="F1F6F4"/>
           </w:tcPr>
           <w:p>
@@ -1072,13 +770,13 @@
               <w:pStyle w:val="LumisTabela"/>
             </w:pPr>
             <w:r>
-              <w:t>Custo acumulado (15,1%)</w:t>
-            </w:r>
-          </w:p>
-        </w:tc>
-        <w:tc>
-          <w:tcPr>
-            <w:tcW w:type="dxa" w:w="1701"/>
+              <w:t>Custo acumulado</w:t>
+            </w:r>
+          </w:p>
+        </w:tc>
+        <w:tc>
+          <w:tcPr>
+            <w:tcW w:type="dxa" w:w="2041"/>
             <w:shd w:val="clear" w:color="auto" w:fill="F1F6F4"/>
           </w:tcPr>
           <w:p>
@@ -1092,7 +790,7 @@
         </w:tc>
         <w:tc>
           <w:tcPr>
-            <w:tcW w:type="dxa" w:w="2154"/>
+            <w:tcW w:type="dxa" w:w="2268"/>
             <w:shd w:val="clear" w:color="auto" w:fill="F1F6F4"/>
           </w:tcPr>
           <w:p>
@@ -1106,7 +804,7 @@
         </w:tc>
         <w:tc>
           <w:tcPr>
-            <w:tcW w:type="dxa" w:w="3061"/>
+            <w:tcW w:type="dxa" w:w="2948"/>
             <w:shd w:val="clear" w:color="auto" w:fill="F1F6F4"/>
           </w:tcPr>
           <w:p>
@@ -1125,20 +823,20 @@
         </w:trPr>
         <w:tc>
           <w:tcPr>
-            <w:tcW w:type="dxa" w:w="2154"/>
-          </w:tcPr>
-          <w:p>
-            <w:pPr>
-              <w:pStyle w:val="LumisTabela"/>
-            </w:pPr>
-            <w:r>
-              <w:t>Faixa de CEP (8,9%)</w:t>
-            </w:r>
-          </w:p>
-        </w:tc>
-        <w:tc>
-          <w:tcPr>
-            <w:tcW w:type="dxa" w:w="1701"/>
+            <w:tcW w:type="dxa" w:w="1814"/>
+          </w:tcPr>
+          <w:p>
+            <w:pPr>
+              <w:pStyle w:val="LumisTabela"/>
+            </w:pPr>
+            <w:r>
+              <w:t>Faixa de CEP</w:t>
+            </w:r>
+          </w:p>
+        </w:tc>
+        <w:tc>
+          <w:tcPr>
+            <w:tcW w:type="dxa" w:w="2041"/>
           </w:tcPr>
           <w:p>
             <w:pPr>
@@ -1151,27 +849,27 @@
         </w:tc>
         <w:tc>
           <w:tcPr>
-            <w:tcW w:type="dxa" w:w="2154"/>
-          </w:tcPr>
-          <w:p>
-            <w:pPr>
-              <w:pStyle w:val="LumisTabela"/>
-            </w:pPr>
-            <w:r>
-              <w:t>Renda e oferta de serviços perto de casa</w:t>
-            </w:r>
-          </w:p>
-        </w:tc>
-        <w:tc>
-          <w:tcPr>
-            <w:tcW w:type="dxa" w:w="3061"/>
-          </w:tcPr>
-          <w:p>
-            <w:pPr>
-              <w:pStyle w:val="LumisTabela"/>
-            </w:pPr>
-            <w:r>
-              <w:t>Leva a desigualdade regional para dentro do modelo</w:t>
+            <w:tcW w:type="dxa" w:w="2268"/>
+          </w:tcPr>
+          <w:p>
+            <w:pPr>
+              <w:pStyle w:val="LumisTabela"/>
+            </w:pPr>
+            <w:r>
+              <w:t>Renda e oferta de serviços</w:t>
+            </w:r>
+          </w:p>
+        </w:tc>
+        <w:tc>
+          <w:tcPr>
+            <w:tcW w:type="dxa" w:w="2948"/>
+          </w:tcPr>
+          <w:p>
+            <w:pPr>
+              <w:pStyle w:val="LumisTabela"/>
+            </w:pPr>
+            <w:r>
+              <w:t>Leva a desigualdade regional para o modelo</w:t>
             </w:r>
           </w:p>
         </w:tc>
@@ -1182,26 +880,28 @@
         </w:trPr>
         <w:tc>
           <w:tcPr>
-            <w:tcW w:type="dxa" w:w="2154"/>
+            <w:tcW w:type="dxa" w:w="1814"/>
             <w:shd w:val="clear" w:color="auto" w:fill="F1F6F4"/>
           </w:tcPr>
           <w:p>
             <w:pPr>
               <w:pStyle w:val="LumisTabela"/>
-            </w:pPr>
-            <w:r>
-              <w:t>Tipo de plano (7,4%)</w:t>
-            </w:r>
-          </w:p>
-        </w:tc>
-        <w:tc>
-          <w:tcPr>
-            <w:tcW w:type="dxa" w:w="1701"/>
+              <w:keepNext/>
+            </w:pPr>
+            <w:r>
+              <w:t>Tipo de plano</w:t>
+            </w:r>
+          </w:p>
+        </w:tc>
+        <w:tc>
+          <w:tcPr>
+            <w:tcW w:type="dxa" w:w="2041"/>
             <w:shd w:val="clear" w:color="auto" w:fill="F1F6F4"/>
           </w:tcPr>
           <w:p>
             <w:pPr>
               <w:pStyle w:val="LumisTabela"/>
+              <w:keepNext/>
             </w:pPr>
             <w:r>
               <w:t>Cobertura contratada</w:t>
@@ -1210,12 +910,13 @@
         </w:tc>
         <w:tc>
           <w:tcPr>
-            <w:tcW w:type="dxa" w:w="2154"/>
+            <w:tcW w:type="dxa" w:w="2268"/>
             <w:shd w:val="clear" w:color="auto" w:fill="F1F6F4"/>
           </w:tcPr>
           <w:p>
             <w:pPr>
               <w:pStyle w:val="LumisTabela"/>
+              <w:keepNext/>
             </w:pPr>
             <w:r>
               <w:t>Renda</w:t>
@@ -1224,137 +925,16 @@
         </w:tc>
         <w:tc>
           <w:tcPr>
-            <w:tcW w:type="dxa" w:w="3061"/>
+            <w:tcW w:type="dxa" w:w="2948"/>
             <w:shd w:val="clear" w:color="auto" w:fill="F1F6F4"/>
           </w:tcPr>
           <w:p>
             <w:pPr>
               <w:pStyle w:val="LumisTabela"/>
-            </w:pPr>
-            <w:r>
-              <w:t>Prioridade passa a depender do plano</w:t>
-            </w:r>
-          </w:p>
-        </w:tc>
-      </w:tr>
-      <w:tr>
-        <w:trPr>
-          <w:cantSplit/>
-        </w:trPr>
-        <w:tc>
-          <w:tcPr>
-            <w:tcW w:type="dxa" w:w="2154"/>
-          </w:tcPr>
-          <w:p>
-            <w:pPr>
-              <w:pStyle w:val="LumisTabela"/>
-            </w:pPr>
-            <w:r>
-              <w:t>Idade (12,7%)</w:t>
-            </w:r>
-          </w:p>
-        </w:tc>
-        <w:tc>
-          <w:tcPr>
-            <w:tcW w:type="dxa" w:w="1701"/>
-          </w:tcPr>
-          <w:p>
-            <w:pPr>
-              <w:pStyle w:val="LumisTabela"/>
-            </w:pPr>
-            <w:r>
-              <w:t>Idade</w:t>
-            </w:r>
-          </w:p>
-        </w:tc>
-        <w:tc>
-          <w:tcPr>
-            <w:tcW w:type="dxa" w:w="2154"/>
-          </w:tcPr>
-          <w:p>
-            <w:pPr>
-              <w:pStyle w:val="LumisTabela"/>
-            </w:pPr>
-            <w:r>
-              <w:t>Idade, com fundamento clínico</w:t>
-            </w:r>
-          </w:p>
-        </w:tc>
-        <w:tc>
-          <w:tcPr>
-            <w:tcW w:type="dxa" w:w="3061"/>
-          </w:tcPr>
-          <w:p>
-            <w:pPr>
-              <w:pStyle w:val="LumisTabela"/>
-            </w:pPr>
-            <w:r>
-              <w:t>Depende de como entra no modelo; o pior erro está nos idosos</w:t>
-            </w:r>
-          </w:p>
-        </w:tc>
-      </w:tr>
-      <w:tr>
-        <w:trPr>
-          <w:cantSplit/>
-        </w:trPr>
-        <w:tc>
-          <w:tcPr>
-            <w:tcW w:type="dxa" w:w="2154"/>
-            <w:shd w:val="clear" w:color="auto" w:fill="F1F6F4"/>
-          </w:tcPr>
-          <w:p>
-            <w:pPr>
-              <w:pStyle w:val="LumisTabela"/>
               <w:keepNext/>
             </w:pPr>
             <w:r>
-              <w:t>Comorbidades registradas (11,2%)</w:t>
-            </w:r>
-          </w:p>
-        </w:tc>
-        <w:tc>
-          <w:tcPr>
-            <w:tcW w:type="dxa" w:w="1701"/>
-            <w:shd w:val="clear" w:color="auto" w:fill="F1F6F4"/>
-          </w:tcPr>
-          <w:p>
-            <w:pPr>
-              <w:pStyle w:val="LumisTabela"/>
-              <w:keepNext/>
-            </w:pPr>
-            <w:r>
-              <w:t>Carga de doença</w:t>
-            </w:r>
-          </w:p>
-        </w:tc>
-        <w:tc>
-          <w:tcPr>
-            <w:tcW w:type="dxa" w:w="2154"/>
-            <w:shd w:val="clear" w:color="auto" w:fill="F1F6F4"/>
-          </w:tcPr>
-          <w:p>
-            <w:pPr>
-              <w:pStyle w:val="LumisTabela"/>
-              <w:keepNext/>
-            </w:pPr>
-            <w:r>
-              <w:t>Doença já diagnosticada</w:t>
-            </w:r>
-          </w:p>
-        </w:tc>
-        <w:tc>
-          <w:tcPr>
-            <w:tcW w:type="dxa" w:w="3061"/>
-            <w:shd w:val="clear" w:color="auto" w:fill="F1F6F4"/>
-          </w:tcPr>
-          <w:p>
-            <w:pPr>
-              <w:pStyle w:val="LumisTabela"/>
-              <w:keepNext/>
-            </w:pPr>
-            <w:r>
-              <w:t>Quem não foi diagnosticado parece mais saudável</w:t>
+              <w:t>A prioridade passa a depender do plano</w:t>
             </w:r>
           </w:p>
         </w:tc>
@@ -1365,64 +945,22 @@
         <w:pStyle w:val="Legenda"/>
       </w:pPr>
       <w:r>
-        <w:t xml:space="preserve">Tabela 2. As variáveis de acesso e as de leitura discutível. As outras quatro estão no Anexo. Fonte: Cap. 2, Quadro 8; colunas 3 e 4: leitura da equipe </w:t>
-      </w:r>
-      <w:r>
-        <w:rPr>
-          <w:rStyle w:val="TagHiptese"/>
-        </w:rPr>
-        <w:t>[hipótese]</w:t>
-      </w:r>
-      <w:r>
-        <w:t>.</w:t>
+        <w:t>Tabela 2. As variáveis que medem acesso. Juntas, são metade do peso do modelo. Fonte: Cap. 2, Quadro 8; leitura da equipe.</w:t>
       </w:r>
     </w:p>
     <w:p>
       <w:pPr/>
       <w:r>
-        <w:t xml:space="preserve">A faixa de CEP reforça o caso. Ela mede o que a empresa diz, a região, e por isso mesmo carrega renda e oferta de serviços. Com a idade fixa, o falso negativo sobe de A/B para D/E nas duas faixas etárias: 9,6 pontos entre 18 e 59 anos e 15,9 pontos entre os de 60 ou mais </w:t>
+        <w:t xml:space="preserve">O CEP reforça o caso: com a mesma idade, o erro cresce de A/B para D/E nas duas faixas etárias </w:t>
       </w:r>
       <w:r>
         <w:rPr>
           <w:rStyle w:val="TagFonte"/>
         </w:rPr>
-        <w:t>[fonte: conta da equipe sobre o Quadro 10]</w:t>
+        <w:t>[fonte: Cap. 2, Quadro 10]</w:t>
       </w:r>
       <w:r>
-        <w:t>.</w:t>
-      </w:r>
-    </w:p>
-    <w:p>
-      <w:pPr/>
-      <w:r>
-        <w:t xml:space="preserve">Pelo critério da equipe, as variáveis que registram uso passado de serviços ou renda (atendimentos, custo, CEP e plano) somam 49,8% do peso do modelo </w:t>
-      </w:r>
-      <w:r>
-        <w:rPr>
-          <w:rStyle w:val="TagHiptese"/>
-        </w:rPr>
-        <w:t>[hipótese]</w:t>
-      </w:r>
-      <w:r>
-        <w:t xml:space="preserve">. O único sinal clínico direto, o painel de exames laboratoriais, pesa 6,9%. O efeito da idade tem duas explicações que o anexo não permite separar: o rótulo do treino reflete uso passado, ou há poucos idosos na base </w:t>
-      </w:r>
-      <w:r>
-        <w:rPr>
-          <w:rStyle w:val="TagHiptese"/>
-        </w:rPr>
-        <w:t>[hipótese]</w:t>
-      </w:r>
-      <w:r>
-        <w:t xml:space="preserve">. Os testes que separam as duas ficam para a Fase 3, e nenhum foi feito pela Lumis </w:t>
-      </w:r>
-      <w:r>
-        <w:rPr>
-          <w:rStyle w:val="TagNoconsta"/>
-        </w:rPr>
-        <w:t>[não consta]</w:t>
-      </w:r>
-      <w:r>
-        <w:t>.</w:t>
+        <w:t>. Por que os idosos são os mais afetados o anexo não permite separar, e os testes ficam para a Fase 3.</w:t>
       </w:r>
     </w:p>
     <w:p>
@@ -1436,7 +974,7 @@
     <w:p>
       <w:pPr/>
       <w:r>
-        <w:t xml:space="preserve">Os 94% de acurácia vêm de 48 mil registros de 2023, de dois hospitais da mesma região. Em campo, no primeiro semestre de 2026, com 1,94 milhão de registros, a acurácia foi de 87,6%. O número que importa para priorização piorou mais: o falso negativo, paciente que deveria ser priorizado e foi classificado como baixa prioridade, foi de 7,4% para 17,7%, quase 2,4 vezes </w:t>
+        <w:t xml:space="preserve">Os 94% de acurácia vêm de uma amostra de 2023 com dois hospitais da mesma região. Em campo, o número que importa para priorização, o paciente que precisava de prioridade e não recebeu, mais que dobrou </w:t>
       </w:r>
       <w:r>
         <w:rPr>
@@ -1445,7 +983,7 @@
         <w:t>[fonte: Cap. 2, Quadro 9]</w:t>
       </w:r>
       <w:r>
-        <w:t>. Em IA clínica essa queda é comum. O modelo de sepse mais usado nos hospitais americanos teve, numa validação independente, desempenho bem abaixo do declarado pelo fornecedor².</w:t>
+        <w:t>.</w:t>
       </w:r>
     </w:p>
     <w:p>
@@ -1493,88 +1031,19 @@
         <w:pStyle w:val="Legenda"/>
       </w:pPr>
       <w:r>
-        <w:t>Figura 1. Falso negativo em campo por subgrupo, 1º semestre de 2026. O grupo de 60 anos ou mais de CEP D/E tem três vezes o erro do melhor grupo. Fonte: Cap. 2, Quadros 9 e 10.</w:t>
+        <w:t>Figura 1. Pacientes que precisavam de prioridade e não receberam, por grupo, 1º semestre de 2026. Fonte: Cap. 2, Quadros 9 e 10.</w:t>
       </w:r>
     </w:p>
     <w:p>
       <w:pPr/>
       <w:r>
-        <w:t xml:space="preserve">O erro se concentra em quem já é mais vulnerável. Entre os pacientes com 60 anos ou mais de CEP D/E que precisavam de prioridade, 31,8% ficaram para trás. No grupo de 18 a 59 anos de CEP A/B, foram 10,6%. A sensibilidade do pior grupo é 68,2% </w:t>
+        <w:t xml:space="preserve">O erro se concentra em quem já é mais vulnerável: o modelo deixa de priorizar idosos de CEP D/E três vezes mais que adultos de CEP A/B. Foi o Hospital Vila Ipê que mediu isso, e não a Lumis. Só 2% das decisões passam por revisão humana, e as reclamações dos pacientes de CEP D/E, que são a maioria, nunca foram cruzadas com o desempenho do modelo </w:t>
       </w:r>
       <w:r>
         <w:rPr>
           <w:rStyle w:val="TagFonte"/>
         </w:rPr>
-        <w:t>[fonte: Cap. 2, Quadro 10]</w:t>
-      </w:r>
-      <w:r>
-        <w:t>.</w:t>
-      </w:r>
-    </w:p>
-    <w:p>
-      <w:pPr>
-        <w:pStyle w:val="Commarcadores"/>
-      </w:pPr>
-      <w:r>
-        <w:rPr>
-          <w:b/>
-        </w:rPr>
-        <w:t>Quem descobriu.</w:t>
-      </w:r>
-      <w:r>
-        <w:t xml:space="preserve"> O 31,8% foi apurado pelo Hospital Vila Ipê, por conta própria, e enviado junto com a notificação formal </w:t>
-      </w:r>
-      <w:r>
-        <w:rPr>
-          <w:rStyle w:val="TagFonte"/>
-        </w:rPr>
-        <w:t>[fonte: Cap. 2, Quadro 10]</w:t>
-      </w:r>
-      <w:r>
-        <w:t>.</w:t>
-      </w:r>
-    </w:p>
-    <w:p>
-      <w:pPr>
-        <w:pStyle w:val="Commarcadores"/>
-      </w:pPr>
-      <w:r>
-        <w:rPr>
-          <w:b/>
-        </w:rPr>
-        <w:t>Quanto passa por revisão humana.</w:t>
-      </w:r>
-      <w:r>
-        <w:t xml:space="preserve"> Das 640 mil decisões de priorização por mês, 2% são revisadas por amostragem, cerca de 12.800 </w:t>
-      </w:r>
-      <w:r>
-        <w:rPr>
-          <w:rStyle w:val="TagFonte"/>
-        </w:rPr>
-        <w:t>[fonte: Cap. 2, Quadro 12]</w:t>
-      </w:r>
-      <w:r>
-        <w:t>.</w:t>
-      </w:r>
-    </w:p>
-    <w:p>
-      <w:pPr>
-        <w:pStyle w:val="Commarcadores"/>
-      </w:pPr>
-      <w:r>
-        <w:rPr>
-          <w:b/>
-        </w:rPr>
-        <w:t>O que as reclamações já diziam.</w:t>
-      </w:r>
-      <w:r>
-        <w:t xml:space="preserve"> Pacientes de CEP D/E são 25% da base e respondem por 47 das 74 reclamações formais do último ano, 64%. Esse registro nunca foi cruzado com o desempenho do modelo </w:t>
-      </w:r>
-      <w:r>
-        <w:rPr>
-          <w:rStyle w:val="TagFonte"/>
-        </w:rPr>
-        <w:t>[fonte: Cap. 2, Quadro 17]</w:t>
+        <w:t>[fonte: Cap. 2, Quadros 10, 12 e 17]</w:t>
       </w:r>
       <w:r>
         <w:t>.</w:t>
@@ -1591,25 +1060,7 @@
     <w:p>
       <w:pPr/>
       <w:r>
-        <w:t xml:space="preserve">O Vetor Capital avisou que "qualquer número que não sobreviva a uma auditoria independente será tratado como passivo, não como diferencial" </w:t>
-      </w:r>
-      <w:r>
-        <w:rPr>
-          <w:rStyle w:val="TagFonte"/>
-        </w:rPr>
-        <w:t>[fonte: Cap. 2, memorando]</w:t>
-      </w:r>
-      <w:r>
-        <w:t xml:space="preserve">. Na maior parte dos casos, o problema está na forma de divulgar. Como diz o próprio caso sobre os 94%, "o número nunca foi mentira. Ele apenas nunca foi o que o comercial acreditava que era" </w:t>
-      </w:r>
-      <w:r>
-        <w:rPr>
-          <w:rStyle w:val="TagFonte"/>
-        </w:rPr>
-        <w:t>[fonte: Cap. 2, 1.2]</w:t>
-      </w:r>
-      <w:r>
-        <w:t>.</w:t>
+        <w:t>O Vetor Capital avisou que número que não sobrevive a uma auditoria independente vira passivo. Na maior parte dos casos, o número está certo e a forma de divulgar é que não se sustenta.</w:t>
       </w:r>
     </w:p>
     <w:tbl>
@@ -1626,10 +1077,9 @@
         <w:tblLayout w:type="fixed"/>
       </w:tblPr>
       <w:tblGrid>
-        <w:gridCol w:w="1927"/>
-        <w:gridCol w:w="2551"/>
         <w:gridCol w:w="2494"/>
-        <w:gridCol w:w="2097"/>
+        <w:gridCol w:w="3628"/>
+        <w:gridCol w:w="2948"/>
       </w:tblGrid>
       <w:tr>
         <w:trPr>
@@ -1638,7 +1088,7 @@
         </w:trPr>
         <w:tc>
           <w:tcPr>
-            <w:tcW w:type="dxa" w:w="1928"/>
+            <w:tcW w:type="dxa" w:w="2494"/>
             <w:shd w:val="clear" w:color="auto" w:fill="0F2D3A"/>
           </w:tcPr>
           <w:p>
@@ -1657,7 +1107,7 @@
         </w:tc>
         <w:tc>
           <w:tcPr>
-            <w:tcW w:type="dxa" w:w="2551"/>
+            <w:tcW w:type="dxa" w:w="3628"/>
             <w:shd w:val="clear" w:color="auto" w:fill="0F2D3A"/>
           </w:tcPr>
           <w:p>
@@ -1670,32 +1120,13 @@
                 <w:b/>
                 <w:color w:val="FFFFFF"/>
               </w:rPr>
-              <w:t>O que autoriza dizer</w:t>
-            </w:r>
-          </w:p>
-        </w:tc>
-        <w:tc>
-          <w:tcPr>
-            <w:tcW w:type="dxa" w:w="2494"/>
-            <w:shd w:val="clear" w:color="auto" w:fill="0F2D3A"/>
-          </w:tcPr>
-          <w:p>
-            <w:pPr>
-              <w:pStyle w:val="LumisTabela"/>
-              <w:keepNext/>
-            </w:pPr>
-            <w:r>
-              <w:rPr>
-                <w:b/>
-                <w:color w:val="FFFFFF"/>
-              </w:rPr>
-              <w:t>O que não autoriza</w:t>
-            </w:r>
-          </w:p>
-        </w:tc>
-        <w:tc>
-          <w:tcPr>
-            <w:tcW w:type="dxa" w:w="2098"/>
+              <w:t>O que de fato mostra</w:t>
+            </w:r>
+          </w:p>
+        </w:tc>
+        <w:tc>
+          <w:tcPr>
+            <w:tcW w:type="dxa" w:w="2948"/>
             <w:shd w:val="clear" w:color="auto" w:fill="0F2D3A"/>
           </w:tcPr>
           <w:p>
@@ -1719,7 +1150,7 @@
         </w:trPr>
         <w:tc>
           <w:tcPr>
-            <w:tcW w:type="dxa" w:w="1928"/>
+            <w:tcW w:type="dxa" w:w="2494"/>
           </w:tcPr>
           <w:p>
             <w:pPr>
@@ -1732,40 +1163,27 @@
         </w:tc>
         <w:tc>
           <w:tcPr>
-            <w:tcW w:type="dxa" w:w="2551"/>
-          </w:tcPr>
-          <w:p>
-            <w:pPr>
-              <w:pStyle w:val="LumisTabela"/>
-            </w:pPr>
-            <w:r>
-              <w:t>Que o modelo acertou 94,1% numa amostra de 2023 de dois hospitais</w:t>
-            </w:r>
-          </w:p>
-        </w:tc>
-        <w:tc>
-          <w:tcPr>
-            <w:tcW w:type="dxa" w:w="2494"/>
-          </w:tcPr>
-          <w:p>
-            <w:pPr>
-              <w:pStyle w:val="LumisTabela"/>
-            </w:pPr>
-            <w:r>
-              <w:t>Que acerta 94% hoje, em qualquer cliente ou grupo</w:t>
-            </w:r>
-          </w:p>
-        </w:tc>
-        <w:tc>
-          <w:tcPr>
-            <w:tcW w:type="dxa" w:w="2098"/>
-          </w:tcPr>
-          <w:p>
-            <w:pPr>
-              <w:pStyle w:val="LumisTabela"/>
-            </w:pPr>
-            <w:r>
-              <w:t>Aposentar. Entra o falso negativo por subgrupo (indicador 1)</w:t>
+            <w:tcW w:type="dxa" w:w="3628"/>
+          </w:tcPr>
+          <w:p>
+            <w:pPr>
+              <w:pStyle w:val="LumisTabela"/>
+            </w:pPr>
+            <w:r>
+              <w:t>Uma amostra de 2023 de dois hospitais, sem os grupos</w:t>
+            </w:r>
+          </w:p>
+        </w:tc>
+        <w:tc>
+          <w:tcPr>
+            <w:tcW w:type="dxa" w:w="2948"/>
+          </w:tcPr>
+          <w:p>
+            <w:pPr>
+              <w:pStyle w:val="LumisTabela"/>
+            </w:pPr>
+            <w:r>
+              <w:t>Trocar pelo erro em campo por grupo (indicador 1)</w:t>
             </w:r>
           </w:p>
         </w:tc>
@@ -1776,34 +1194,6 @@
         </w:trPr>
         <w:tc>
           <w:tcPr>
-            <w:tcW w:type="dxa" w:w="1928"/>
-            <w:shd w:val="clear" w:color="auto" w:fill="F1F6F4"/>
-          </w:tcPr>
-          <w:p>
-            <w:pPr>
-              <w:pStyle w:val="LumisTabela"/>
-            </w:pPr>
-            <w:r>
-              <w:t>"Redução de 30% no tempo de triagem"</w:t>
-            </w:r>
-          </w:p>
-        </w:tc>
-        <w:tc>
-          <w:tcPr>
-            <w:tcW w:type="dxa" w:w="2551"/>
-            <w:shd w:val="clear" w:color="auto" w:fill="F1F6F4"/>
-          </w:tcPr>
-          <w:p>
-            <w:pPr>
-              <w:pStyle w:val="LumisTabela"/>
-            </w:pPr>
-            <w:r>
-              <w:t>Que o tempo caiu 30,4% num piloto de seis semanas, sem grupo de controle</w:t>
-            </w:r>
-          </w:p>
-        </w:tc>
-        <w:tc>
-          <w:tcPr>
             <w:tcW w:type="dxa" w:w="2494"/>
             <w:shd w:val="clear" w:color="auto" w:fill="F1F6F4"/>
           </w:tcPr>
@@ -1812,13 +1202,27 @@
               <w:pStyle w:val="LumisTabela"/>
             </w:pPr>
             <w:r>
-              <w:t>Atribuir a queda ao produto ou estender a outros hospitais</w:t>
-            </w:r>
-          </w:p>
-        </w:tc>
-        <w:tc>
-          <w:tcPr>
-            <w:tcW w:type="dxa" w:w="2098"/>
+              <w:t>"Redução de 30% no tempo de triagem"</w:t>
+            </w:r>
+          </w:p>
+        </w:tc>
+        <w:tc>
+          <w:tcPr>
+            <w:tcW w:type="dxa" w:w="3628"/>
+            <w:shd w:val="clear" w:color="auto" w:fill="F1F6F4"/>
+          </w:tcPr>
+          <w:p>
+            <w:pPr>
+              <w:pStyle w:val="LumisTabela"/>
+            </w:pPr>
+            <w:r>
+              <w:t>Um piloto de seis semanas, sem grupo de comparação</w:t>
+            </w:r>
+          </w:p>
+        </w:tc>
+        <w:tc>
+          <w:tcPr>
+            <w:tcW w:type="dxa" w:w="2948"/>
             <w:shd w:val="clear" w:color="auto" w:fill="F1F6F4"/>
           </w:tcPr>
           <w:p>
@@ -1837,7 +1241,7 @@
         </w:trPr>
         <w:tc>
           <w:tcPr>
-            <w:tcW w:type="dxa" w:w="1928"/>
+            <w:tcW w:type="dxa" w:w="2494"/>
           </w:tcPr>
           <w:p>
             <w:pPr>
@@ -1850,33 +1254,20 @@
         </w:tc>
         <w:tc>
           <w:tcPr>
-            <w:tcW w:type="dxa" w:w="2551"/>
-          </w:tcPr>
-          <w:p>
-            <w:pPr>
-              <w:pStyle w:val="LumisTabela"/>
-            </w:pPr>
-            <w:r>
-              <w:t>Que houve 5,2 milhões de processamentos</w:t>
-            </w:r>
-          </w:p>
-        </w:tc>
-        <w:tc>
-          <w:tcPr>
-            <w:tcW w:type="dxa" w:w="2494"/>
-          </w:tcPr>
-          <w:p>
-            <w:pPr>
-              <w:pStyle w:val="LumisTabela"/>
-            </w:pPr>
-            <w:r>
-              <w:t>Falar em vidas ou pessoas: há reprocessamento do mesmo paciente</w:t>
-            </w:r>
-          </w:p>
-        </w:tc>
-        <w:tc>
-          <w:tcPr>
-            <w:tcW w:type="dxa" w:w="2098"/>
+            <w:tcW w:type="dxa" w:w="3628"/>
+          </w:tcPr>
+          <w:p>
+            <w:pPr>
+              <w:pStyle w:val="LumisTabela"/>
+            </w:pPr>
+            <w:r>
+              <w:t>Processamentos, com o mesmo paciente contado mais de uma vez</w:t>
+            </w:r>
+          </w:p>
+        </w:tc>
+        <w:tc>
+          <w:tcPr>
+            <w:tcW w:type="dxa" w:w="2948"/>
           </w:tcPr>
           <w:p>
             <w:pPr>
@@ -1894,34 +1285,6 @@
         </w:trPr>
         <w:tc>
           <w:tcPr>
-            <w:tcW w:type="dxa" w:w="1928"/>
-            <w:shd w:val="clear" w:color="auto" w:fill="F1F6F4"/>
-          </w:tcPr>
-          <w:p>
-            <w:pPr>
-              <w:pStyle w:val="LumisTabela"/>
-            </w:pPr>
-            <w:r>
-              <w:t>"NPS 72"</w:t>
-            </w:r>
-          </w:p>
-        </w:tc>
-        <w:tc>
-          <w:tcPr>
-            <w:tcW w:type="dxa" w:w="2551"/>
-            <w:shd w:val="clear" w:color="auto" w:fill="F1F6F4"/>
-          </w:tcPr>
-          <w:p>
-            <w:pPr>
-              <w:pStyle w:val="LumisTabela"/>
-            </w:pPr>
-            <w:r>
-              <w:t>Que 9 clientes indicados pelo comercial aprovam o produto</w:t>
-            </w:r>
-          </w:p>
-        </w:tc>
-        <w:tc>
-          <w:tcPr>
             <w:tcW w:type="dxa" w:w="2494"/>
             <w:shd w:val="clear" w:color="auto" w:fill="F1F6F4"/>
           </w:tcPr>
@@ -1930,13 +1293,13 @@
               <w:pStyle w:val="LumisTabela"/>
             </w:pPr>
             <w:r>
-              <w:t>Falar em satisfação da carteira de 38 contas</w:t>
-            </w:r>
-          </w:p>
-        </w:tc>
-        <w:tc>
-          <w:tcPr>
-            <w:tcW w:type="dxa" w:w="2098"/>
+              <w:t>"NPS 72"</w:t>
+            </w:r>
+          </w:p>
+        </w:tc>
+        <w:tc>
+          <w:tcPr>
+            <w:tcW w:type="dxa" w:w="3628"/>
             <w:shd w:val="clear" w:color="auto" w:fill="F1F6F4"/>
           </w:tcPr>
           <w:p>
@@ -1944,7 +1307,21 @@
               <w:pStyle w:val="LumisTabela"/>
             </w:pPr>
             <w:r>
-              <w:t>Aposentar. Entram as reclamações por subgrupo (indicador 3)</w:t>
+              <w:t>9 clientes indicados pelo comercial</w:t>
+            </w:r>
+          </w:p>
+        </w:tc>
+        <w:tc>
+          <w:tcPr>
+            <w:tcW w:type="dxa" w:w="2948"/>
+            <w:shd w:val="clear" w:color="auto" w:fill="F1F6F4"/>
+          </w:tcPr>
+          <w:p>
+            <w:pPr>
+              <w:pStyle w:val="LumisTabela"/>
+            </w:pPr>
+            <w:r>
+              <w:t>Trocar pelas reclamações por grupo (indicador 3)</w:t>
             </w:r>
           </w:p>
         </w:tc>
@@ -1955,7 +1332,7 @@
         </w:trPr>
         <w:tc>
           <w:tcPr>
-            <w:tcW w:type="dxa" w:w="1928"/>
+            <w:tcW w:type="dxa" w:w="2494"/>
           </w:tcPr>
           <w:p>
             <w:pPr>
@@ -1969,7 +1346,7 @@
         </w:tc>
         <w:tc>
           <w:tcPr>
-            <w:tcW w:type="dxa" w:w="2551"/>
+            <w:tcW w:type="dxa" w:w="3628"/>
           </w:tcPr>
           <w:p>
             <w:pPr>
@@ -1977,13 +1354,13 @@
               <w:keepNext/>
             </w:pPr>
             <w:r>
-              <w:t>Que a interface de programação ficou no ar 99,92% do tempo</w:t>
-            </w:r>
-          </w:p>
-        </w:tc>
-        <w:tc>
-          <w:tcPr>
-            <w:tcW w:type="dxa" w:w="2494"/>
+              <w:t>Só a interface técnica, sem o serviço completo</w:t>
+            </w:r>
+          </w:p>
+        </w:tc>
+        <w:tc>
+          <w:tcPr>
+            <w:tcW w:type="dxa" w:w="2948"/>
           </w:tcPr>
           <w:p>
             <w:pPr>
@@ -1991,21 +1368,7 @@
               <w:keepNext/>
             </w:pPr>
             <w:r>
-              <w:t>Que o hospital recebeu a priorização correta a tempo</w:t>
-            </w:r>
-          </w:p>
-        </w:tc>
-        <w:tc>
-          <w:tcPr>
-            <w:tcW w:type="dxa" w:w="2098"/>
-          </w:tcPr>
-          <w:p>
-            <w:pPr>
-              <w:pStyle w:val="LumisTabela"/>
-              <w:keepNext/>
-            </w:pPr>
-            <w:r>
-              <w:t>Sai do material comercial; segue como meta técnica</w:t>
+              <w:t>Tirar do material comercial</w:t>
             </w:r>
           </w:p>
         </w:tc>
@@ -2016,13 +1379,13 @@
         <w:pStyle w:val="Legenda"/>
       </w:pPr>
       <w:r>
-        <w:t>Tabela 3. As cinco afirmações do painel comercial. As quatro perguntas aplicadas a cada uma estão no Anexo. Fonte: Cap. 2, Quadros 9 e 11.</w:t>
+        <w:t>Tabela 3. As cinco afirmações do painel comercial. As quatro perguntas aplicadas a cada uma estão no Anexo. Fonte: Cap. 2, Quadro 11.</w:t>
       </w:r>
     </w:p>
     <w:p>
       <w:pPr/>
       <w:r>
-        <w:t xml:space="preserve">Os "5 milhões de vidas" são o caso mais grave. A auditoria interna achou a duplicidade em 01/2026, ela foi corrigida no sistema e o número continua no material comercial </w:t>
+        <w:t xml:space="preserve">Os "5 milhões de vidas" são o caso mais grave: a duplicidade foi achada em janeiro, corrigida no sistema e continua no material comercial </w:t>
       </w:r>
       <w:r>
         <w:rPr>
@@ -2031,7 +1394,7 @@
         <w:t>[fonte: Cap. 2, Quadro 14]</w:t>
       </w:r>
       <w:r>
-        <w:t>. Manter qualquer uma das cinco afirmações como está contradiz o nosso compromisso de Transparência, que manda informar as limitações do sistema (C1).</w:t>
+        <w:t>. Manter as cinco afirmações como estão contradiz nosso compromisso de Transparência (C1).</w:t>
       </w:r>
     </w:p>
     <w:p>
@@ -2045,22 +1408,7 @@
     <w:p>
       <w:pPr/>
       <w:r>
-        <w:t xml:space="preserve">No lugar dos números de vitrine, propomos cinco indicadores de gestão. Cada um muda uma decisão, tem um limite que dispara essa decisão e termina num cargo. Os cargos vêm do Quadro 13 e são provisórios até a Entrega 3, que define quem responde por cada decisão. Os limites são propostas da equipe </w:t>
-      </w:r>
-      <w:r>
-        <w:rPr>
-          <w:rStyle w:val="TagHiptese"/>
-        </w:rPr>
-        <w:t>[hipótese]</w:t>
-      </w:r>
-      <w:r>
-        <w:t>. Nenhuma fonte fixa valores para este caso.</w:t>
-      </w:r>
-    </w:p>
-    <w:p>
-      <w:pPr/>
-      <w:r>
-        <w:t>Para medir equidade, escolhemos uma regra: a mesma taxa de erro grave em todos os grupos. Em priorização, o erro grave é deixar de priorizar quem precisava. A regra tem custo: baixar o falso negativo de um grupo tende a priorizar mais pacientes nesse grupo, o que aumenta a carga do hospital. O indicador 1 acompanha esse custo junto.</w:t>
+        <w:t>No lugar dos números de vitrine, propomos cinco indicadores. Cada um tem um ponto de ação, uma decisão que ele dispara e um responsável. Os pontos de ação são proposta da equipe, e os cargos são provisórios até a Entrega 3.</w:t>
       </w:r>
     </w:p>
     <w:tbl>
@@ -2077,10 +1425,9 @@
         <w:tblLayout w:type="fixed"/>
       </w:tblPr>
       <w:tblGrid>
-        <w:gridCol w:w="1871"/>
-        <w:gridCol w:w="1530"/>
-        <w:gridCol w:w="1701"/>
-        <w:gridCol w:w="2154"/>
+        <w:gridCol w:w="2381"/>
+        <w:gridCol w:w="2268"/>
+        <w:gridCol w:w="2608"/>
         <w:gridCol w:w="1814"/>
       </w:tblGrid>
       <w:tr>
@@ -2090,7 +1437,7 @@
         </w:trPr>
         <w:tc>
           <w:tcPr>
-            <w:tcW w:type="dxa" w:w="1871"/>
+            <w:tcW w:type="dxa" w:w="2381"/>
             <w:shd w:val="clear" w:color="auto" w:fill="0F2D3A"/>
           </w:tcPr>
           <w:p>
@@ -2109,7 +1456,7 @@
         </w:tc>
         <w:tc>
           <w:tcPr>
-            <w:tcW w:type="dxa" w:w="1531"/>
+            <w:tcW w:type="dxa" w:w="2268"/>
             <w:shd w:val="clear" w:color="auto" w:fill="0F2D3A"/>
           </w:tcPr>
           <w:p>
@@ -2122,13 +1469,13 @@
                 <w:b/>
                 <w:color w:val="FFFFFF"/>
               </w:rPr>
-              <w:t>Hoje</w:t>
-            </w:r>
-          </w:p>
-        </w:tc>
-        <w:tc>
-          <w:tcPr>
-            <w:tcW w:type="dxa" w:w="1701"/>
+              <w:t>Quando age [hipótese]</w:t>
+            </w:r>
+          </w:p>
+        </w:tc>
+        <w:tc>
+          <w:tcPr>
+            <w:tcW w:type="dxa" w:w="2608"/>
             <w:shd w:val="clear" w:color="auto" w:fill="0F2D3A"/>
           </w:tcPr>
           <w:p>
@@ -2141,13 +1488,13 @@
                 <w:b/>
                 <w:color w:val="FFFFFF"/>
               </w:rPr>
-              <w:t>Decisão que muda</w:t>
-            </w:r>
-          </w:p>
-        </w:tc>
-        <w:tc>
-          <w:tcPr>
-            <w:tcW w:type="dxa" w:w="2154"/>
+              <w:t>O que decide</w:t>
+            </w:r>
+          </w:p>
+        </w:tc>
+        <w:tc>
+          <w:tcPr>
+            <w:tcW w:type="dxa" w:w="1814"/>
             <w:shd w:val="clear" w:color="auto" w:fill="0F2D3A"/>
           </w:tcPr>
           <w:p>
@@ -2160,26 +1507,7 @@
                 <w:b/>
                 <w:color w:val="FFFFFF"/>
               </w:rPr>
-              <w:t>Limite [hipótese]</w:t>
-            </w:r>
-          </w:p>
-        </w:tc>
-        <w:tc>
-          <w:tcPr>
-            <w:tcW w:type="dxa" w:w="1814"/>
-            <w:shd w:val="clear" w:color="auto" w:fill="0F2D3A"/>
-          </w:tcPr>
-          <w:p>
-            <w:pPr>
-              <w:pStyle w:val="LumisTabela"/>
-              <w:keepNext/>
-            </w:pPr>
-            <w:r>
-              <w:rPr>
-                <w:b/>
-                <w:color w:val="FFFFFF"/>
-              </w:rPr>
-              <w:t>Quem apura e quem decide</w:t>
+              <w:t>Quem responde</w:t>
             </w:r>
           </w:p>
         </w:tc>
@@ -2190,7 +1518,7 @@
         </w:trPr>
         <w:tc>
           <w:tcPr>
-            <w:tcW w:type="dxa" w:w="1871"/>
+            <w:tcW w:type="dxa" w:w="2381"/>
           </w:tcPr>
           <w:p>
             <w:pPr>
@@ -2200,49 +1528,36 @@
               <w:rPr>
                 <w:b/>
               </w:rPr>
-              <w:t>1. Falso negativo em campo por subgrupo</w:t>
-            </w:r>
-            <w:r>
-              <w:t xml:space="preserve"> (idade e CEP, também por cliente)</w:t>
-            </w:r>
-          </w:p>
-        </w:tc>
-        <w:tc>
-          <w:tcPr>
-            <w:tcW w:type="dxa" w:w="1531"/>
-          </w:tcPr>
-          <w:p>
-            <w:pPr>
-              <w:pStyle w:val="LumisTabela"/>
-            </w:pPr>
-            <w:r>
-              <w:t>Pior grupo 31,8%, melhor 10,6%: 3,0 vezes</w:t>
-            </w:r>
-          </w:p>
-        </w:tc>
-        <w:tc>
-          <w:tcPr>
-            <w:tcW w:type="dxa" w:w="1701"/>
-          </w:tcPr>
-          <w:p>
-            <w:pPr>
-              <w:pStyle w:val="LumisTabela"/>
-            </w:pPr>
-            <w:r>
-              <w:t>Restringir a recomendação automática num grupo; liberar ou barrar nova versão</w:t>
-            </w:r>
-          </w:p>
-        </w:tc>
-        <w:tc>
-          <w:tcPr>
-            <w:tcW w:type="dxa" w:w="2154"/>
-          </w:tcPr>
-          <w:p>
-            <w:pPr>
-              <w:pStyle w:val="LumisTabela"/>
-            </w:pPr>
-            <w:r>
-              <w:t>A partir de 1,5 vez o melhor grupo, a revisão humana sobe para 10%. A partir de 2 vezes, a recomendação automática é suspensa no grupo. Versão que piora algum grupo em mais de 1 ponto não sobe</w:t>
+              <w:t>1. Erro em campo por grupo</w:t>
+            </w:r>
+            <w:r>
+              <w:t xml:space="preserve"> (idade, CEP e cliente)</w:t>
+            </w:r>
+          </w:p>
+        </w:tc>
+        <w:tc>
+          <w:tcPr>
+            <w:tcW w:type="dxa" w:w="2268"/>
+          </w:tcPr>
+          <w:p>
+            <w:pPr>
+              <w:pStyle w:val="LumisTabela"/>
+            </w:pPr>
+            <w:r>
+              <w:t>Grupo com o dobro do erro do melhor grupo</w:t>
+            </w:r>
+          </w:p>
+        </w:tc>
+        <w:tc>
+          <w:tcPr>
+            <w:tcW w:type="dxa" w:w="2608"/>
+          </w:tcPr>
+          <w:p>
+            <w:pPr>
+              <w:pStyle w:val="LumisTabela"/>
+            </w:pPr>
+            <w:r>
+              <w:t>Suspender a recomendação automática no grupo; barrar versão que piore algum grupo</w:t>
             </w:r>
           </w:p>
         </w:tc>
@@ -2255,7 +1570,7 @@
               <w:pStyle w:val="LumisTabela"/>
             </w:pPr>
             <w:r>
-              <w:t>Yuri Nakamura (Dados) apura. Head of AI Management confere. CEO decide a suspensão. CTO libera versão dentro da regra</w:t>
+              <w:t>Yuri Nakamura mede; a CEO decide</w:t>
             </w:r>
           </w:p>
         </w:tc>
@@ -2266,7 +1581,7 @@
         </w:trPr>
         <w:tc>
           <w:tcPr>
-            <w:tcW w:type="dxa" w:w="1871"/>
+            <w:tcW w:type="dxa" w:w="2381"/>
             <w:shd w:val="clear" w:color="auto" w:fill="F1F6F4"/>
           </w:tcPr>
           <w:p>
@@ -2277,16 +1592,16 @@
               <w:rPr>
                 <w:b/>
               </w:rPr>
-              <w:t>2. Direito de uso da base de treino</w:t>
-            </w:r>
-            <w:r>
-              <w:t xml:space="preserve"> (por fonte e contrato)</w:t>
-            </w:r>
-          </w:p>
-        </w:tc>
-        <w:tc>
-          <w:tcPr>
-            <w:tcW w:type="dxa" w:w="1531"/>
+              <w:t>2. Direito de uso dos dados</w:t>
+            </w:r>
+            <w:r>
+              <w:t xml:space="preserve"> (por contrato)</w:t>
+            </w:r>
+          </w:p>
+        </w:tc>
+        <w:tc>
+          <w:tcPr>
+            <w:tcW w:type="dxa" w:w="2268"/>
             <w:shd w:val="clear" w:color="auto" w:fill="F1F6F4"/>
           </w:tcPr>
           <w:p>
@@ -2294,13 +1609,13 @@
               <w:pStyle w:val="LumisTabela"/>
             </w:pPr>
             <w:r>
-              <w:t>Com autorização expressa e parecer jurídico: 0%. Só com autorização expressa: 64,6%</w:t>
-            </w:r>
-          </w:p>
-        </w:tc>
-        <w:tc>
-          <w:tcPr>
-            <w:tcW w:type="dxa" w:w="1701"/>
+              <w:t>Dado sem autorização e parecer jurídico; contrato a seis meses do fim</w:t>
+            </w:r>
+          </w:p>
+        </w:tc>
+        <w:tc>
+          <w:tcPr>
+            <w:tcW w:type="dxa" w:w="2608"/>
             <w:shd w:val="clear" w:color="auto" w:fill="F1F6F4"/>
           </w:tcPr>
           <w:p>
@@ -2308,21 +1623,7 @@
               <w:pStyle w:val="LumisTabela"/>
             </w:pPr>
             <w:r>
-              <w:t>O que entra no próximo treino; a ordem de renegociação</w:t>
-            </w:r>
-          </w:p>
-        </w:tc>
-        <w:tc>
-          <w:tcPr>
-            <w:tcW w:type="dxa" w:w="2154"/>
-            <w:shd w:val="clear" w:color="auto" w:fill="F1F6F4"/>
-          </w:tcPr>
-          <w:p>
-            <w:pPr>
-              <w:pStyle w:val="LumisTabela"/>
-            </w:pPr>
-            <w:r>
-              <w:t>Nada sem autorização expressa e parecer entra no treino. Contrato a seis meses do vencimento sem cláusula nova dispara plano de retirada</w:t>
+              <w:t>O que entra no próximo treino; ordem de renegociação</w:t>
             </w:r>
           </w:p>
         </w:tc>
@@ -2336,7 +1637,7 @@
               <w:pStyle w:val="LumisTabela"/>
             </w:pPr>
             <w:r>
-              <w:t>Yuri Nakamura mantém o inventário. Ana Beatriz Rangel (DPO) dá o parecer. CEO decide renegociar ou retirar</w:t>
+              <w:t>Ana Beatriz Rangel (DPO)</w:t>
             </w:r>
           </w:p>
         </w:tc>
@@ -2347,7 +1648,7 @@
         </w:trPr>
         <w:tc>
           <w:tcPr>
-            <w:tcW w:type="dxa" w:w="1871"/>
+            <w:tcW w:type="dxa" w:w="2381"/>
           </w:tcPr>
           <w:p>
             <w:pPr>
@@ -2357,49 +1658,33 @@
               <w:rPr>
                 <w:b/>
               </w:rPr>
-              <w:t>3. Reclamações por faixa de CEP, cruzadas com o falso negativo</w:t>
-            </w:r>
-            <w:r>
-              <w:t xml:space="preserve"> (CEP e idade)</w:t>
-            </w:r>
-          </w:p>
-        </w:tc>
-        <w:tc>
-          <w:tcPr>
-            <w:tcW w:type="dxa" w:w="1531"/>
-          </w:tcPr>
-          <w:p>
-            <w:pPr>
-              <w:pStyle w:val="LumisTabela"/>
-            </w:pPr>
-            <w:r>
-              <w:t>D/E: 64% das reclamações com 25% da base, índice 2,54</w:t>
-            </w:r>
-          </w:p>
-        </w:tc>
-        <w:tc>
-          <w:tcPr>
-            <w:tcW w:type="dxa" w:w="1701"/>
-          </w:tcPr>
-          <w:p>
-            <w:pPr>
-              <w:pStyle w:val="LumisTabela"/>
-            </w:pPr>
-            <w:r>
-              <w:t>Abrir revisão clínica dos casos e levar o grupo ao indicador 1</w:t>
-            </w:r>
-          </w:p>
-        </w:tc>
-        <w:tc>
-          <w:tcPr>
-            <w:tcW w:type="dxa" w:w="2154"/>
-          </w:tcPr>
-          <w:p>
-            <w:pPr>
-              <w:pStyle w:val="LumisTabela"/>
-            </w:pPr>
-            <w:r>
-              <w:t>Índice a partir de 1,5 numa janela de 90 dias</w:t>
+              <w:t>3. Reclamações por faixa de CEP</w:t>
+            </w:r>
+          </w:p>
+        </w:tc>
+        <w:tc>
+          <w:tcPr>
+            <w:tcW w:type="dxa" w:w="2268"/>
+          </w:tcPr>
+          <w:p>
+            <w:pPr>
+              <w:pStyle w:val="LumisTabela"/>
+            </w:pPr>
+            <w:r>
+              <w:t>Grupo com uma vez e meia mais reclamações do que o seu peso na base</w:t>
+            </w:r>
+          </w:p>
+        </w:tc>
+        <w:tc>
+          <w:tcPr>
+            <w:tcW w:type="dxa" w:w="2608"/>
+          </w:tcPr>
+          <w:p>
+            <w:pPr>
+              <w:pStyle w:val="LumisTabela"/>
+            </w:pPr>
+            <w:r>
+              <w:t>Revisão clínica dos casos e análise do grupo no indicador 1</w:t>
             </w:r>
           </w:p>
         </w:tc>
@@ -2412,16 +1697,7 @@
               <w:pStyle w:val="LumisTabela"/>
             </w:pPr>
             <w:r>
-              <w:t xml:space="preserve">Registro no time de sucesso do cliente, cargo </w:t>
-            </w:r>
-            <w:r>
-              <w:rPr>
-                <w:rStyle w:val="TagNoconsta"/>
-              </w:rPr>
-              <w:t>[não consta]</w:t>
-            </w:r>
-            <w:r>
-              <w:t>. Yuri Nakamura cruza. Head of AI Management decide a investigação</w:t>
+              <w:t>Head of AI Management</w:t>
             </w:r>
           </w:p>
         </w:tc>
@@ -2432,7 +1708,7 @@
         </w:trPr>
         <w:tc>
           <w:tcPr>
-            <w:tcW w:type="dxa" w:w="1871"/>
+            <w:tcW w:type="dxa" w:w="2381"/>
             <w:shd w:val="clear" w:color="auto" w:fill="F1F6F4"/>
           </w:tcPr>
           <w:p>
@@ -2443,16 +1719,13 @@
               <w:rPr>
                 <w:b/>
               </w:rPr>
-              <w:t>4. Incidentes detectados pela Lumis antes do cliente</w:t>
-            </w:r>
-            <w:r>
-              <w:t xml:space="preserve"> (por tipo e grupo afetado)</w:t>
-            </w:r>
-          </w:p>
-        </w:tc>
-        <w:tc>
-          <w:tcPr>
-            <w:tcW w:type="dxa" w:w="1531"/>
+              <w:t>4. Incidentes descobertos antes do cliente</w:t>
+            </w:r>
+          </w:p>
+        </w:tc>
+        <w:tc>
+          <w:tcPr>
+            <w:tcW w:type="dxa" w:w="2268"/>
             <w:shd w:val="clear" w:color="auto" w:fill="F1F6F4"/>
           </w:tcPr>
           <w:p>
@@ -2460,13 +1733,13 @@
               <w:pStyle w:val="LumisTabela"/>
             </w:pPr>
             <w:r>
-              <w:t>2 de 4 detectados por cliente; 1 em tratamento; 1 sem correção no material</w:t>
-            </w:r>
-          </w:p>
-        </w:tc>
-        <w:tc>
-          <w:tcPr>
-            <w:tcW w:type="dxa" w:w="1701"/>
+              <w:t>Cliente descobre primeiro, ou incidente aberto há mais de 30 dias</w:t>
+            </w:r>
+          </w:p>
+        </w:tc>
+        <w:tc>
+          <w:tcPr>
+            <w:tcW w:type="dxa" w:w="2608"/>
             <w:shd w:val="clear" w:color="auto" w:fill="F1F6F4"/>
           </w:tcPr>
           <w:p>
@@ -2474,21 +1747,7 @@
               <w:pStyle w:val="LumisTabela"/>
             </w:pPr>
             <w:r>
-              <w:t>Rever o monitoramento e a regra de liberação. Incidente só fecha com o material público corrigido</w:t>
-            </w:r>
-          </w:p>
-        </w:tc>
-        <w:tc>
-          <w:tcPr>
-            <w:tcW w:type="dxa" w:w="2154"/>
-            <w:shd w:val="clear" w:color="auto" w:fill="F1F6F4"/>
-          </w:tcPr>
-          <w:p>
-            <w:pPr>
-              <w:pStyle w:val="LumisTabela"/>
-            </w:pPr>
-            <w:r>
-              <w:t>Incidente detectado pelo cliente, ou aberto há mais de 30 dias, vai ao conselho</w:t>
+              <w:t>Rever o monitoramento; levar o caso ao conselho</w:t>
             </w:r>
           </w:p>
         </w:tc>
@@ -2502,7 +1761,7 @@
               <w:pStyle w:val="LumisTabela"/>
             </w:pPr>
             <w:r>
-              <w:t>Head of AI Management registra. DPO confere. CEO recebe o relato</w:t>
+              <w:t>Head of AI Management</w:t>
             </w:r>
           </w:p>
         </w:tc>
@@ -2513,7 +1772,7 @@
         </w:trPr>
         <w:tc>
           <w:tcPr>
-            <w:tcW w:type="dxa" w:w="1871"/>
+            <w:tcW w:type="dxa" w:w="2381"/>
           </w:tcPr>
           <w:p>
             <w:pPr>
@@ -2526,14 +1785,11 @@
               </w:rPr>
               <w:t>5. Afirmações públicas auditáveis</w:t>
             </w:r>
-            <w:r>
-              <w:t xml:space="preserve"> (pior grupo sempre ao lado)</w:t>
-            </w:r>
-          </w:p>
-        </w:tc>
-        <w:tc>
-          <w:tcPr>
-            <w:tcW w:type="dxa" w:w="1531"/>
+          </w:p>
+        </w:tc>
+        <w:tc>
+          <w:tcPr>
+            <w:tcW w:type="dxa" w:w="2268"/>
           </w:tcPr>
           <w:p>
             <w:pPr>
@@ -2541,13 +1797,13 @@
               <w:keepNext/>
             </w:pPr>
             <w:r>
-              <w:t>0 de 5</w:t>
-            </w:r>
-          </w:p>
-        </w:tc>
-        <w:tc>
-          <w:tcPr>
-            <w:tcW w:type="dxa" w:w="1701"/>
+              <w:t>Afirmação que alguém de fora não consegue refazer</w:t>
+            </w:r>
+          </w:p>
+        </w:tc>
+        <w:tc>
+          <w:tcPr>
+            <w:tcW w:type="dxa" w:w="2608"/>
           </w:tcPr>
           <w:p>
             <w:pPr>
@@ -2555,13 +1811,13 @@
               <w:keepNext/>
             </w:pPr>
             <w:r>
-              <w:t>O que pode ir para o material comercial</w:t>
-            </w:r>
-          </w:p>
-        </w:tc>
-        <w:tc>
-          <w:tcPr>
-            <w:tcW w:type="dxa" w:w="2154"/>
+              <w:t>Retirar do material antes da próxima apresentação</w:t>
+            </w:r>
+          </w:p>
+        </w:tc>
+        <w:tc>
+          <w:tcPr>
+            <w:tcW w:type="dxa" w:w="1814"/>
           </w:tcPr>
           <w:p>
             <w:pPr>
@@ -2569,21 +1825,7 @@
               <w:keepNext/>
             </w:pPr>
             <w:r>
-              <w:t>Afirmação que alguém de fora não consegue refazer sai antes da próxima apresentação</w:t>
-            </w:r>
-          </w:p>
-        </w:tc>
-        <w:tc>
-          <w:tcPr>
-            <w:tcW w:type="dxa" w:w="1814"/>
-          </w:tcPr>
-          <w:p>
-            <w:pPr>
-              <w:pStyle w:val="LumisTabela"/>
-              <w:keepNext/>
-            </w:pPr>
-            <w:r>
-              <w:t>Camila Torres (Comercial) propõe. Head of AI Management aprova. Cliente ou auditor refaz o número</w:t>
+              <w:t>Camila Torres propõe; Head of AI aprova</w:t>
             </w:r>
           </w:p>
         </w:tc>
@@ -2594,61 +1836,13 @@
         <w:pStyle w:val="Legenda"/>
       </w:pPr>
       <w:r>
-        <w:t>Tabela 4. Os cinco indicadores de gestão. As quatro perguntas aplicadas a cada um e aos descartados estão no Anexo. Fonte: Cap. 2, Quadros 7, 10, 11, 13, 14 e 17; contas e limites da equipe.</w:t>
+        <w:t>Tabela 4. Os cinco indicadores. Valores de hoje, as quatro perguntas e os indicadores descartados estão no Anexo. Fonte: Cap. 2, Quadros 7, 10, 13, 14 e 17; propostas da equipe.</w:t>
       </w:r>
     </w:p>
     <w:p>
       <w:pPr/>
       <w:r>
-        <w:rPr>
-          <w:b/>
-        </w:rPr>
-        <w:t>Amostra suficiente.</w:t>
-      </w:r>
-      <w:r>
-        <w:t xml:space="preserve"> O nosso compromisso de Não Amplificação de Danos pede revisão quinzenal por grupo (C2). Com a revisão em 2%, o grupo de 60 anos ou mais de CEP D/E teria uns 64 casos por quinzena que de fato precisavam de prioridade, e a margem de erro ficaria perto de 11 pontos </w:t>
-      </w:r>
-      <w:r>
-        <w:rPr>
-          <w:rStyle w:val="TagHiptese"/>
-        </w:rPr>
-        <w:t>[hipótese: 10% dos casos precisam de prioridade]</w:t>
-      </w:r>
-      <w:r>
-        <w:t>. Por isso a revisão sobe para 10% nos grupos críticos, o que dá uns 320 casos por quinzena e margem perto de 5 pontos. Nos demais grupos, a leitura quinzenal usa os últimos 90 dias.</w:t>
-      </w:r>
-    </w:p>
-    <w:p>
-      <w:pPr/>
-      <w:r>
-        <w:rPr>
-          <w:b/>
-        </w:rPr>
-        <w:t>Quem confere.</w:t>
-      </w:r>
-      <w:r>
-        <w:t xml:space="preserve"> A Lumis mede o erro do próprio produto. Por isso cada indicador tem conferência de fora: o cliente que manda o desfecho recalcula o próprio grupo, como o Vila Ipê já fez, e um auditor contratado refaz o cálculo a cada trimestre </w:t>
-      </w:r>
-      <w:r>
-        <w:rPr>
-          <w:rStyle w:val="TagHiptese"/>
-        </w:rPr>
-        <w:t>[hipótese: a contratação é tema da Entrega 3]</w:t>
-      </w:r>
-      <w:r>
-        <w:t>. O NIST pede que todo sistema de IA tenha responsável e mecanismo definidos para ser desligado quando sai do uso pretendido⁵.</w:t>
-      </w:r>
-    </w:p>
-    <w:p>
-      <w:pPr/>
-      <w:r>
-        <w:rPr>
-          <w:b/>
-        </w:rPr>
-        <w:t>O que descartamos.</w:t>
-      </w:r>
-      <w:r>
-        <w:t xml:space="preserve"> A acurácia global esconde o falso negativo. A comparação com a versão aprovada passou a ser a regra de liberação do indicador 1. A disponibilidade de ponta a ponta é decisão técnica e não chega ao conselho. "Auditorias contratuais concluídas" mede atividade, e o indicador 2 mede registros. "Pacientes únicos analisados" é volume. A discordância do revisor humano virou a fonte de medição do indicador 1.</w:t>
+        <w:t>Como a Lumis mede o erro do próprio produto, cada indicador tem conferência de fora: o cliente refaz a conta do próprio grupo, como o Vila Ipê já fez, e um auditor confere a cada trimestre. Para a revisão quinzenal ter casos suficientes, a revisão humana sobe de 2% para 10% nos grupos críticos. O NIST pede que todo sistema de IA tenha responsável e meio definidos para ser desligado⁴.</w:t>
       </w:r>
     </w:p>
     <w:p>
@@ -2660,44 +1854,7 @@
         <w:t>A decisão de agora.</w:t>
       </w:r>
       <w:r>
-        <w:t xml:space="preserve"> Pelo limite do indicador 1, dois grupos já passam do ponto de suspensão: 60 anos ou mais de CEP D/E (3,0 vezes) e de CEP C (2,2 vezes). Mantemos o compromisso de Não Amplificação de Danos (C2), que manda suspender o uso até a correção quando há padrão de viés, e recomendamos restringir já a recomendação automática nesses dois grupos (D-023). O modelo segue rodando em paralelo, sem decidir, para medir a correção.</w:t>
-      </w:r>
-    </w:p>
-    <w:p>
-      <w:pPr>
-        <w:pStyle w:val="Commarcadores"/>
-      </w:pPr>
-      <w:r>
-        <w:rPr>
-          <w:b/>
-        </w:rPr>
-        <w:t>Custo.</w:t>
-      </w:r>
-      <w:r>
-        <w:t xml:space="preserve"> Cerca de 154 mil decisões por mês, 24% do total, passam ao protocolo de triagem do próprio hospital. A revisão por amostra sobe de 12.800 para cerca de 24 mil casos por mês </w:t>
-      </w:r>
-      <w:r>
-        <w:rPr>
-          <w:rStyle w:val="TagHiptese"/>
-        </w:rPr>
-        <w:t>[hipótese: as decisões se distribuem como a base]</w:t>
-      </w:r>
-      <w:r>
-        <w:t>.</w:t>
-      </w:r>
-    </w:p>
-    <w:p>
-      <w:pPr>
-        <w:pStyle w:val="Commarcadores"/>
-      </w:pPr>
-      <w:r>
-        <w:rPr>
-          <w:b/>
-        </w:rPr>
-        <w:t>O que falta saber.</w:t>
-      </w:r>
-      <w:r>
-        <w:t xml:space="preserve"> A carga em cada hospital e a receita afetada </w:t>
+        <w:t xml:space="preserve"> Dois grupos já passam do ponto de ação do indicador 1: idosos de CEP C e de CEP D/E. Pelo nosso compromisso de Não Amplificação de Danos (C2), o uso é suspenso até a correção quando há padrão de viés. Por isso recomendamos restringir já a recomendação automática nesses grupos (D-023). Cerca de um quarto das decisões de priorização volta à triagem do próprio hospital, enquanto o modelo segue rodando em paralelo, sem decidir, para medir a correção. Quanto isso pesa em cada hospital </w:t>
       </w:r>
       <w:r>
         <w:rPr>
@@ -2706,7 +1863,7 @@
         <w:t>[não consta]</w:t>
       </w:r>
       <w:r>
-        <w:t>. A Entrega 3 define quem executa a restrição e com que poder.</w:t>
+        <w:t>, e a Entrega 3 define quem executa a restrição.</w:t>
       </w:r>
     </w:p>
     <w:p>
@@ -2720,7 +1877,7 @@
     <w:p>
       <w:pPr/>
       <w:r>
-        <w:t>A base de clientes só vira vantagem difícil de copiar com direito de uso limpo e desempenho por subgrupo que alguém de fora consiga refazer, como a Entrega 1 já apontava. Por isso, levamos ao memorando três condições prévias ao aporte: regularizar a Prisma antes de 12/2026 e o Vila Ipê antes de 03/2027, incluindo o histórico anterior aos contratos; tirar do mercado os números que não se sustentam; e medir o erro por subgrupo com conferência externa. O falso negativo por subgrupo é também a métrica pública de impacto que a Entrega 5 vai propor.</w:t>
+        <w:t>A base de clientes só vira vantagem difícil de copiar quando tiver direito de uso limpo e erro por grupo que alguém de fora consiga refazer, como a Entrega 1 já apontava. Por isso, o memorando leva três condições prévias ao aporte: regularizar os contratos antes do vencimento, tirar do mercado os números que não se sustentam e medir o erro por grupo com conferência externa.</w:t>
       </w:r>
     </w:p>
     <w:p>
@@ -2736,7 +1893,7 @@
         <w:pStyle w:val="LumisNota"/>
       </w:pPr>
       <w:r>
-        <w:t>1. OBERMEYER, Z. et al. Dissecting racial bias in an algorithm used to manage the health of populations. Science, v. 366, n. 6464, p. 447-453, 2019. DOI: 10.1126/science.aax2342.</w:t>
+        <w:t>1. OBERMEYER, Z. et al. Dissecting racial bias in an algorithm used to manage the health of populations. Science, v. 366, n. 6464, p. 447-453, 2019.</w:t>
       </w:r>
     </w:p>
     <w:p>
@@ -2744,7 +1901,7 @@
         <w:pStyle w:val="LumisNota"/>
       </w:pPr>
       <w:r>
-        <w:t>2. WONG, A. et al. External Validation of a Widely Implemented Proprietary Sepsis Prediction Model in Hospitalized Patients. JAMA Internal Medicine, v. 181, n. 8, p. 1065-1070, 2021.</w:t>
+        <w:t>2. BRASIL. Lei nº 13.709/2018 (LGPD), arts. 5º, 6º, 11 e 52. Consulta em 06/10/2026.</w:t>
       </w:r>
     </w:p>
     <w:p>
@@ -2752,7 +1909,7 @@
         <w:pStyle w:val="LumisNota"/>
       </w:pPr>
       <w:r>
-        <w:t>3. BRASIL. Lei nº 13.709, de 14 de agosto de 2018 (Lei Geral de Proteção de Dados Pessoais), arts. 5º, 6º, 11 e 52. Consulta em 06/10/2026.</w:t>
+        <w:t>3. ANPD. Guia Orientativo para Definições dos Agentes de Tratamento de Dados Pessoais e do Encarregado. Versão 2.0, 2022.</w:t>
       </w:r>
     </w:p>
     <w:p>
@@ -2760,7 +1917,7 @@
         <w:pStyle w:val="LumisNota"/>
       </w:pPr>
       <w:r>
-        <w:t>4. ANPD. Guia Orientativo para Definições dos Agentes de Tratamento de Dados Pessoais e do Encarregado. Versão 2.0, abr. 2022.</w:t>
+        <w:t>4. NIST. Artificial Intelligence Risk Management Framework (AI RMF 1.0). NIST AI 100-1, 2023.</w:t>
       </w:r>
     </w:p>
     <w:p>
@@ -2768,28 +1925,16 @@
         <w:pStyle w:val="LumisNota"/>
       </w:pPr>
       <w:r>
-        <w:t>5. NIST. Artificial Intelligence Risk Management Framework (AI RMF 1.0). NIST AI 100-1, jan. 2023 (função MANAGE 2.4).</w:t>
-      </w:r>
-    </w:p>
-    <w:p>
-      <w:pPr>
-        <w:pStyle w:val="LumisNota"/>
-      </w:pPr>
-      <w:r>
-        <w:t>Dados da Lumis: Cap. 2, Anexo A. Contas, limites e leituras são da equipe e estão marcados no texto. As empresas reais citadas são análogos e não fazem parte do caso Lumis.</w:t>
-      </w:r>
-    </w:p>
-    <w:p>
-      <w:r>
-        <w:br w:type="page"/>
+        <w:t>Dados da Lumis: Cap. 2, Anexo A. Contas e propostas são da equipe. As empresas reais citadas são análogos e não fazem parte do caso Lumis.</w:t>
       </w:r>
     </w:p>
     <w:p>
       <w:pPr>
         <w:pStyle w:val="Ttulo1"/>
+        <w:pageBreakBefore/>
       </w:pPr>
       <w:r>
-        <w:t>Anexo: detalhes da auditoria</w:t>
+        <w:t>Anexo: as quatro perguntas</w:t>
       </w:r>
     </w:p>
     <w:p>
@@ -2797,743 +1942,7 @@
         <w:pStyle w:val="Ttulo2"/>
       </w:pPr>
       <w:r>
-        <w:t>A1. As dez variáveis do modelo</w:t>
-      </w:r>
-    </w:p>
-    <w:tbl>
-      <w:tblPr>
-        <w:tblW w:type="auto" w:w="0"/>
-        <w:jc w:val="center"/>
-        <w:tblLayout w:type="fixed"/>
-        <w:tblLook w:firstColumn="1" w:firstRow="1" w:lastColumn="0" w:lastRow="0" w:noHBand="0" w:noVBand="1" w:val="04A0"/>
-        <w:tblBorders>
-          <w:top w:val="single" w:sz="4" w:color="D3DEDB"/>
-          <w:bottom w:val="single" w:sz="4" w:color="D3DEDB"/>
-          <w:insideH w:val="single" w:sz="4" w:color="D3DEDB"/>
-        </w:tblBorders>
-        <w:tblLayout w:type="fixed"/>
-      </w:tblPr>
-      <w:tblGrid>
-        <w:gridCol w:w="2608"/>
-        <w:gridCol w:w="850"/>
-        <w:gridCol w:w="2608"/>
-        <w:gridCol w:w="3005"/>
-      </w:tblGrid>
-      <w:tr>
-        <w:trPr>
-          <w:tblHeader w:val="true"/>
-          <w:cantSplit/>
-        </w:trPr>
-        <w:tc>
-          <w:tcPr>
-            <w:tcW w:type="dxa" w:w="2608"/>
-            <w:shd w:val="clear" w:color="auto" w:fill="0F2D3A"/>
-          </w:tcPr>
-          <w:p>
-            <w:pPr>
-              <w:pStyle w:val="LumisTabela"/>
-              <w:keepNext/>
-            </w:pPr>
-            <w:r>
-              <w:rPr>
-                <w:b/>
-                <w:color w:val="FFFFFF"/>
-              </w:rPr>
-              <w:t>Variável</w:t>
-            </w:r>
-          </w:p>
-        </w:tc>
-        <w:tc>
-          <w:tcPr>
-            <w:tcW w:type="dxa" w:w="850"/>
-            <w:shd w:val="clear" w:color="auto" w:fill="0F2D3A"/>
-          </w:tcPr>
-          <w:p>
-            <w:pPr>
-              <w:pStyle w:val="LumisTabela"/>
-              <w:keepNext/>
-            </w:pPr>
-            <w:r>
-              <w:rPr>
-                <w:b/>
-                <w:color w:val="FFFFFF"/>
-              </w:rPr>
-              <w:t>Peso</w:t>
-            </w:r>
-          </w:p>
-        </w:tc>
-        <w:tc>
-          <w:tcPr>
-            <w:tcW w:type="dxa" w:w="2608"/>
-            <w:shd w:val="clear" w:color="auto" w:fill="0F2D3A"/>
-          </w:tcPr>
-          <w:p>
-            <w:pPr>
-              <w:pStyle w:val="LumisTabela"/>
-              <w:keepNext/>
-            </w:pPr>
-            <w:r>
-              <w:rPr>
-                <w:b/>
-                <w:color w:val="FFFFFF"/>
-              </w:rPr>
-              <w:t>A empresa diz medir</w:t>
-            </w:r>
-          </w:p>
-        </w:tc>
-        <w:tc>
-          <w:tcPr>
-            <w:tcW w:type="dxa" w:w="3005"/>
-            <w:shd w:val="clear" w:color="auto" w:fill="0F2D3A"/>
-          </w:tcPr>
-          <w:p>
-            <w:pPr>
-              <w:pStyle w:val="LumisTabela"/>
-              <w:keepNext/>
-            </w:pPr>
-            <w:r>
-              <w:rPr>
-                <w:b/>
-                <w:color w:val="FFFFFF"/>
-              </w:rPr>
-              <w:t>O que tende a medir [hipótese]</w:t>
-            </w:r>
-          </w:p>
-        </w:tc>
-      </w:tr>
-      <w:tr>
-        <w:trPr>
-          <w:cantSplit/>
-        </w:trPr>
-        <w:tc>
-          <w:tcPr>
-            <w:tcW w:type="dxa" w:w="2608"/>
-          </w:tcPr>
-          <w:p>
-            <w:pPr>
-              <w:pStyle w:val="LumisTabela"/>
-            </w:pPr>
-            <w:r>
-              <w:t>Nº de atendimentos em 24 meses</w:t>
-            </w:r>
-          </w:p>
-        </w:tc>
-        <w:tc>
-          <w:tcPr>
-            <w:tcW w:type="dxa" w:w="850"/>
-          </w:tcPr>
-          <w:p>
-            <w:pPr>
-              <w:pStyle w:val="LumisTabela"/>
-            </w:pPr>
-            <w:r>
-              <w:t>18,4%</w:t>
-            </w:r>
-          </w:p>
-        </w:tc>
-        <w:tc>
-          <w:tcPr>
-            <w:tcW w:type="dxa" w:w="2608"/>
-          </w:tcPr>
-          <w:p>
-            <w:pPr>
-              <w:pStyle w:val="LumisTabela"/>
-            </w:pPr>
-            <w:r>
-              <w:t>Histórico de necessidade de cuidado</w:t>
-            </w:r>
-          </w:p>
-        </w:tc>
-        <w:tc>
-          <w:tcPr>
-            <w:tcW w:type="dxa" w:w="3005"/>
-          </w:tcPr>
-          <w:p>
-            <w:pPr>
-              <w:pStyle w:val="LumisTabela"/>
-            </w:pPr>
-            <w:r>
-              <w:t>Quem conseguiu ser atendido</w:t>
-            </w:r>
-          </w:p>
-        </w:tc>
-      </w:tr>
-      <w:tr>
-        <w:trPr>
-          <w:cantSplit/>
-        </w:trPr>
-        <w:tc>
-          <w:tcPr>
-            <w:tcW w:type="dxa" w:w="2608"/>
-            <w:shd w:val="clear" w:color="auto" w:fill="F1F6F4"/>
-          </w:tcPr>
-          <w:p>
-            <w:pPr>
-              <w:pStyle w:val="LumisTabela"/>
-            </w:pPr>
-            <w:r>
-              <w:t>Custo acumulado de procedimentos</w:t>
-            </w:r>
-          </w:p>
-        </w:tc>
-        <w:tc>
-          <w:tcPr>
-            <w:tcW w:type="dxa" w:w="850"/>
-            <w:shd w:val="clear" w:color="auto" w:fill="F1F6F4"/>
-          </w:tcPr>
-          <w:p>
-            <w:pPr>
-              <w:pStyle w:val="LumisTabela"/>
-            </w:pPr>
-            <w:r>
-              <w:t>15,1%</w:t>
-            </w:r>
-          </w:p>
-        </w:tc>
-        <w:tc>
-          <w:tcPr>
-            <w:tcW w:type="dxa" w:w="2608"/>
-            <w:shd w:val="clear" w:color="auto" w:fill="F1F6F4"/>
-          </w:tcPr>
-          <w:p>
-            <w:pPr>
-              <w:pStyle w:val="LumisTabela"/>
-            </w:pPr>
-            <w:r>
-              <w:t>Gravidade do quadro clínico</w:t>
-            </w:r>
-          </w:p>
-        </w:tc>
-        <w:tc>
-          <w:tcPr>
-            <w:tcW w:type="dxa" w:w="3005"/>
-            <w:shd w:val="clear" w:color="auto" w:fill="F1F6F4"/>
-          </w:tcPr>
-          <w:p>
-            <w:pPr>
-              <w:pStyle w:val="LumisTabela"/>
-            </w:pPr>
-            <w:r>
-              <w:t>Acesso a procedimentos pagos</w:t>
-            </w:r>
-          </w:p>
-        </w:tc>
-      </w:tr>
-      <w:tr>
-        <w:trPr>
-          <w:cantSplit/>
-        </w:trPr>
-        <w:tc>
-          <w:tcPr>
-            <w:tcW w:type="dxa" w:w="2608"/>
-          </w:tcPr>
-          <w:p>
-            <w:pPr>
-              <w:pStyle w:val="LumisTabela"/>
-            </w:pPr>
-            <w:r>
-              <w:t>Idade do paciente</w:t>
-            </w:r>
-          </w:p>
-        </w:tc>
-        <w:tc>
-          <w:tcPr>
-            <w:tcW w:type="dxa" w:w="850"/>
-          </w:tcPr>
-          <w:p>
-            <w:pPr>
-              <w:pStyle w:val="LumisTabela"/>
-            </w:pPr>
-            <w:r>
-              <w:t>12,7%</w:t>
-            </w:r>
-          </w:p>
-        </w:tc>
-        <w:tc>
-          <w:tcPr>
-            <w:tcW w:type="dxa" w:w="2608"/>
-          </w:tcPr>
-          <w:p>
-            <w:pPr>
-              <w:pStyle w:val="LumisTabela"/>
-            </w:pPr>
-            <w:r>
-              <w:t>Idade</w:t>
-            </w:r>
-          </w:p>
-        </w:tc>
-        <w:tc>
-          <w:tcPr>
-            <w:tcW w:type="dxa" w:w="3005"/>
-          </w:tcPr>
-          <w:p>
-            <w:pPr>
-              <w:pStyle w:val="LumisTabela"/>
-            </w:pPr>
-            <w:r>
-              <w:t>Idade, com fundamento clínico</w:t>
-            </w:r>
-          </w:p>
-        </w:tc>
-      </w:tr>
-      <w:tr>
-        <w:trPr>
-          <w:cantSplit/>
-        </w:trPr>
-        <w:tc>
-          <w:tcPr>
-            <w:tcW w:type="dxa" w:w="2608"/>
-            <w:shd w:val="clear" w:color="auto" w:fill="F1F6F4"/>
-          </w:tcPr>
-          <w:p>
-            <w:pPr>
-              <w:pStyle w:val="LumisTabela"/>
-            </w:pPr>
-            <w:r>
-              <w:t>Nº de comorbidades registradas</w:t>
-            </w:r>
-          </w:p>
-        </w:tc>
-        <w:tc>
-          <w:tcPr>
-            <w:tcW w:type="dxa" w:w="850"/>
-            <w:shd w:val="clear" w:color="auto" w:fill="F1F6F4"/>
-          </w:tcPr>
-          <w:p>
-            <w:pPr>
-              <w:pStyle w:val="LumisTabela"/>
-            </w:pPr>
-            <w:r>
-              <w:t>11,2%</w:t>
-            </w:r>
-          </w:p>
-        </w:tc>
-        <w:tc>
-          <w:tcPr>
-            <w:tcW w:type="dxa" w:w="2608"/>
-            <w:shd w:val="clear" w:color="auto" w:fill="F1F6F4"/>
-          </w:tcPr>
-          <w:p>
-            <w:pPr>
-              <w:pStyle w:val="LumisTabela"/>
-            </w:pPr>
-            <w:r>
-              <w:t>Carga de doença</w:t>
-            </w:r>
-          </w:p>
-        </w:tc>
-        <w:tc>
-          <w:tcPr>
-            <w:tcW w:type="dxa" w:w="3005"/>
-            <w:shd w:val="clear" w:color="auto" w:fill="F1F6F4"/>
-          </w:tcPr>
-          <w:p>
-            <w:pPr>
-              <w:pStyle w:val="LumisTabela"/>
-            </w:pPr>
-            <w:r>
-              <w:t>Doença já diagnosticada, que depende de acesso</w:t>
-            </w:r>
-          </w:p>
-        </w:tc>
-      </w:tr>
-      <w:tr>
-        <w:trPr>
-          <w:cantSplit/>
-        </w:trPr>
-        <w:tc>
-          <w:tcPr>
-            <w:tcW w:type="dxa" w:w="2608"/>
-          </w:tcPr>
-          <w:p>
-            <w:pPr>
-              <w:pStyle w:val="LumisTabela"/>
-            </w:pPr>
-            <w:r>
-              <w:t>Tempo médio entre consulta e exame</w:t>
-            </w:r>
-          </w:p>
-        </w:tc>
-        <w:tc>
-          <w:tcPr>
-            <w:tcW w:type="dxa" w:w="850"/>
-          </w:tcPr>
-          <w:p>
-            <w:pPr>
-              <w:pStyle w:val="LumisTabela"/>
-            </w:pPr>
-            <w:r>
-              <w:t>9,8%</w:t>
-            </w:r>
-          </w:p>
-        </w:tc>
-        <w:tc>
-          <w:tcPr>
-            <w:tcW w:type="dxa" w:w="2608"/>
-          </w:tcPr>
-          <w:p>
-            <w:pPr>
-              <w:pStyle w:val="LumisTabela"/>
-            </w:pPr>
-            <w:r>
-              <w:t>Urgência percebida pelo médico</w:t>
-            </w:r>
-          </w:p>
-        </w:tc>
-        <w:tc>
-          <w:tcPr>
-            <w:tcW w:type="dxa" w:w="3005"/>
-          </w:tcPr>
-          <w:p>
-            <w:pPr>
-              <w:pStyle w:val="LumisTabela"/>
-            </w:pPr>
-            <w:r>
-              <w:t>Fila e oferta da rede</w:t>
-            </w:r>
-          </w:p>
-        </w:tc>
-      </w:tr>
-      <w:tr>
-        <w:trPr>
-          <w:cantSplit/>
-        </w:trPr>
-        <w:tc>
-          <w:tcPr>
-            <w:tcW w:type="dxa" w:w="2608"/>
-            <w:shd w:val="clear" w:color="auto" w:fill="F1F6F4"/>
-          </w:tcPr>
-          <w:p>
-            <w:pPr>
-              <w:pStyle w:val="LumisTabela"/>
-            </w:pPr>
-            <w:r>
-              <w:t>Faixa de CEP agrupada</w:t>
-            </w:r>
-          </w:p>
-        </w:tc>
-        <w:tc>
-          <w:tcPr>
-            <w:tcW w:type="dxa" w:w="850"/>
-            <w:shd w:val="clear" w:color="auto" w:fill="F1F6F4"/>
-          </w:tcPr>
-          <w:p>
-            <w:pPr>
-              <w:pStyle w:val="LumisTabela"/>
-            </w:pPr>
-            <w:r>
-              <w:t>8,9%</w:t>
-            </w:r>
-          </w:p>
-        </w:tc>
-        <w:tc>
-          <w:tcPr>
-            <w:tcW w:type="dxa" w:w="2608"/>
-            <w:shd w:val="clear" w:color="auto" w:fill="F1F6F4"/>
-          </w:tcPr>
-          <w:p>
-            <w:pPr>
-              <w:pStyle w:val="LumisTabela"/>
-            </w:pPr>
-            <w:r>
-              <w:t>Região de residência</w:t>
-            </w:r>
-          </w:p>
-        </w:tc>
-        <w:tc>
-          <w:tcPr>
-            <w:tcW w:type="dxa" w:w="3005"/>
-            <w:shd w:val="clear" w:color="auto" w:fill="F1F6F4"/>
-          </w:tcPr>
-          <w:p>
-            <w:pPr>
-              <w:pStyle w:val="LumisTabela"/>
-            </w:pPr>
-            <w:r>
-              <w:t>Renda e oferta de serviços</w:t>
-            </w:r>
-          </w:p>
-        </w:tc>
-      </w:tr>
-      <w:tr>
-        <w:trPr>
-          <w:cantSplit/>
-        </w:trPr>
-        <w:tc>
-          <w:tcPr>
-            <w:tcW w:type="dxa" w:w="2608"/>
-          </w:tcPr>
-          <w:p>
-            <w:pPr>
-              <w:pStyle w:val="LumisTabela"/>
-            </w:pPr>
-            <w:r>
-              <w:t>Tipo de plano ou cobertura</w:t>
-            </w:r>
-          </w:p>
-        </w:tc>
-        <w:tc>
-          <w:tcPr>
-            <w:tcW w:type="dxa" w:w="850"/>
-          </w:tcPr>
-          <w:p>
-            <w:pPr>
-              <w:pStyle w:val="LumisTabela"/>
-            </w:pPr>
-            <w:r>
-              <w:t>7,4%</w:t>
-            </w:r>
-          </w:p>
-        </w:tc>
-        <w:tc>
-          <w:tcPr>
-            <w:tcW w:type="dxa" w:w="2608"/>
-          </w:tcPr>
-          <w:p>
-            <w:pPr>
-              <w:pStyle w:val="LumisTabela"/>
-            </w:pPr>
-            <w:r>
-              <w:t>Nível de cobertura contratada</w:t>
-            </w:r>
-          </w:p>
-        </w:tc>
-        <w:tc>
-          <w:tcPr>
-            <w:tcW w:type="dxa" w:w="3005"/>
-          </w:tcPr>
-          <w:p>
-            <w:pPr>
-              <w:pStyle w:val="LumisTabela"/>
-            </w:pPr>
-            <w:r>
-              <w:t>Renda</w:t>
-            </w:r>
-          </w:p>
-        </w:tc>
-      </w:tr>
-      <w:tr>
-        <w:trPr>
-          <w:cantSplit/>
-        </w:trPr>
-        <w:tc>
-          <w:tcPr>
-            <w:tcW w:type="dxa" w:w="2608"/>
-            <w:shd w:val="clear" w:color="auto" w:fill="F1F6F4"/>
-          </w:tcPr>
-          <w:p>
-            <w:pPr>
-              <w:pStyle w:val="LumisTabela"/>
-            </w:pPr>
-            <w:r>
-              <w:t>Painel de exames laboratoriais</w:t>
-            </w:r>
-          </w:p>
-        </w:tc>
-        <w:tc>
-          <w:tcPr>
-            <w:tcW w:type="dxa" w:w="850"/>
-            <w:shd w:val="clear" w:color="auto" w:fill="F1F6F4"/>
-          </w:tcPr>
-          <w:p>
-            <w:pPr>
-              <w:pStyle w:val="LumisTabela"/>
-            </w:pPr>
-            <w:r>
-              <w:t>6,9%</w:t>
-            </w:r>
-          </w:p>
-        </w:tc>
-        <w:tc>
-          <w:tcPr>
-            <w:tcW w:type="dxa" w:w="2608"/>
-            <w:shd w:val="clear" w:color="auto" w:fill="F1F6F4"/>
-          </w:tcPr>
-          <w:p>
-            <w:pPr>
-              <w:pStyle w:val="LumisTabela"/>
-            </w:pPr>
-            <w:r>
-              <w:t>Estado clínico atual</w:t>
-            </w:r>
-          </w:p>
-        </w:tc>
-        <w:tc>
-          <w:tcPr>
-            <w:tcW w:type="dxa" w:w="3005"/>
-            <w:shd w:val="clear" w:color="auto" w:fill="F1F6F4"/>
-          </w:tcPr>
-          <w:p>
-            <w:pPr>
-              <w:pStyle w:val="LumisTabela"/>
-            </w:pPr>
-            <w:r>
-              <w:t>Estado clínico, quando o exame foi pedido</w:t>
-            </w:r>
-          </w:p>
-        </w:tc>
-      </w:tr>
-      <w:tr>
-        <w:trPr>
-          <w:cantSplit/>
-        </w:trPr>
-        <w:tc>
-          <w:tcPr>
-            <w:tcW w:type="dxa" w:w="2608"/>
-          </w:tcPr>
-          <w:p>
-            <w:pPr>
-              <w:pStyle w:val="LumisTabela"/>
-            </w:pPr>
-            <w:r>
-              <w:t>Nº de faltas em consultas</w:t>
-            </w:r>
-          </w:p>
-        </w:tc>
-        <w:tc>
-          <w:tcPr>
-            <w:tcW w:type="dxa" w:w="850"/>
-          </w:tcPr>
-          <w:p>
-            <w:pPr>
-              <w:pStyle w:val="LumisTabela"/>
-            </w:pPr>
-            <w:r>
-              <w:t>5,3%</w:t>
-            </w:r>
-          </w:p>
-        </w:tc>
-        <w:tc>
-          <w:tcPr>
-            <w:tcW w:type="dxa" w:w="2608"/>
-          </w:tcPr>
-          <w:p>
-            <w:pPr>
-              <w:pStyle w:val="LumisTabela"/>
-            </w:pPr>
-            <w:r>
-              <w:t>Adesão ao tratamento</w:t>
-            </w:r>
-          </w:p>
-        </w:tc>
-        <w:tc>
-          <w:tcPr>
-            <w:tcW w:type="dxa" w:w="3005"/>
-          </w:tcPr>
-          <w:p>
-            <w:pPr>
-              <w:pStyle w:val="LumisTabela"/>
-            </w:pPr>
-            <w:r>
-              <w:t>Transporte, trabalho e tempo de espera</w:t>
-            </w:r>
-          </w:p>
-        </w:tc>
-      </w:tr>
-      <w:tr>
-        <w:trPr>
-          <w:cantSplit/>
-        </w:trPr>
-        <w:tc>
-          <w:tcPr>
-            <w:tcW w:type="dxa" w:w="2608"/>
-            <w:shd w:val="clear" w:color="auto" w:fill="F1F6F4"/>
-          </w:tcPr>
-          <w:p>
-            <w:pPr>
-              <w:pStyle w:val="LumisTabela"/>
-              <w:keepNext/>
-            </w:pPr>
-            <w:r>
-              <w:t>Especialidade de origem</w:t>
-            </w:r>
-          </w:p>
-        </w:tc>
-        <w:tc>
-          <w:tcPr>
-            <w:tcW w:type="dxa" w:w="850"/>
-            <w:shd w:val="clear" w:color="auto" w:fill="F1F6F4"/>
-          </w:tcPr>
-          <w:p>
-            <w:pPr>
-              <w:pStyle w:val="LumisTabela"/>
-              <w:keepNext/>
-            </w:pPr>
-            <w:r>
-              <w:t>4,3%</w:t>
-            </w:r>
-          </w:p>
-        </w:tc>
-        <w:tc>
-          <w:tcPr>
-            <w:tcW w:type="dxa" w:w="2608"/>
-            <w:shd w:val="clear" w:color="auto" w:fill="F1F6F4"/>
-          </w:tcPr>
-          <w:p>
-            <w:pPr>
-              <w:pStyle w:val="LumisTabela"/>
-              <w:keepNext/>
-            </w:pPr>
-            <w:r>
-              <w:t>Via de entrada no sistema</w:t>
-            </w:r>
-          </w:p>
-        </w:tc>
-        <w:tc>
-          <w:tcPr>
-            <w:tcW w:type="dxa" w:w="3005"/>
-            <w:shd w:val="clear" w:color="auto" w:fill="F1F6F4"/>
-          </w:tcPr>
-          <w:p>
-            <w:pPr>
-              <w:pStyle w:val="LumisTabela"/>
-              <w:keepNext/>
-            </w:pPr>
-            <w:r>
-              <w:t>Via de entrada, que depende de acesso</w:t>
-            </w:r>
-          </w:p>
-        </w:tc>
-      </w:tr>
-    </w:tbl>
-    <w:p>
-      <w:pPr>
-        <w:pStyle w:val="Legenda"/>
-      </w:pPr>
-      <w:r>
-        <w:t>Tabela A1. Fonte: Cap. 2, Quadro 8; última coluna: leitura da equipe.</w:t>
-      </w:r>
-    </w:p>
-    <w:p>
-      <w:pPr/>
-      <w:r>
-        <w:t xml:space="preserve">Os dez pesos somam 100,0%, embora o quadro fale em "dez maiores pesos". A definição técnica de peso, o sinal de cada variável e o rótulo do treino </w:t>
-      </w:r>
-      <w:r>
-        <w:rPr>
-          <w:rStyle w:val="TagNoconsta"/>
-        </w:rPr>
-        <w:t>[não consta]</w:t>
-      </w:r>
-      <w:r>
-        <w:t xml:space="preserve">. O peso das variáveis de acesso muda com o critério: 49,8% (atendimentos, custo, CEP e plano), 64,9% (somando tempo até o exame e faltas) ou 69,2% (somando também a especialidade) </w:t>
-      </w:r>
-      <w:r>
-        <w:rPr>
-          <w:rStyle w:val="TagHiptese"/>
-        </w:rPr>
-        <w:t>[hipótese]</w:t>
-      </w:r>
-      <w:r>
-        <w:t>. Testes sugeridos para a Fase 3: trocar o rótulo do treino, retirar o bloco de variáveis de acesso e trocar só o CEP e o plano de um mesmo paciente para ver se a prioridade muda.</w:t>
-      </w:r>
-    </w:p>
-    <w:p>
-      <w:pPr>
-        <w:pStyle w:val="Ttulo2"/>
-      </w:pPr>
-      <w:r>
-        <w:t>A2. As quatro perguntas aplicadas às afirmações do mercado</w:t>
+        <w:t>A1. As quatro perguntas aplicadas às afirmações do mercado</w:t>
       </w:r>
     </w:p>
     <w:tbl>
@@ -3696,16 +2105,7 @@
               <w:pStyle w:val="LumisTabela"/>
             </w:pPr>
             <w:r>
-              <w:t xml:space="preserve">Apuração interna </w:t>
-            </w:r>
-            <w:r>
-              <w:rPr>
-                <w:rStyle w:val="TagHiptese"/>
-              </w:rPr>
-              <w:t>[hipótese]</w:t>
-            </w:r>
-            <w:r>
-              <w:t xml:space="preserve">; quem apurou </w:t>
+              <w:t xml:space="preserve">Quem apurou </w:t>
             </w:r>
             <w:r>
               <w:rPr>
@@ -3724,7 +2124,7 @@
               <w:pStyle w:val="LumisTabela"/>
             </w:pPr>
             <w:r>
-              <w:t>Não. Virou discurso comercial (Goodhart)</w:t>
+              <w:t>Não. Virou discurso comercial</w:t>
             </w:r>
           </w:p>
         </w:tc>
@@ -3737,7 +2137,7 @@
               <w:pStyle w:val="LumisTabela"/>
             </w:pPr>
             <w:r>
-              <w:t>O falso negativo e os subgrupos: 17,7% em campo e 31,8% no pior grupo</w:t>
+              <w:t>O erro em campo e os grupos: 31,8% no pior</w:t>
             </w:r>
           </w:p>
         </w:tc>
@@ -3770,7 +2170,7 @@
               <w:pStyle w:val="LumisTabela"/>
             </w:pPr>
             <w:r>
-              <w:t>Seis semanas, um hospital, sem grupo de controle</w:t>
+              <w:t>Seis semanas, um hospital, sem comparação</w:t>
             </w:r>
           </w:p>
         </w:tc>
@@ -3815,7 +2215,7 @@
               <w:pStyle w:val="LumisTabela"/>
             </w:pPr>
             <w:r>
-              <w:t>Não há abertura por grupo nem por hospital</w:t>
+              <w:t>Não abre por grupo nem por hospital</w:t>
             </w:r>
           </w:p>
         </w:tc>
@@ -3846,7 +2246,7 @@
               <w:pStyle w:val="LumisTabela"/>
             </w:pPr>
             <w:r>
-              <w:t>Registros processados, com reprocessamento</w:t>
+              <w:t>Registros processados, com repetição</w:t>
             </w:r>
           </w:p>
         </w:tc>
@@ -3938,7 +2338,7 @@
               <w:pStyle w:val="LumisTabela"/>
             </w:pPr>
             <w:r>
-              <w:t>Escolhidos pelo time comercial</w:t>
+              <w:t>Escolhidos pelo comercial</w:t>
             </w:r>
           </w:p>
         </w:tc>
@@ -3966,7 +2366,7 @@
               <w:pStyle w:val="LumisTabela"/>
             </w:pPr>
             <w:r>
-              <w:t>As 38 contas e as 74 reclamações, 47 delas de CEP D/E</w:t>
+              <w:t>As 38 contas e as 74 reclamações</w:t>
             </w:r>
           </w:p>
         </w:tc>
@@ -3999,7 +2399,7 @@
               <w:keepNext/>
             </w:pPr>
             <w:r>
-              <w:t>Só a interface de programação</w:t>
+              <w:t>Só a interface técnica</w:t>
             </w:r>
           </w:p>
         </w:tc>
@@ -4044,7 +2444,7 @@
               <w:keepNext/>
             </w:pPr>
             <w:r>
-              <w:t>O serviço de ponta a ponta e a qualidade da resposta</w:t>
+              <w:t>O serviço completo e a qualidade da resposta</w:t>
             </w:r>
           </w:p>
         </w:tc>
@@ -4055,31 +2455,7 @@
         <w:pStyle w:val="Legenda"/>
       </w:pPr>
       <w:r>
-        <w:t>Tabela A2. Fonte: Cap. 2, Quadros 9, 11, 14 e 17; as quatro perguntas: Cap. 2, 2.3.</w:t>
-      </w:r>
-    </w:p>
-    <w:p>
-      <w:pPr/>
-      <w:r>
-        <w:t xml:space="preserve">Com 9 respostas, cada uma move o NPS em 11,1 pontos, e 72 não é um resultado possível: os vizinhos são 66,7 e 77,8. Como o 72 foi calculado </w:t>
-      </w:r>
-      <w:r>
-        <w:rPr>
-          <w:rStyle w:val="TagNoconsta"/>
-        </w:rPr>
-        <w:t>[não consta]</w:t>
-      </w:r>
-      <w:r>
-        <w:t xml:space="preserve">. Os 99,92% admitem cerca de 7 horas fora do ar por ano. Em 03/2025, o modelo descartou exames de um laboratório por 22 dias com a interface no ar, e quem detectou foi o cliente </w:t>
-      </w:r>
-      <w:r>
-        <w:rPr>
-          <w:rStyle w:val="TagFonte"/>
-        </w:rPr>
-        <w:t>[fonte: Cap. 2, Quadro 14]</w:t>
-      </w:r>
-      <w:r>
-        <w:t>.</w:t>
+        <w:t>Tabela A1. Fonte: Cap. 2, Quadros 9, 11, 14 e 17; as quatro perguntas: Cap. 2, 2.3.</w:t>
       </w:r>
     </w:p>
     <w:p>
@@ -4087,7 +2463,7 @@
         <w:pStyle w:val="Ttulo2"/>
       </w:pPr>
       <w:r>
-        <w:t>A3. As quatro perguntas aplicadas aos indicadores propostos</w:t>
+        <w:t>A2. As quatro perguntas aplicadas aos indicadores propostos</w:t>
       </w:r>
     </w:p>
     <w:tbl>
@@ -4104,11 +2480,11 @@
         <w:tblLayout w:type="fixed"/>
       </w:tblPr>
       <w:tblGrid>
+        <w:gridCol w:w="1814"/>
+        <w:gridCol w:w="1814"/>
+        <w:gridCol w:w="1927"/>
         <w:gridCol w:w="1587"/>
         <w:gridCol w:w="1927"/>
-        <w:gridCol w:w="1927"/>
-        <w:gridCol w:w="1587"/>
-        <w:gridCol w:w="2041"/>
       </w:tblGrid>
       <w:tr>
         <w:trPr>
@@ -4117,7 +2493,7 @@
         </w:trPr>
         <w:tc>
           <w:tcPr>
-            <w:tcW w:type="dxa" w:w="1587"/>
+            <w:tcW w:type="dxa" w:w="1814"/>
             <w:shd w:val="clear" w:color="auto" w:fill="0F2D3A"/>
           </w:tcPr>
           <w:p>
@@ -4130,13 +2506,13 @@
                 <w:b/>
                 <w:color w:val="FFFFFF"/>
               </w:rPr>
-              <w:t>Indicador</w:t>
-            </w:r>
-          </w:p>
-        </w:tc>
-        <w:tc>
-          <w:tcPr>
-            <w:tcW w:type="dxa" w:w="1928"/>
+              <w:t>Indicador e valor de hoje</w:t>
+            </w:r>
+          </w:p>
+        </w:tc>
+        <w:tc>
+          <w:tcPr>
+            <w:tcW w:type="dxa" w:w="1814"/>
             <w:shd w:val="clear" w:color="auto" w:fill="0F2D3A"/>
           </w:tcPr>
           <w:p>
@@ -4193,7 +2569,7 @@
         </w:tc>
         <w:tc>
           <w:tcPr>
-            <w:tcW w:type="dxa" w:w="2041"/>
+            <w:tcW w:type="dxa" w:w="1928"/>
             <w:shd w:val="clear" w:color="auto" w:fill="0F2D3A"/>
           </w:tcPr>
           <w:p>
@@ -4217,6 +2593,45 @@
         </w:trPr>
         <w:tc>
           <w:tcPr>
+            <w:tcW w:type="dxa" w:w="1814"/>
+          </w:tcPr>
+          <w:p>
+            <w:pPr>
+              <w:pStyle w:val="LumisTabela"/>
+            </w:pPr>
+            <w:r>
+              <w:t>1. Erro por grupo: pior grupo 3,0 vezes o melhor</w:t>
+            </w:r>
+          </w:p>
+        </w:tc>
+        <w:tc>
+          <w:tcPr>
+            <w:tcW w:type="dxa" w:w="1814"/>
+          </w:tcPr>
+          <w:p>
+            <w:pPr>
+              <w:pStyle w:val="LumisTabela"/>
+            </w:pPr>
+            <w:r>
+              <w:t>Revisão humana (10% nos grupos críticos) e desfecho do cliente</w:t>
+            </w:r>
+          </w:p>
+        </w:tc>
+        <w:tc>
+          <w:tcPr>
+            <w:tcW w:type="dxa" w:w="1928"/>
+          </w:tcPr>
+          <w:p>
+            <w:pPr>
+              <w:pStyle w:val="LumisTabela"/>
+            </w:pPr>
+            <w:r>
+              <w:t>Pela Lumis. Cliente e auditor refazem</w:t>
+            </w:r>
+          </w:p>
+        </w:tc>
+        <w:tc>
+          <w:tcPr>
             <w:tcW w:type="dxa" w:w="1587"/>
           </w:tcPr>
           <w:p>
@@ -4224,7 +2639,7 @@
               <w:pStyle w:val="LumisTabela"/>
             </w:pPr>
             <w:r>
-              <w:t>1. Falso negativo por subgrupo</w:t>
+              <w:t>Sim: restrição de grupo e liberação de versão</w:t>
             </w:r>
           </w:p>
         </w:tc>
@@ -4237,46 +2652,7 @@
               <w:pStyle w:val="LumisTabela"/>
             </w:pPr>
             <w:r>
-              <w:t>Revisão humana (10% nos grupos críticos) e desfecho informado pelo cliente</w:t>
-            </w:r>
-          </w:p>
-        </w:tc>
-        <w:tc>
-          <w:tcPr>
-            <w:tcW w:type="dxa" w:w="1928"/>
-          </w:tcPr>
-          <w:p>
-            <w:pPr>
-              <w:pStyle w:val="LumisTabela"/>
-            </w:pPr>
-            <w:r>
-              <w:t>Pela Lumis, que tem interesse no resultado. Cliente e auditor refazem</w:t>
-            </w:r>
-          </w:p>
-        </w:tc>
-        <w:tc>
-          <w:tcPr>
-            <w:tcW w:type="dxa" w:w="1587"/>
-          </w:tcPr>
-          <w:p>
-            <w:pPr>
-              <w:pStyle w:val="LumisTabela"/>
-            </w:pPr>
-            <w:r>
-              <w:t>Sim: restrição de grupo e liberação de versão</w:t>
-            </w:r>
-          </w:p>
-        </w:tc>
-        <w:tc>
-          <w:tcPr>
-            <w:tcW w:type="dxa" w:w="2041"/>
-          </w:tcPr>
-          <w:p>
-            <w:pPr>
-              <w:pStyle w:val="LumisTabela"/>
-            </w:pPr>
-            <w:r>
-              <w:t>Diferenças por cliente e especialidade; grupos que o Quadro 10 não abre, como sexo</w:t>
+              <w:t>Diferenças por cliente; grupos que o caso não abre, como sexo</w:t>
             </w:r>
           </w:p>
         </w:tc>
@@ -4287,6 +2663,48 @@
         </w:trPr>
         <w:tc>
           <w:tcPr>
+            <w:tcW w:type="dxa" w:w="1814"/>
+            <w:shd w:val="clear" w:color="auto" w:fill="F1F6F4"/>
+          </w:tcPr>
+          <w:p>
+            <w:pPr>
+              <w:pStyle w:val="LumisTabela"/>
+            </w:pPr>
+            <w:r>
+              <w:t>2. Direito de uso: 0% com parecer jurídico</w:t>
+            </w:r>
+          </w:p>
+        </w:tc>
+        <w:tc>
+          <w:tcPr>
+            <w:tcW w:type="dxa" w:w="1814"/>
+            <w:shd w:val="clear" w:color="auto" w:fill="F1F6F4"/>
+          </w:tcPr>
+          <w:p>
+            <w:pPr>
+              <w:pStyle w:val="LumisTabela"/>
+            </w:pPr>
+            <w:r>
+              <w:t>Contratos contra a base de treino</w:t>
+            </w:r>
+          </w:p>
+        </w:tc>
+        <w:tc>
+          <w:tcPr>
+            <w:tcW w:type="dxa" w:w="1928"/>
+            <w:shd w:val="clear" w:color="auto" w:fill="F1F6F4"/>
+          </w:tcPr>
+          <w:p>
+            <w:pPr>
+              <w:pStyle w:val="LumisTabela"/>
+            </w:pPr>
+            <w:r>
+              <w:t>Pela DPO. Parecer externo confere</w:t>
+            </w:r>
+          </w:p>
+        </w:tc>
+        <w:tc>
+          <w:tcPr>
             <w:tcW w:type="dxa" w:w="1587"/>
             <w:shd w:val="clear" w:color="auto" w:fill="F1F6F4"/>
           </w:tcPr>
@@ -4295,7 +2713,7 @@
               <w:pStyle w:val="LumisTabela"/>
             </w:pPr>
             <w:r>
-              <w:t>2. Direito de uso</w:t>
+              <w:t>Sim: treino e renegociação</w:t>
             </w:r>
           </w:p>
         </w:tc>
@@ -4309,49 +2727,7 @@
               <w:pStyle w:val="LumisTabela"/>
             </w:pPr>
             <w:r>
-              <w:t>Inventário de contratos contra a base de treino</w:t>
-            </w:r>
-          </w:p>
-        </w:tc>
-        <w:tc>
-          <w:tcPr>
-            <w:tcW w:type="dxa" w:w="1928"/>
-            <w:shd w:val="clear" w:color="auto" w:fill="F1F6F4"/>
-          </w:tcPr>
-          <w:p>
-            <w:pPr>
-              <w:pStyle w:val="LumisTabela"/>
-            </w:pPr>
-            <w:r>
-              <w:t>Pela DPO, que também responde pelo jurídico. Cliente e parecer externo conferem</w:t>
-            </w:r>
-          </w:p>
-        </w:tc>
-        <w:tc>
-          <w:tcPr>
-            <w:tcW w:type="dxa" w:w="1587"/>
-            <w:shd w:val="clear" w:color="auto" w:fill="F1F6F4"/>
-          </w:tcPr>
-          <w:p>
-            <w:pPr>
-              <w:pStyle w:val="LumisTabela"/>
-            </w:pPr>
-            <w:r>
-              <w:t>Sim: entrada no treino e renegociação</w:t>
-            </w:r>
-          </w:p>
-        </w:tc>
-        <w:tc>
-          <w:tcPr>
-            <w:tcW w:type="dxa" w:w="2041"/>
-            <w:shd w:val="clear" w:color="auto" w:fill="F1F6F4"/>
-          </w:tcPr>
-          <w:p>
-            <w:pPr>
-              <w:pStyle w:val="LumisTabela"/>
-            </w:pPr>
-            <w:r>
-              <w:t>A concentração (Sanare é 57,6% dos dados de clientes) e o período anterior ao contrato</w:t>
+              <w:t>A concentração na Sanare e o período antes do contrato</w:t>
             </w:r>
           </w:p>
         </w:tc>
@@ -4362,6 +2738,54 @@
         </w:trPr>
         <w:tc>
           <w:tcPr>
+            <w:tcW w:type="dxa" w:w="1814"/>
+          </w:tcPr>
+          <w:p>
+            <w:pPr>
+              <w:pStyle w:val="LumisTabela"/>
+            </w:pPr>
+            <w:r>
+              <w:t>3. Reclamações: CEP D/E com 2,5 vezes o seu peso</w:t>
+            </w:r>
+          </w:p>
+        </w:tc>
+        <w:tc>
+          <w:tcPr>
+            <w:tcW w:type="dxa" w:w="1814"/>
+          </w:tcPr>
+          <w:p>
+            <w:pPr>
+              <w:pStyle w:val="LumisTabela"/>
+            </w:pPr>
+            <w:r>
+              <w:t>Registro formal, janela de 90 dias</w:t>
+            </w:r>
+          </w:p>
+        </w:tc>
+        <w:tc>
+          <w:tcPr>
+            <w:tcW w:type="dxa" w:w="1928"/>
+          </w:tcPr>
+          <w:p>
+            <w:pPr>
+              <w:pStyle w:val="LumisTabela"/>
+            </w:pPr>
+            <w:r>
+              <w:t xml:space="preserve">Time de sucesso do cliente, cargo </w:t>
+            </w:r>
+            <w:r>
+              <w:rPr>
+                <w:rStyle w:val="TagNoconsta"/>
+              </w:rPr>
+              <w:t>[não consta]</w:t>
+            </w:r>
+            <w:r>
+              <w:t>. O cliente confere</w:t>
+            </w:r>
+          </w:p>
+        </w:tc>
+        <w:tc>
+          <w:tcPr>
             <w:tcW w:type="dxa" w:w="1587"/>
           </w:tcPr>
           <w:p>
@@ -4369,7 +2793,7 @@
               <w:pStyle w:val="LumisTabela"/>
             </w:pPr>
             <w:r>
-              <w:t>3. Reclamações por CEP</w:t>
+              <w:t>Sim: revisão clínica</w:t>
             </w:r>
           </w:p>
         </w:tc>
@@ -4382,52 +2806,7 @@
               <w:pStyle w:val="LumisTabela"/>
             </w:pPr>
             <w:r>
-              <w:t>Registro formal de reclamações, janela de 90 dias</w:t>
-            </w:r>
-          </w:p>
-        </w:tc>
-        <w:tc>
-          <w:tcPr>
-            <w:tcW w:type="dxa" w:w="1928"/>
-          </w:tcPr>
-          <w:p>
-            <w:pPr>
-              <w:pStyle w:val="LumisTabela"/>
-            </w:pPr>
-            <w:r>
-              <w:t>Por time ligado ao Comercial. O registro do cliente confere</w:t>
-            </w:r>
-          </w:p>
-        </w:tc>
-        <w:tc>
-          <w:tcPr>
-            <w:tcW w:type="dxa" w:w="1587"/>
-          </w:tcPr>
-          <w:p>
-            <w:pPr>
-              <w:pStyle w:val="LumisTabela"/>
-            </w:pPr>
-            <w:r>
-              <w:t>Sim: revisão clínica e pauta do indicador 1</w:t>
-            </w:r>
-          </w:p>
-        </w:tc>
-        <w:tc>
-          <w:tcPr>
-            <w:tcW w:type="dxa" w:w="2041"/>
-          </w:tcPr>
-          <w:p>
-            <w:pPr>
-              <w:pStyle w:val="LumisTabela"/>
-            </w:pPr>
-            <w:r>
-              <w:t xml:space="preserve">Quem não reclama. Quem tem menos acesso tende a reclamar menos </w:t>
-            </w:r>
-            <w:r>
-              <w:rPr>
-                <w:rStyle w:val="TagHiptese"/>
-              </w:rPr>
-              <w:t>[hipótese]</w:t>
+              <w:t>Quem não reclama</w:t>
             </w:r>
           </w:p>
         </w:tc>
@@ -4438,6 +2817,48 @@
         </w:trPr>
         <w:tc>
           <w:tcPr>
+            <w:tcW w:type="dxa" w:w="1814"/>
+            <w:shd w:val="clear" w:color="auto" w:fill="F1F6F4"/>
+          </w:tcPr>
+          <w:p>
+            <w:pPr>
+              <w:pStyle w:val="LumisTabela"/>
+            </w:pPr>
+            <w:r>
+              <w:t>4. Incidentes: 2 de 4 descobertos pelo cliente</w:t>
+            </w:r>
+          </w:p>
+        </w:tc>
+        <w:tc>
+          <w:tcPr>
+            <w:tcW w:type="dxa" w:w="1814"/>
+            <w:shd w:val="clear" w:color="auto" w:fill="F1F6F4"/>
+          </w:tcPr>
+          <w:p>
+            <w:pPr>
+              <w:pStyle w:val="LumisTabela"/>
+            </w:pPr>
+            <w:r>
+              <w:t>Registro de incidentes e notificações dos clientes</w:t>
+            </w:r>
+          </w:p>
+        </w:tc>
+        <w:tc>
+          <w:tcPr>
+            <w:tcW w:type="dxa" w:w="1928"/>
+            <w:shd w:val="clear" w:color="auto" w:fill="F1F6F4"/>
+          </w:tcPr>
+          <w:p>
+            <w:pPr>
+              <w:pStyle w:val="LumisTabela"/>
+            </w:pPr>
+            <w:r>
+              <w:t>Head of AI Management. A DPO confere</w:t>
+            </w:r>
+          </w:p>
+        </w:tc>
+        <w:tc>
+          <w:tcPr>
             <w:tcW w:type="dxa" w:w="1587"/>
             <w:shd w:val="clear" w:color="auto" w:fill="F1F6F4"/>
           </w:tcPr>
@@ -4446,7 +2867,7 @@
               <w:pStyle w:val="LumisTabela"/>
             </w:pPr>
             <w:r>
-              <w:t>4. Incidentes</w:t>
+              <w:t>Sim: monitoramento e liberação</w:t>
             </w:r>
           </w:p>
         </w:tc>
@@ -4460,49 +2881,7 @@
               <w:pStyle w:val="LumisTabela"/>
             </w:pPr>
             <w:r>
-              <w:t>Registro de incidentes contra as notificações dos clientes</w:t>
-            </w:r>
-          </w:p>
-        </w:tc>
-        <w:tc>
-          <w:tcPr>
-            <w:tcW w:type="dxa" w:w="1928"/>
-            <w:shd w:val="clear" w:color="auto" w:fill="F1F6F4"/>
-          </w:tcPr>
-          <w:p>
-            <w:pPr>
-              <w:pStyle w:val="LumisTabela"/>
-            </w:pPr>
-            <w:r>
-              <w:t>Pelo Head of AI Management, que conduz os incidentes. A DPO confere</w:t>
-            </w:r>
-          </w:p>
-        </w:tc>
-        <w:tc>
-          <w:tcPr>
-            <w:tcW w:type="dxa" w:w="1587"/>
-            <w:shd w:val="clear" w:color="auto" w:fill="F1F6F4"/>
-          </w:tcPr>
-          <w:p>
-            <w:pPr>
-              <w:pStyle w:val="LumisTabela"/>
-            </w:pPr>
-            <w:r>
-              <w:t>Sim: monitoramento e liberação</w:t>
-            </w:r>
-          </w:p>
-        </w:tc>
-        <w:tc>
-          <w:tcPr>
-            <w:tcW w:type="dxa" w:w="2041"/>
-            <w:shd w:val="clear" w:color="auto" w:fill="F1F6F4"/>
-          </w:tcPr>
-          <w:p>
-            <w:pPr>
-              <w:pStyle w:val="LumisTabela"/>
-            </w:pPr>
-            <w:r>
-              <w:t>A gravidade e o grupo afetado; o incidente que ninguém viu</w:t>
+              <w:t>A gravidade e o incidente que ninguém viu</w:t>
             </w:r>
           </w:p>
         </w:tc>
@@ -4513,6 +2892,48 @@
         </w:trPr>
         <w:tc>
           <w:tcPr>
+            <w:tcW w:type="dxa" w:w="1814"/>
+          </w:tcPr>
+          <w:p>
+            <w:pPr>
+              <w:pStyle w:val="LumisTabela"/>
+              <w:keepNext/>
+            </w:pPr>
+            <w:r>
+              <w:t>5. Afirmações auditáveis: 0 de 5</w:t>
+            </w:r>
+          </w:p>
+        </w:tc>
+        <w:tc>
+          <w:tcPr>
+            <w:tcW w:type="dxa" w:w="1814"/>
+          </w:tcPr>
+          <w:p>
+            <w:pPr>
+              <w:pStyle w:val="LumisTabela"/>
+              <w:keepNext/>
+            </w:pPr>
+            <w:r>
+              <w:t>Material público contra checklist de relato</w:t>
+            </w:r>
+          </w:p>
+        </w:tc>
+        <w:tc>
+          <w:tcPr>
+            <w:tcW w:type="dxa" w:w="1928"/>
+          </w:tcPr>
+          <w:p>
+            <w:pPr>
+              <w:pStyle w:val="LumisTabela"/>
+              <w:keepNext/>
+            </w:pPr>
+            <w:r>
+              <w:t>Por quem não vende. Cliente ou auditor refaz</w:t>
+            </w:r>
+          </w:p>
+        </w:tc>
+        <w:tc>
+          <w:tcPr>
             <w:tcW w:type="dxa" w:w="1587"/>
           </w:tcPr>
           <w:p>
@@ -4521,7 +2942,7 @@
               <w:keepNext/>
             </w:pPr>
             <w:r>
-              <w:t>5. Afirmações auditáveis</w:t>
+              <w:t>Sim: publicar ou retirar</w:t>
             </w:r>
           </w:p>
         </w:tc>
@@ -4535,49 +2956,7 @@
               <w:keepNext/>
             </w:pPr>
             <w:r>
-              <w:t>Material público contra um checklist de relato de modelos clínicos</w:t>
-            </w:r>
-          </w:p>
-        </w:tc>
-        <w:tc>
-          <w:tcPr>
-            <w:tcW w:type="dxa" w:w="1928"/>
-          </w:tcPr>
-          <w:p>
-            <w:pPr>
-              <w:pStyle w:val="LumisTabela"/>
-              <w:keepNext/>
-            </w:pPr>
-            <w:r>
-              <w:t>Por quem não vende. Cliente ou auditor refaz o número</w:t>
-            </w:r>
-          </w:p>
-        </w:tc>
-        <w:tc>
-          <w:tcPr>
-            <w:tcW w:type="dxa" w:w="1587"/>
-          </w:tcPr>
-          <w:p>
-            <w:pPr>
-              <w:pStyle w:val="LumisTabela"/>
-              <w:keepNext/>
-            </w:pPr>
-            <w:r>
-              <w:t>Sim: publicar ou retirar</w:t>
-            </w:r>
-          </w:p>
-        </w:tc>
-        <w:tc>
-          <w:tcPr>
-            <w:tcW w:type="dxa" w:w="2041"/>
-          </w:tcPr>
-          <w:p>
-            <w:pPr>
-              <w:pStyle w:val="LumisTabela"/>
-              <w:keepNext/>
-            </w:pPr>
-            <w:r>
-              <w:t>Quem escolhe o recorte escolhe o grupo que aparece; os usos em seguros e bancos</w:t>
+              <w:t>O grupo que quem escolhe o recorte deixa de fora</w:t>
             </w:r>
           </w:p>
         </w:tc>
@@ -4588,7 +2967,7 @@
         <w:pStyle w:val="Legenda"/>
       </w:pPr>
       <w:r>
-        <w:t>Tabela A3. Fonte: análise da equipe sobre o Cap. 2, Quadros 7, 10, 13, 14 e 17.</w:t>
+        <w:t>Tabela A2. Fonte: análise da equipe sobre o Cap. 2, Quadros 7, 10, 13, 14 e 17.</w:t>
       </w:r>
     </w:p>
     <w:p>
@@ -4596,7 +2975,7 @@
         <w:pStyle w:val="Ttulo2"/>
       </w:pPr>
       <w:r>
-        <w:t>A4. As quatro perguntas aplicadas aos indicadores descartados</w:t>
+        <w:t>A3. As quatro perguntas aplicadas aos indicadores descartados</w:t>
       </w:r>
     </w:p>
     <w:tbl>
@@ -4615,9 +2994,9 @@
       <w:tblGrid>
         <w:gridCol w:w="1927"/>
         <w:gridCol w:w="1587"/>
+        <w:gridCol w:w="1814"/>
+        <w:gridCol w:w="2041"/>
         <w:gridCol w:w="1701"/>
-        <w:gridCol w:w="2041"/>
-        <w:gridCol w:w="1814"/>
       </w:tblGrid>
       <w:tr>
         <w:trPr>
@@ -4664,7 +3043,7 @@
         </w:tc>
         <w:tc>
           <w:tcPr>
-            <w:tcW w:type="dxa" w:w="1701"/>
+            <w:tcW w:type="dxa" w:w="1814"/>
             <w:shd w:val="clear" w:color="auto" w:fill="0F2D3A"/>
           </w:tcPr>
           <w:p>
@@ -4702,7 +3081,7 @@
         </w:tc>
         <w:tc>
           <w:tcPr>
-            <w:tcW w:type="dxa" w:w="1814"/>
+            <w:tcW w:type="dxa" w:w="1701"/>
             <w:shd w:val="clear" w:color="auto" w:fill="0F2D3A"/>
           </w:tcPr>
           <w:p>
@@ -4731,9 +3110,10 @@
           <w:p>
             <w:pPr>
               <w:pStyle w:val="LumisTabela"/>
-            </w:pPr>
-            <w:r>
-              <w:t>Acurácia global em campo (87,6%)</w:t>
+              <w:keepNext/>
+            </w:pPr>
+            <w:r>
+              <w:t>Acurácia global em campo</w:t>
             </w:r>
           </w:p>
         </w:tc>
@@ -4744,6 +3124,7 @@
           <w:p>
             <w:pPr>
               <w:pStyle w:val="LumisTabela"/>
+              <w:keepNext/>
             </w:pPr>
             <w:r>
               <w:t>Base completa</w:t>
@@ -4752,11 +3133,12 @@
         </w:tc>
         <w:tc>
           <w:tcPr>
-            <w:tcW w:type="dxa" w:w="1701"/>
-          </w:tcPr>
-          <w:p>
-            <w:pPr>
-              <w:pStyle w:val="LumisTabela"/>
+            <w:tcW w:type="dxa" w:w="1814"/>
+          </w:tcPr>
+          <w:p>
+            <w:pPr>
+              <w:pStyle w:val="LumisTabela"/>
+              <w:keepNext/>
             </w:pPr>
             <w:r>
               <w:rPr>
@@ -4773,22 +3155,24 @@
           <w:p>
             <w:pPr>
               <w:pStyle w:val="LumisTabela"/>
-            </w:pPr>
-            <w:r>
-              <w:t>Pouco. Descartado</w:t>
-            </w:r>
-          </w:p>
-        </w:tc>
-        <w:tc>
-          <w:tcPr>
-            <w:tcW w:type="dxa" w:w="1814"/>
-          </w:tcPr>
-          <w:p>
-            <w:pPr>
-              <w:pStyle w:val="LumisTabela"/>
-            </w:pPr>
-            <w:r>
-              <w:t>O falso negativo e os subgrupos</w:t>
+              <w:keepNext/>
+            </w:pPr>
+            <w:r>
+              <w:t>Pouco</w:t>
+            </w:r>
+          </w:p>
+        </w:tc>
+        <w:tc>
+          <w:tcPr>
+            <w:tcW w:type="dxa" w:w="1701"/>
+          </w:tcPr>
+          <w:p>
+            <w:pPr>
+              <w:pStyle w:val="LumisTabela"/>
+              <w:keepNext/>
+            </w:pPr>
+            <w:r>
+              <w:t>O erro grave e os grupos</w:t>
             </w:r>
           </w:p>
         </w:tc>
@@ -4805,9 +3189,10 @@
           <w:p>
             <w:pPr>
               <w:pStyle w:val="LumisTabela"/>
-            </w:pPr>
-            <w:r>
-              <w:t>Comparação com a versão aprovada (indicador 2 da v1)</w:t>
+              <w:keepNext/>
+            </w:pPr>
+            <w:r>
+              <w:t>Comparação com a versão aprovada</w:t>
             </w:r>
           </w:p>
         </w:tc>
@@ -4819,9 +3204,40 @@
           <w:p>
             <w:pPr>
               <w:pStyle w:val="LumisTabela"/>
+              <w:keepNext/>
             </w:pPr>
             <w:r>
               <w:t>Troca de versão</w:t>
+            </w:r>
+          </w:p>
+        </w:tc>
+        <w:tc>
+          <w:tcPr>
+            <w:tcW w:type="dxa" w:w="1814"/>
+            <w:shd w:val="clear" w:color="auto" w:fill="F1F6F4"/>
+          </w:tcPr>
+          <w:p>
+            <w:pPr>
+              <w:pStyle w:val="LumisTabela"/>
+              <w:keepNext/>
+            </w:pPr>
+            <w:r>
+              <w:t>Pelo CTO, que também libera a versão</w:t>
+            </w:r>
+          </w:p>
+        </w:tc>
+        <w:tc>
+          <w:tcPr>
+            <w:tcW w:type="dxa" w:w="2041"/>
+            <w:shd w:val="clear" w:color="auto" w:fill="F1F6F4"/>
+          </w:tcPr>
+          <w:p>
+            <w:pPr>
+              <w:pStyle w:val="LumisTabela"/>
+              <w:keepNext/>
+            </w:pPr>
+            <w:r>
+              <w:t>Repete o indicador 1 e vira a regra de liberação dele</w:t>
             </w:r>
           </w:p>
         </w:tc>
@@ -4833,34 +3249,7 @@
           <w:p>
             <w:pPr>
               <w:pStyle w:val="LumisTabela"/>
-            </w:pPr>
-            <w:r>
-              <w:t>Pelo CTO, que também libera a versão</w:t>
-            </w:r>
-          </w:p>
-        </w:tc>
-        <w:tc>
-          <w:tcPr>
-            <w:tcW w:type="dxa" w:w="2041"/>
-            <w:shd w:val="clear" w:color="auto" w:fill="F1F6F4"/>
-          </w:tcPr>
-          <w:p>
-            <w:pPr>
-              <w:pStyle w:val="LumisTabela"/>
-            </w:pPr>
-            <w:r>
-              <w:t>Sim, mas repete o indicador 1. Vira a regra de liberação dele</w:t>
-            </w:r>
-          </w:p>
-        </w:tc>
-        <w:tc>
-          <w:tcPr>
-            <w:tcW w:type="dxa" w:w="1814"/>
-            <w:shd w:val="clear" w:color="auto" w:fill="F1F6F4"/>
-          </w:tcPr>
-          <w:p>
-            <w:pPr>
-              <w:pStyle w:val="LumisTabela"/>
+              <w:keepNext/>
             </w:pPr>
             <w:r>
               <w:t>O mesmo que o indicador 1</w:t>
@@ -4879,9 +3268,10 @@
           <w:p>
             <w:pPr>
               <w:pStyle w:val="LumisTabela"/>
-            </w:pPr>
-            <w:r>
-              <w:t>Disponibilidade de ponta a ponta (indicador 4 da v1)</w:t>
+              <w:keepNext/>
+            </w:pPr>
+            <w:r>
+              <w:t>Disponibilidade de ponta a ponta</w:t>
             </w:r>
           </w:p>
         </w:tc>
@@ -4892,9 +3282,38 @@
           <w:p>
             <w:pPr>
               <w:pStyle w:val="LumisTabela"/>
-            </w:pPr>
-            <w:r>
-              <w:t>Cadeia técnica completa</w:t>
+              <w:keepNext/>
+            </w:pPr>
+            <w:r>
+              <w:t>Cadeia técnica</w:t>
+            </w:r>
+          </w:p>
+        </w:tc>
+        <w:tc>
+          <w:tcPr>
+            <w:tcW w:type="dxa" w:w="1814"/>
+          </w:tcPr>
+          <w:p>
+            <w:pPr>
+              <w:pStyle w:val="LumisTabela"/>
+              <w:keepNext/>
+            </w:pPr>
+            <w:r>
+              <w:t>Pelo CTO</w:t>
+            </w:r>
+          </w:p>
+        </w:tc>
+        <w:tc>
+          <w:tcPr>
+            <w:tcW w:type="dxa" w:w="2041"/>
+          </w:tcPr>
+          <w:p>
+            <w:pPr>
+              <w:pStyle w:val="LumisTabela"/>
+              <w:keepNext/>
+            </w:pPr>
+            <w:r>
+              <w:t>Decisão técnica, que não chega ao conselho</w:t>
             </w:r>
           </w:p>
         </w:tc>
@@ -4905,41 +3324,10 @@
           <w:p>
             <w:pPr>
               <w:pStyle w:val="LumisTabela"/>
-            </w:pPr>
-            <w:r>
-              <w:t xml:space="preserve">Pelo CTO </w:t>
-            </w:r>
-            <w:r>
-              <w:rPr>
-                <w:rStyle w:val="TagHiptese"/>
-              </w:rPr>
-              <w:t>[hipótese]</w:t>
-            </w:r>
-          </w:p>
-        </w:tc>
-        <w:tc>
-          <w:tcPr>
-            <w:tcW w:type="dxa" w:w="2041"/>
-          </w:tcPr>
-          <w:p>
-            <w:pPr>
-              <w:pStyle w:val="LumisTabela"/>
-            </w:pPr>
-            <w:r>
-              <w:t>Decisão operacional, que não chega ao conselho. Segue como meta técnica</w:t>
-            </w:r>
-          </w:p>
-        </w:tc>
-        <w:tc>
-          <w:tcPr>
-            <w:tcW w:type="dxa" w:w="1814"/>
-          </w:tcPr>
-          <w:p>
-            <w:pPr>
-              <w:pStyle w:val="LumisTabela"/>
-            </w:pPr>
-            <w:r>
-              <w:t>Não tem abertura útil para equidade</w:t>
+              <w:keepNext/>
+            </w:pPr>
+            <w:r>
+              <w:t>Não abre por grupo</w:t>
             </w:r>
           </w:p>
         </w:tc>
@@ -4956,6 +3344,7 @@
           <w:p>
             <w:pPr>
               <w:pStyle w:val="LumisTabela"/>
+              <w:keepNext/>
             </w:pPr>
             <w:r>
               <w:t>Auditorias contratuais concluídas</w:t>
@@ -4970,9 +3359,40 @@
           <w:p>
             <w:pPr>
               <w:pStyle w:val="LumisTabela"/>
+              <w:keepNext/>
             </w:pPr>
             <w:r>
               <w:t>Número de auditorias</w:t>
+            </w:r>
+          </w:p>
+        </w:tc>
+        <w:tc>
+          <w:tcPr>
+            <w:tcW w:type="dxa" w:w="1814"/>
+            <w:shd w:val="clear" w:color="auto" w:fill="F1F6F4"/>
+          </w:tcPr>
+          <w:p>
+            <w:pPr>
+              <w:pStyle w:val="LumisTabela"/>
+              <w:keepNext/>
+            </w:pPr>
+            <w:r>
+              <w:t>Pela DPO</w:t>
+            </w:r>
+          </w:p>
+        </w:tc>
+        <w:tc>
+          <w:tcPr>
+            <w:tcW w:type="dxa" w:w="2041"/>
+            <w:shd w:val="clear" w:color="auto" w:fill="F1F6F4"/>
+          </w:tcPr>
+          <w:p>
+            <w:pPr>
+              <w:pStyle w:val="LumisTabela"/>
+              <w:keepNext/>
+            </w:pPr>
+            <w:r>
+              <w:t>Não. Mede atividade</w:t>
             </w:r>
           </w:p>
         </w:tc>
@@ -4984,43 +3404,10 @@
           <w:p>
             <w:pPr>
               <w:pStyle w:val="LumisTabela"/>
-            </w:pPr>
-            <w:r>
-              <w:t xml:space="preserve">Pela DPO </w:t>
-            </w:r>
-            <w:r>
-              <w:rPr>
-                <w:rStyle w:val="TagHiptese"/>
-              </w:rPr>
-              <w:t>[hipótese]</w:t>
-            </w:r>
-          </w:p>
-        </w:tc>
-        <w:tc>
-          <w:tcPr>
-            <w:tcW w:type="dxa" w:w="2041"/>
-            <w:shd w:val="clear" w:color="auto" w:fill="F1F6F4"/>
-          </w:tcPr>
-          <w:p>
-            <w:pPr>
-              <w:pStyle w:val="LumisTabela"/>
-            </w:pPr>
-            <w:r>
-              <w:t>Não. Mede atividade. O indicador 2 mede registros</w:t>
-            </w:r>
-          </w:p>
-        </w:tc>
-        <w:tc>
-          <w:tcPr>
-            <w:tcW w:type="dxa" w:w="1814"/>
-            <w:shd w:val="clear" w:color="auto" w:fill="F1F6F4"/>
-          </w:tcPr>
-          <w:p>
-            <w:pPr>
-              <w:pStyle w:val="LumisTabela"/>
-            </w:pPr>
-            <w:r>
-              <w:t>O volume de registros afetados</w:t>
+              <w:keepNext/>
+            </w:pPr>
+            <w:r>
+              <w:t>Quantos registros estão afetados</w:t>
             </w:r>
           </w:p>
         </w:tc>
@@ -5036,6 +3423,7 @@
           <w:p>
             <w:pPr>
               <w:pStyle w:val="LumisTabela"/>
+              <w:keepNext/>
             </w:pPr>
             <w:r>
               <w:t>Pacientes únicos analisados</w:t>
@@ -5049,6 +3437,7 @@
           <w:p>
             <w:pPr>
               <w:pStyle w:val="LumisTabela"/>
+              <w:keepNext/>
             </w:pPr>
             <w:r>
               <w:t>Base sem duplicidade</w:t>
@@ -5057,132 +3446,43 @@
         </w:tc>
         <w:tc>
           <w:tcPr>
+            <w:tcW w:type="dxa" w:w="1814"/>
+          </w:tcPr>
+          <w:p>
+            <w:pPr>
+              <w:pStyle w:val="LumisTabela"/>
+              <w:keepNext/>
+            </w:pPr>
+            <w:r>
+              <w:t>Pela área de Dados</w:t>
+            </w:r>
+          </w:p>
+        </w:tc>
+        <w:tc>
+          <w:tcPr>
+            <w:tcW w:type="dxa" w:w="2041"/>
+          </w:tcPr>
+          <w:p>
+            <w:pPr>
+              <w:pStyle w:val="LumisTabela"/>
+              <w:keepNext/>
+            </w:pPr>
+            <w:r>
+              <w:t>Não. É volume</w:t>
+            </w:r>
+          </w:p>
+        </w:tc>
+        <w:tc>
+          <w:tcPr>
             <w:tcW w:type="dxa" w:w="1701"/>
           </w:tcPr>
           <w:p>
             <w:pPr>
               <w:pStyle w:val="LumisTabela"/>
-            </w:pPr>
-            <w:r>
-              <w:t xml:space="preserve">Pela área de Dados </w:t>
-            </w:r>
-            <w:r>
-              <w:rPr>
-                <w:rStyle w:val="TagHiptese"/>
-              </w:rPr>
-              <w:t>[hipótese]</w:t>
-            </w:r>
-          </w:p>
-        </w:tc>
-        <w:tc>
-          <w:tcPr>
-            <w:tcW w:type="dxa" w:w="2041"/>
-          </w:tcPr>
-          <w:p>
-            <w:pPr>
-              <w:pStyle w:val="LumisTabela"/>
-            </w:pPr>
-            <w:r>
-              <w:t>Não. É volume</w:t>
-            </w:r>
-          </w:p>
-        </w:tc>
-        <w:tc>
-          <w:tcPr>
-            <w:tcW w:type="dxa" w:w="1814"/>
-          </w:tcPr>
-          <w:p>
-            <w:pPr>
-              <w:pStyle w:val="LumisTabela"/>
+              <w:keepNext/>
             </w:pPr>
             <w:r>
               <w:t>Quem foi mal atendido</w:t>
-            </w:r>
-          </w:p>
-        </w:tc>
-      </w:tr>
-      <w:tr>
-        <w:trPr>
-          <w:cantSplit/>
-        </w:trPr>
-        <w:tc>
-          <w:tcPr>
-            <w:tcW w:type="dxa" w:w="1928"/>
-            <w:shd w:val="clear" w:color="auto" w:fill="F1F6F4"/>
-          </w:tcPr>
-          <w:p>
-            <w:pPr>
-              <w:pStyle w:val="LumisTabela"/>
-              <w:keepNext/>
-            </w:pPr>
-            <w:r>
-              <w:t>Discordância do revisor humano</w:t>
-            </w:r>
-          </w:p>
-        </w:tc>
-        <w:tc>
-          <w:tcPr>
-            <w:tcW w:type="dxa" w:w="1587"/>
-            <w:shd w:val="clear" w:color="auto" w:fill="F1F6F4"/>
-          </w:tcPr>
-          <w:p>
-            <w:pPr>
-              <w:pStyle w:val="LumisTabela"/>
-              <w:keepNext/>
-            </w:pPr>
-            <w:r>
-              <w:t>Amostra de revisão</w:t>
-            </w:r>
-          </w:p>
-        </w:tc>
-        <w:tc>
-          <w:tcPr>
-            <w:tcW w:type="dxa" w:w="1701"/>
-            <w:shd w:val="clear" w:color="auto" w:fill="F1F6F4"/>
-          </w:tcPr>
-          <w:p>
-            <w:pPr>
-              <w:pStyle w:val="LumisTabela"/>
-              <w:keepNext/>
-            </w:pPr>
-            <w:r>
-              <w:t xml:space="preserve">Quem executa a revisão </w:t>
-            </w:r>
-            <w:r>
-              <w:rPr>
-                <w:rStyle w:val="TagNoconsta"/>
-              </w:rPr>
-              <w:t>[não consta]</w:t>
-            </w:r>
-          </w:p>
-        </w:tc>
-        <w:tc>
-          <w:tcPr>
-            <w:tcW w:type="dxa" w:w="2041"/>
-            <w:shd w:val="clear" w:color="auto" w:fill="F1F6F4"/>
-          </w:tcPr>
-          <w:p>
-            <w:pPr>
-              <w:pStyle w:val="LumisTabela"/>
-              <w:keepNext/>
-            </w:pPr>
-            <w:r>
-              <w:t>Alimenta o indicador 1 e vira a fonte dele</w:t>
-            </w:r>
-          </w:p>
-        </w:tc>
-        <w:tc>
-          <w:tcPr>
-            <w:tcW w:type="dxa" w:w="1814"/>
-            <w:shd w:val="clear" w:color="auto" w:fill="F1F6F4"/>
-          </w:tcPr>
-          <w:p>
-            <w:pPr>
-              <w:pStyle w:val="LumisTabela"/>
-              <w:keepNext/>
-            </w:pPr>
-            <w:r>
-              <w:t>Depende do tamanho da amostra por grupo</w:t>
             </w:r>
           </w:p>
         </w:tc>
@@ -5193,177 +3493,7 @@
         <w:pStyle w:val="Legenda"/>
       </w:pPr>
       <w:r>
-        <w:t>Tabela A4. Fonte: análise da equipe sobre o Cap. 2, Quadros 9, 11 e 13 e a v1 do colega.</w:t>
-      </w:r>
-    </w:p>
-    <w:p>
-      <w:pPr>
-        <w:pStyle w:val="Ttulo2"/>
-      </w:pPr>
-      <w:r>
-        <w:t>A5. Contas de conferência</w:t>
-      </w:r>
-    </w:p>
-    <w:p>
-      <w:pPr>
-        <w:pStyle w:val="Commarcadores"/>
-      </w:pPr>
-      <w:r>
-        <w:t xml:space="preserve">Base: 5,9 mi de clientes + 14,0 mi do DATASUS + 2,1 mi sintéticos = 22,0 mi. Clientes: 1,2 + 3,4 + 0,89 + 0,41 = 5,9 mi </w:t>
-      </w:r>
-      <w:r>
-        <w:rPr>
-          <w:rStyle w:val="TagFonte"/>
-        </w:rPr>
-        <w:t>[fonte: conta da equipe sobre o Quadro 7]</w:t>
-      </w:r>
-      <w:r>
-        <w:t>.</w:t>
-      </w:r>
-    </w:p>
-    <w:p>
-      <w:pPr>
-        <w:pStyle w:val="Commarcadores"/>
-      </w:pPr>
-      <w:r>
-        <w:t>Autorização frágil: (1,2 + 0,89) ÷ 5,9 = 35,4%. Autorização expressa: (3,4 + 0,41) ÷ 5,9 = 64,6%. Sanare: 3,4 ÷ 5,9 = 57,6%.</w:t>
-      </w:r>
-    </w:p>
-    <w:p>
-      <w:pPr>
-        <w:pStyle w:val="Commarcadores"/>
-      </w:pPr>
-      <w:r>
-        <w:t>O falso negativo médio, ponderado pela participação de cada grupo no Quadro 10, dá 17,65%, coerente com os 17,7% do Quadro 9. A validação de 2023 equivale a 2,5% da amostra de campo de um semestre.</w:t>
-      </w:r>
-    </w:p>
-    <w:p>
-      <w:pPr>
-        <w:pStyle w:val="Commarcadores"/>
-      </w:pPr>
-      <w:r>
-        <w:t xml:space="preserve">Reclamações: participação nas reclamações dividida pela participação na base. D/E (47 ÷ 74) ÷ 25% = 2,54; C (19 ÷ 74) ÷ 41% = 0,63; A/B (8 ÷ 74) ÷ 34% = 0,32 </w:t>
-      </w:r>
-      <w:r>
-        <w:rPr>
-          <w:rStyle w:val="TagFonte"/>
-        </w:rPr>
-        <w:t>[fonte: conta da equipe sobre o Quadro 17]</w:t>
-      </w:r>
-      <w:r>
-        <w:t>.</w:t>
-      </w:r>
-    </w:p>
-    <w:p>
-      <w:pPr>
-        <w:pStyle w:val="Commarcadores"/>
-      </w:pPr>
-      <w:r>
-        <w:t xml:space="preserve">Restrição recomendada: 24% de 640 mil = cerca de 154 mil decisões por mês. Revisão: 10% de 179 mil (grupos no nível 1) + 2% de 307 mil (demais) = cerca de 24 mil por mês </w:t>
-      </w:r>
-      <w:r>
-        <w:rPr>
-          <w:rStyle w:val="TagHiptese"/>
-        </w:rPr>
-        <w:t>[hipótese: decisões distribuídas como a base]</w:t>
-      </w:r>
-      <w:r>
-        <w:t>.</w:t>
-      </w:r>
-    </w:p>
-    <w:p>
-      <w:pPr>
-        <w:pStyle w:val="Commarcadores"/>
-      </w:pPr>
-      <w:r>
-        <w:t xml:space="preserve">Amostra do indicador 1, com 10% dos casos precisando de prioridade </w:t>
-      </w:r>
-      <w:r>
-        <w:rPr>
-          <w:rStyle w:val="TagHiptese"/>
-        </w:rPr>
-        <w:t>[hipótese]</w:t>
-      </w:r>
-      <w:r>
-        <w:t>: grupo 60+ D/E = 64 mil decisões por mês; com 2% de revisão, 1.280 revisões e 128 casos a priorizar por mês (64 por quinzena); com 10%, 640 por mês (320 por quinzena).</w:t>
-      </w:r>
-    </w:p>
-    <w:p>
-      <w:pPr>
-        <w:pStyle w:val="Ttulo2"/>
-      </w:pPr>
-      <w:r>
-        <w:t>A6. Divergências e o que não consta</w:t>
-      </w:r>
-    </w:p>
-    <w:p>
-      <w:pPr>
-        <w:pStyle w:val="Commarcadores"/>
-      </w:pPr>
-      <w:r>
-        <w:rPr>
-          <w:b/>
-        </w:rPr>
-        <w:t>Divergência no Cap. 2:</w:t>
-      </w:r>
-      <w:r>
-        <w:t xml:space="preserve"> "três" contratos com cláusula não relida (seção 1.2) contra "dois" (Quadro 5). Seguimos o Quadro 7.</w:t>
-      </w:r>
-    </w:p>
-    <w:p>
-      <w:pPr>
-        <w:pStyle w:val="Commarcadores"/>
-      </w:pPr>
-      <w:r>
-        <w:rPr>
-          <w:b/>
-        </w:rPr>
-        <w:t>Divergência no Cap. 2:</w:t>
-      </w:r>
-      <w:r>
-        <w:t xml:space="preserve"> dados e contrato anteriores à fundação da empresa em 2022 (Quadros 3 e 7).</w:t>
-      </w:r>
-    </w:p>
-    <w:p>
-      <w:pPr>
-        <w:pStyle w:val="Commarcadores"/>
-      </w:pPr>
-      <w:r>
-        <w:rPr>
-          <w:b/>
-        </w:rPr>
-        <w:t>Divergência no Cap. 2:</w:t>
-      </w:r>
-      <w:r>
-        <w:t xml:space="preserve"> a acurácia ponderada pelo Quadro 10 dá 87,2%, e o Quadro 9 mostra 87,6%. O campo tem cerca de 323 mil registros por mês, e o Quadro 12 fala em 640 mil decisões por mês.</w:t>
-      </w:r>
-    </w:p>
-    <w:p>
-      <w:pPr>
-        <w:pStyle w:val="Commarcadores"/>
-      </w:pPr>
-      <w:r>
-        <w:rPr>
-          <w:b/>
-        </w:rPr>
-        <w:t>Não consta no caso:</w:t>
-      </w:r>
-      <w:r>
-        <w:t xml:space="preserve"> se as outras 34 contas fornecem dados para treino; quem consta como responsável pelos dados em cada contrato; se a Prisma é operadora de plano de saúde; se o fim do contrato obriga a retirar os dados do treino e quanto custa retreinar.</w:t>
-      </w:r>
-    </w:p>
-    <w:p>
-      <w:pPr>
-        <w:pStyle w:val="Commarcadores"/>
-      </w:pPr>
-      <w:r>
-        <w:rPr>
-          <w:b/>
-        </w:rPr>
-        <w:t>Não consta no caso:</w:t>
-      </w:r>
-      <w:r>
-        <w:t xml:space="preserve"> quem apurou a validação de 2023 e a linha de campo; a proporção de casos que precisam de prioridade; o número de pessoas únicas; quem executa a revisão de 2%; quem reclamou; o desempenho por subgrupo em seguradoras e bancos; a carga de cada hospital e a receita afetada pela restrição.</w:t>
+        <w:t>Tabela A3. Fonte: análise da equipe sobre o Cap. 2, Quadros 9, 11 e 13.</w:t>
       </w:r>
     </w:p>
     <w:sectPr>

</xml_diff>

<commit_message>
F2-E2 v2 enxuta para o documento único, com figuras, e versões anteriores no histórico
Co-Authored-By: Claude Opus 5.5 <noreply@anthropic.com>
</commit_message>
<xml_diff>
--- a/02_Fase2_O_Mercado/F2-E2_Auditoria_do_Ativo/F2-E2_Auditoria_do_Ativo_v2.docx
+++ b/02_Fase2_O_Mercado/F2-E2_Auditoria_do_Ativo/F2-E2_Auditoria_do_Ativo_v2.docx
@@ -44,24 +44,6 @@
       </w:r>
     </w:p>
     <w:p>
-      <w:pPr/>
-      <w:r>
-        <w:t>Um terço dos dados de clientes vem de contratos que não autorizam com clareza o treino do modelo, e nenhum contrato de dados foi revisado pelo jurídico. Em campo, de cada 10 idosos de CEP D/E que precisavam de prioridade, 3 ficaram para trás, e quem descobriu foi o hospital. Nenhuma das cinco afirmações que a Lumis divulga ao mercado resiste a uma auditoria do jeito que é divulgada.</w:t>
-      </w:r>
-    </w:p>
-    <w:p>
-      <w:pPr/>
-      <w:r>
-        <w:rPr>
-          <w:b/>
-        </w:rPr>
-        <w:t>Pedido ao conselho:</w:t>
-      </w:r>
-      <w:r>
-        <w:t xml:space="preserve"> Restringir a recomendação automática para pacientes com 60 anos ou mais de CEP C e D/E, com o custo descrito na seção 5. E tirar do material comercial os números que não se sustentam.</w:t>
-      </w:r>
-    </w:p>
-    <w:p>
       <w:pPr>
         <w:pStyle w:val="Ttulo1"/>
       </w:pPr>
@@ -70,431 +52,51 @@
       </w:r>
     </w:p>
     <w:p>
-      <w:pPr/>
+      <w:pPr>
+        <w:keepNext/>
+        <w:jc w:val="center"/>
+      </w:pPr>
       <w:r>
-        <w:t>Dois terços da base são do DATASUS, que é público e está aberto a qualquer concorrente. O que só a Lumis tem são os dados de clientes, pouco mais de um quarto da base, e é nessa parte que estão os problemas.</w:t>
+        <w:drawing>
+          <wp:inline xmlns:a="http://schemas.openxmlformats.org/drawingml/2006/main" xmlns:pic="http://schemas.openxmlformats.org/drawingml/2006/picture">
+            <wp:extent cx="5760000" cy="1753701"/>
+            <wp:docPr id="1" name="Picture 1"/>
+            <wp:cNvGraphicFramePr>
+              <a:graphicFrameLocks noChangeAspect="1"/>
+            </wp:cNvGraphicFramePr>
+            <a:graphic>
+              <a:graphicData uri="http://schemas.openxmlformats.org/drawingml/2006/picture">
+                <pic:pic>
+                  <pic:nvPicPr>
+                    <pic:cNvPr id="0" name="v2_fig1_base.png"/>
+                    <pic:cNvPicPr/>
+                  </pic:nvPicPr>
+                  <pic:blipFill>
+                    <a:blip r:embed="rId18"/>
+                    <a:stretch>
+                      <a:fillRect/>
+                    </a:stretch>
+                  </pic:blipFill>
+                  <pic:spPr>
+                    <a:xfrm>
+                      <a:off x="0" y="0"/>
+                      <a:ext cx="5760000" cy="1753701"/>
+                    </a:xfrm>
+                    <a:prstGeom prst="rect"/>
+                  </pic:spPr>
+                </pic:pic>
+              </a:graphicData>
+            </a:graphic>
+          </wp:inline>
+        </w:drawing>
       </w:r>
     </w:p>
-    <w:tbl>
-      <w:tblPr>
-        <w:tblW w:type="auto" w:w="0"/>
-        <w:jc w:val="center"/>
-        <w:tblLayout w:type="fixed"/>
-        <w:tblLook w:firstColumn="1" w:firstRow="1" w:lastColumn="0" w:lastRow="0" w:noHBand="0" w:noVBand="1" w:val="04A0"/>
-        <w:tblBorders>
-          <w:top w:val="single" w:sz="4" w:color="D3DEDB"/>
-          <w:bottom w:val="single" w:sz="4" w:color="D3DEDB"/>
-          <w:insideH w:val="single" w:sz="4" w:color="D3DEDB"/>
-        </w:tblBorders>
-        <w:tblLayout w:type="fixed"/>
-      </w:tblPr>
-      <w:tblGrid>
-        <w:gridCol w:w="1927"/>
-        <w:gridCol w:w="2835"/>
-        <w:gridCol w:w="1134"/>
-        <w:gridCol w:w="3175"/>
-      </w:tblGrid>
-      <w:tr>
-        <w:trPr>
-          <w:tblHeader w:val="true"/>
-          <w:cantSplit/>
-        </w:trPr>
-        <w:tc>
-          <w:tcPr>
-            <w:tcW w:type="dxa" w:w="1928"/>
-            <w:shd w:val="clear" w:color="auto" w:fill="0F2D3A"/>
-          </w:tcPr>
-          <w:p>
-            <w:pPr>
-              <w:pStyle w:val="LumisTabela"/>
-              <w:keepNext/>
-            </w:pPr>
-            <w:r>
-              <w:rPr>
-                <w:b/>
-                <w:color w:val="FFFFFF"/>
-              </w:rPr>
-              <w:t>Fonte</w:t>
-            </w:r>
-          </w:p>
-        </w:tc>
-        <w:tc>
-          <w:tcPr>
-            <w:tcW w:type="dxa" w:w="2835"/>
-            <w:shd w:val="clear" w:color="auto" w:fill="0F2D3A"/>
-          </w:tcPr>
-          <w:p>
-            <w:pPr>
-              <w:pStyle w:val="LumisTabela"/>
-              <w:keepNext/>
-            </w:pPr>
-            <w:r>
-              <w:rPr>
-                <w:b/>
-                <w:color w:val="FFFFFF"/>
-              </w:rPr>
-              <w:t>O que o contrato diz sobre treino</w:t>
-            </w:r>
-          </w:p>
-        </w:tc>
-        <w:tc>
-          <w:tcPr>
-            <w:tcW w:type="dxa" w:w="1134"/>
-            <w:shd w:val="clear" w:color="auto" w:fill="0F2D3A"/>
-          </w:tcPr>
-          <w:p>
-            <w:pPr>
-              <w:pStyle w:val="LumisTabela"/>
-              <w:keepNext/>
-            </w:pPr>
-            <w:r>
-              <w:rPr>
-                <w:b/>
-                <w:color w:val="FFFFFF"/>
-              </w:rPr>
-              <w:t>Vence</w:t>
-            </w:r>
-          </w:p>
-        </w:tc>
-        <w:tc>
-          <w:tcPr>
-            <w:tcW w:type="dxa" w:w="3175"/>
-            <w:shd w:val="clear" w:color="auto" w:fill="0F2D3A"/>
-          </w:tcPr>
-          <w:p>
-            <w:pPr>
-              <w:pStyle w:val="LumisTabela"/>
-              <w:keepNext/>
-            </w:pPr>
-            <w:r>
-              <w:rPr>
-                <w:b/>
-                <w:color w:val="FFFFFF"/>
-              </w:rPr>
-              <w:t>Leitura da equipe</w:t>
-            </w:r>
-          </w:p>
-        </w:tc>
-      </w:tr>
-      <w:tr>
-        <w:trPr>
-          <w:cantSplit/>
-        </w:trPr>
-        <w:tc>
-          <w:tcPr>
-            <w:tcW w:type="dxa" w:w="1928"/>
-          </w:tcPr>
-          <w:p>
-            <w:pPr>
-              <w:pStyle w:val="LumisTabela"/>
-            </w:pPr>
-            <w:r>
-              <w:rPr>
-                <w:b/>
-              </w:rPr>
-              <w:t>Seguradora Prisma</w:t>
-            </w:r>
-          </w:p>
-        </w:tc>
-        <w:tc>
-          <w:tcPr>
-            <w:tcW w:type="dxa" w:w="2835"/>
-          </w:tcPr>
-          <w:p>
-            <w:pPr>
-              <w:pStyle w:val="LumisTabela"/>
-            </w:pPr>
-            <w:r>
-              <w:t>Nada (contrato silente)</w:t>
-            </w:r>
-          </w:p>
-        </w:tc>
-        <w:tc>
-          <w:tcPr>
-            <w:tcW w:type="dxa" w:w="1134"/>
-          </w:tcPr>
-          <w:p>
-            <w:pPr>
-              <w:pStyle w:val="LumisTabela"/>
-            </w:pPr>
-            <w:r>
-              <w:t>12/2026</w:t>
-            </w:r>
-          </w:p>
-        </w:tc>
-        <w:tc>
-          <w:tcPr>
-            <w:tcW w:type="dxa" w:w="3175"/>
-          </w:tcPr>
-          <w:p>
-            <w:pPr>
-              <w:pStyle w:val="LumisTabela"/>
-            </w:pPr>
-            <w:r>
-              <w:t>Sem autorização. Vence em menos de três meses</w:t>
-            </w:r>
-          </w:p>
-        </w:tc>
-      </w:tr>
-      <w:tr>
-        <w:trPr>
-          <w:cantSplit/>
-        </w:trPr>
-        <w:tc>
-          <w:tcPr>
-            <w:tcW w:type="dxa" w:w="1928"/>
-            <w:shd w:val="clear" w:color="auto" w:fill="F1F6F4"/>
-          </w:tcPr>
-          <w:p>
-            <w:pPr>
-              <w:pStyle w:val="LumisTabela"/>
-            </w:pPr>
-            <w:r>
-              <w:rPr>
-                <w:b/>
-              </w:rPr>
-              <w:t>Hospital Vila Ipê</w:t>
-            </w:r>
-          </w:p>
-        </w:tc>
-        <w:tc>
-          <w:tcPr>
-            <w:tcW w:type="dxa" w:w="2835"/>
-            <w:shd w:val="clear" w:color="auto" w:fill="F1F6F4"/>
-          </w:tcPr>
-          <w:p>
-            <w:pPr>
-              <w:pStyle w:val="LumisTabela"/>
-            </w:pPr>
-            <w:r>
-              <w:t>Cláusula genérica: "melhoria contínua do serviço"</w:t>
-            </w:r>
-          </w:p>
-        </w:tc>
-        <w:tc>
-          <w:tcPr>
-            <w:tcW w:type="dxa" w:w="1134"/>
-            <w:shd w:val="clear" w:color="auto" w:fill="F1F6F4"/>
-          </w:tcPr>
-          <w:p>
-            <w:pPr>
-              <w:pStyle w:val="LumisTabela"/>
-            </w:pPr>
-            <w:r>
-              <w:t>03/2027</w:t>
-            </w:r>
-          </w:p>
-        </w:tc>
-        <w:tc>
-          <w:tcPr>
-            <w:tcW w:type="dxa" w:w="3175"/>
-            <w:shd w:val="clear" w:color="auto" w:fill="F1F6F4"/>
-          </w:tcPr>
-          <w:p>
-            <w:pPr>
-              <w:pStyle w:val="LumisTabela"/>
-            </w:pPr>
-            <w:r>
-              <w:t>Autorização frágil. É também o hospital que notificou o viés</w:t>
-            </w:r>
-          </w:p>
-        </w:tc>
-      </w:tr>
-      <w:tr>
-        <w:trPr>
-          <w:cantSplit/>
-        </w:trPr>
-        <w:tc>
-          <w:tcPr>
-            <w:tcW w:type="dxa" w:w="1928"/>
-          </w:tcPr>
-          <w:p>
-            <w:pPr>
-              <w:pStyle w:val="LumisTabela"/>
-            </w:pPr>
-            <w:r>
-              <w:rPr>
-                <w:b/>
-              </w:rPr>
-              <w:t>Rede Sanare</w:t>
-            </w:r>
-          </w:p>
-        </w:tc>
-        <w:tc>
-          <w:tcPr>
-            <w:tcW w:type="dxa" w:w="2835"/>
-          </w:tcPr>
-          <w:p>
-            <w:pPr>
-              <w:pStyle w:val="LumisTabela"/>
-            </w:pPr>
-            <w:r>
-              <w:t>Sim, para uso agregado e anonimizado</w:t>
-            </w:r>
-          </w:p>
-        </w:tc>
-        <w:tc>
-          <w:tcPr>
-            <w:tcW w:type="dxa" w:w="1134"/>
-          </w:tcPr>
-          <w:p>
-            <w:pPr>
-              <w:pStyle w:val="LumisTabela"/>
-            </w:pPr>
-            <w:r>
-              <w:t>08/2028</w:t>
-            </w:r>
-          </w:p>
-        </w:tc>
-        <w:tc>
-          <w:tcPr>
-            <w:tcW w:type="dxa" w:w="3175"/>
-          </w:tcPr>
-          <w:p>
-            <w:pPr>
-              <w:pStyle w:val="LumisTabela"/>
-            </w:pPr>
-            <w:r>
-              <w:t>Autoriza com condição.</w:t>
-            </w:r>
-          </w:p>
-        </w:tc>
-      </w:tr>
-      <w:tr>
-        <w:trPr>
-          <w:cantSplit/>
-        </w:trPr>
-        <w:tc>
-          <w:tcPr>
-            <w:tcW w:type="dxa" w:w="1928"/>
-            <w:shd w:val="clear" w:color="auto" w:fill="F1F6F4"/>
-          </w:tcPr>
-          <w:p>
-            <w:pPr>
-              <w:pStyle w:val="LumisTabela"/>
-            </w:pPr>
-            <w:r>
-              <w:rPr>
-                <w:b/>
-              </w:rPr>
-              <w:t>Banco Meridiano</w:t>
-            </w:r>
-          </w:p>
-        </w:tc>
-        <w:tc>
-          <w:tcPr>
-            <w:tcW w:type="dxa" w:w="2835"/>
-            <w:shd w:val="clear" w:color="auto" w:fill="F1F6F4"/>
-          </w:tcPr>
-          <w:p>
-            <w:pPr>
-              <w:pStyle w:val="LumisTabela"/>
-            </w:pPr>
-            <w:r>
-              <w:t>Sim, com auditoria anual do cliente</w:t>
-            </w:r>
-          </w:p>
-        </w:tc>
-        <w:tc>
-          <w:tcPr>
-            <w:tcW w:type="dxa" w:w="1134"/>
-            <w:shd w:val="clear" w:color="auto" w:fill="F1F6F4"/>
-          </w:tcPr>
-          <w:p>
-            <w:pPr>
-              <w:pStyle w:val="LumisTabela"/>
-            </w:pPr>
-            <w:r>
-              <w:t>05/2028</w:t>
-            </w:r>
-          </w:p>
-        </w:tc>
-        <w:tc>
-          <w:tcPr>
-            <w:tcW w:type="dxa" w:w="3175"/>
-            <w:shd w:val="clear" w:color="auto" w:fill="F1F6F4"/>
-          </w:tcPr>
-          <w:p>
-            <w:pPr>
-              <w:pStyle w:val="LumisTabela"/>
-            </w:pPr>
-            <w:r>
-              <w:t>Autoriza com condição.</w:t>
-            </w:r>
-          </w:p>
-        </w:tc>
-      </w:tr>
-      <w:tr>
-        <w:trPr>
-          <w:cantSplit/>
-        </w:trPr>
-        <w:tc>
-          <w:tcPr>
-            <w:tcW w:type="dxa" w:w="1928"/>
-          </w:tcPr>
-          <w:p>
-            <w:pPr>
-              <w:pStyle w:val="LumisTabela"/>
-              <w:keepNext/>
-            </w:pPr>
-            <w:r>
-              <w:rPr>
-                <w:b/>
-              </w:rPr>
-              <w:t>DATASUS e sintéticos</w:t>
-            </w:r>
-          </w:p>
-        </w:tc>
-        <w:tc>
-          <w:tcPr>
-            <w:tcW w:type="dxa" w:w="2835"/>
-          </w:tcPr>
-          <w:p>
-            <w:pPr>
-              <w:pStyle w:val="LumisTabela"/>
-              <w:keepNext/>
-            </w:pPr>
-            <w:r>
-              <w:t>Uso público e geração própria</w:t>
-            </w:r>
-          </w:p>
-        </w:tc>
-        <w:tc>
-          <w:tcPr>
-            <w:tcW w:type="dxa" w:w="1134"/>
-          </w:tcPr>
-          <w:p>
-            <w:pPr>
-              <w:pStyle w:val="LumisTabela"/>
-              <w:keepNext/>
-            </w:pPr>
-            <w:r>
-              <w:t>Não se aplica</w:t>
-            </w:r>
-          </w:p>
-        </w:tc>
-        <w:tc>
-          <w:tcPr>
-            <w:tcW w:type="dxa" w:w="3175"/>
-          </w:tcPr>
-          <w:p>
-            <w:pPr>
-              <w:pStyle w:val="LumisTabela"/>
-              <w:keepNext/>
-            </w:pPr>
-            <w:r>
-              <w:t>Autorizados. O DATASUS é aberto a todos</w:t>
-            </w:r>
-          </w:p>
-        </w:tc>
-      </w:tr>
-    </w:tbl>
     <w:p>
       <w:pPr>
         <w:pStyle w:val="Legenda"/>
       </w:pPr>
       <w:r>
-        <w:t>Tabela 1. As fontes da base de treinamento, da mais frágil para a mais segura. Fonte: Cap. 2, Quadro 7; leitura da equipe.</w:t>
+        <w:t>Figura 1. A base de treinamento do Lumis Insight. Fonte: Cap. 2, Quadro 7.</w:t>
       </w:r>
     </w:p>
     <w:p>
@@ -505,10 +107,10 @@
         <w:rPr>
           <w:b/>
         </w:rPr>
-        <w:t>Os contratos mais frágeis são os que vencem primeiro.</w:t>
+        <w:t>Só pouco mais de um quarto da base é da Lumis.</w:t>
       </w:r>
       <w:r>
-        <w:t xml:space="preserve"> Prisma e Vila Ipê somam um terço dos dados de clientes. Nenhum dos seis contratos de dados passou por revisão jurídica, e o modelo atual já foi treinado com esses dados. O risco existe hoje, antes de qualquer vencimento.</w:t>
+        <w:t xml:space="preserve"> O DATASUS, que é a maior parte, está aberto a qualquer concorrente. Dos dados de clientes, um terço vem de contratos que não autorizam o treino com clareza, e esses são os primeiros a vencer.</w:t>
       </w:r>
     </w:p>
     <w:p>
@@ -519,10 +121,10 @@
         <w:rPr>
           <w:b/>
         </w:rPr>
-        <w:t>Base legal.</w:t>
+        <w:t>O risco já existe.</w:t>
       </w:r>
       <w:r>
-        <w:t xml:space="preserve"> Dado de saúde é dado pessoal sensível, e a LGPD pede finalidade específica e informada ao titular². Uma cláusula de "melhoria contínua do serviço" dificilmente cobre treinar um produto vendido a outros clientes. Quem trata dados em nome do cliente só pode usá-los para a finalidade definida por ele³. Ao treinar o próprio modelo, a Lumis passa a decidir uma finalidade própria e precisaria de base legal própria.</w:t>
+        <w:t xml:space="preserve"> Nenhum dos seis contratos de dados passou por revisão jurídica, e o modelo atual já foi treinado com esses dados. Dado de saúde é dado sensível, e a LGPD pede finalidade específica e informada². Quem trata dados em nome do cliente só pode usá-los para a finalidade definida por ele³, e uma cláusula de "melhoria contínua do serviço" dificilmente cobre treinar um produto vendido a outros clientes.</w:t>
       </w:r>
     </w:p>
     <w:p>
@@ -533,10 +135,10 @@
         <w:rPr>
           <w:b/>
         </w:rPr>
-        <w:t>Dados anteriores à empresa.</w:t>
+        <w:t>Parte dos dados é anterior à empresa.</w:t>
       </w:r>
       <w:r>
-        <w:t xml:space="preserve"> A Lumis foi fundada em 2022, e parte dos dados de clientes começa em 2019 </w:t>
+        <w:t xml:space="preserve"> Há registros desde 2019, e a Lumis foi fundada em 2022 </w:t>
       </w:r>
       <w:r>
         <w:rPr>
@@ -554,13 +156,19 @@
         <w:t>[não consta]</w:t>
       </w:r>
       <w:r>
-        <w:t>. É a primeira pergunta que uma due diligence faria.</w:t>
+        <w:t>.</w:t>
       </w:r>
     </w:p>
     <w:p>
       <w:pPr/>
       <w:r>
-        <w:t>O que é defensável hoje são os dados da Sanare e do Meridiano, e mesmo eles dependem de condições que ninguém verificou. A recomendação é ter o parecer da DPO sobre os seis contratos antes do próximo treino, renegociar Prisma e Vila Ipê antes do vencimento, incluindo o histórico, e aprovar a política de dados de saúde, parada desde 2024.</w:t>
+        <w:rPr>
+          <w:b/>
+        </w:rPr>
+        <w:t>Recomendação:</w:t>
+      </w:r>
+      <w:r>
+        <w:t xml:space="preserve"> parecer da DPO sobre os seis contratos antes do próximo treino, e renegociação de Prisma e Vila Ipê antes do vencimento, incluindo o histórico.</w:t>
       </w:r>
     </w:p>
     <w:p>
@@ -574,7 +182,7 @@
     <w:p>
       <w:pPr/>
       <w:r>
-        <w:t xml:space="preserve">As duas variáveis que mais pesam no modelo, número de atendimentos e custo acumulado, deveriam medir necessidade de cuidado e gravidade. Na prática, medem quem conseguiu ser atendido e quanto isso custou. Quem teve menos acesso parece menos grave para o modelo. O capítulo descreve esse caso e diz que "foi exatamente isso que aconteceu no incidente da Fase 1" </w:t>
+        <w:t xml:space="preserve">As variáveis que mais pesam no modelo deveriam medir necessidade e gravidade. Na prática, medem acesso: quem conseguiu ser atendido e quanto isso custou. Quem teve menos acesso parece menos grave. Esse é o caso de proxy que o capítulo descreve, e ele diz que "foi exatamente isso que aconteceu no incidente da Fase 1" </w:t>
       </w:r>
       <w:r>
         <w:rPr>
@@ -587,6 +195,54 @@
       </w:r>
     </w:p>
     <w:p>
+      <w:pPr>
+        <w:keepNext/>
+        <w:jc w:val="center"/>
+      </w:pPr>
+      <w:r>
+        <w:drawing>
+          <wp:inline xmlns:a="http://schemas.openxmlformats.org/drawingml/2006/main" xmlns:pic="http://schemas.openxmlformats.org/drawingml/2006/picture">
+            <wp:extent cx="5760000" cy="2139635"/>
+            <wp:docPr id="2" name="Picture 2"/>
+            <wp:cNvGraphicFramePr>
+              <a:graphicFrameLocks noChangeAspect="1"/>
+            </wp:cNvGraphicFramePr>
+            <a:graphic>
+              <a:graphicData uri="http://schemas.openxmlformats.org/drawingml/2006/picture">
+                <pic:pic>
+                  <pic:nvPicPr>
+                    <pic:cNvPr id="0" name="v2_fig2_proxy.png"/>
+                    <pic:cNvPicPr/>
+                  </pic:nvPicPr>
+                  <pic:blipFill>
+                    <a:blip r:embed="rId19"/>
+                    <a:stretch>
+                      <a:fillRect/>
+                    </a:stretch>
+                  </pic:blipFill>
+                  <pic:spPr>
+                    <a:xfrm>
+                      <a:off x="0" y="0"/>
+                      <a:ext cx="5760000" cy="2139635"/>
+                    </a:xfrm>
+                    <a:prstGeom prst="rect"/>
+                  </pic:spPr>
+                </pic:pic>
+              </a:graphicData>
+            </a:graphic>
+          </wp:inline>
+        </w:drawing>
+      </w:r>
+    </w:p>
+    <w:p>
+      <w:pPr>
+        <w:pStyle w:val="Legenda"/>
+      </w:pPr>
+      <w:r>
+        <w:t>Figura 2. Quatro variáveis, que somam metade do peso do modelo, medem acesso. Fonte: Cap. 2, Quadro 8; leitura da equipe.</w:t>
+      </w:r>
+    </w:p>
+    <w:p>
       <w:pPr/>
       <w:r>
         <w:rPr>
@@ -595,372 +251,7 @@
         <w:t>Um caso real com o mesmo erro.</w:t>
       </w:r>
       <w:r>
-        <w:t xml:space="preserve"> Em 2019, pesquisadores publicaram na revista Science a análise de um algoritmo comercial usado nos Estados Unidos para escolher pacientes para cuidado extra¹. O algoritmo previa quanto cada paciente ia custar, e não quão doente estava. Como pacientes negros tinham menos acesso a atendimento, gastavam menos e recebiam o mesmo escore que pacientes brancos mais saudáveis. Com a medida corrigida, a parcela de pacientes negros indicados para cuidado extra mais que dobraria. Na Lumis, o mecanismo é o mesmo, e quem fica para trás é quem tem menos acesso, como os idosos de CEP D/E. O caso não faz parte da história da Lumis e entra como comparação.</w:t>
-      </w:r>
-    </w:p>
-    <w:tbl>
-      <w:tblPr>
-        <w:tblW w:type="auto" w:w="0"/>
-        <w:jc w:val="center"/>
-        <w:tblLayout w:type="fixed"/>
-        <w:tblLook w:firstColumn="1" w:firstRow="1" w:lastColumn="0" w:lastRow="0" w:noHBand="0" w:noVBand="1" w:val="04A0"/>
-        <w:tblBorders>
-          <w:top w:val="single" w:sz="4" w:color="D3DEDB"/>
-          <w:bottom w:val="single" w:sz="4" w:color="D3DEDB"/>
-          <w:insideH w:val="single" w:sz="4" w:color="D3DEDB"/>
-        </w:tblBorders>
-        <w:tblLayout w:type="fixed"/>
-      </w:tblPr>
-      <w:tblGrid>
-        <w:gridCol w:w="1814"/>
-        <w:gridCol w:w="2041"/>
-        <w:gridCol w:w="2268"/>
-        <w:gridCol w:w="2948"/>
-      </w:tblGrid>
-      <w:tr>
-        <w:trPr>
-          <w:tblHeader w:val="true"/>
-          <w:cantSplit/>
-        </w:trPr>
-        <w:tc>
-          <w:tcPr>
-            <w:tcW w:type="dxa" w:w="1814"/>
-            <w:shd w:val="clear" w:color="auto" w:fill="0F2D3A"/>
-          </w:tcPr>
-          <w:p>
-            <w:pPr>
-              <w:pStyle w:val="LumisTabela"/>
-              <w:keepNext/>
-            </w:pPr>
-            <w:r>
-              <w:rPr>
-                <w:b/>
-                <w:color w:val="FFFFFF"/>
-              </w:rPr>
-              <w:t>Variável</w:t>
-            </w:r>
-          </w:p>
-        </w:tc>
-        <w:tc>
-          <w:tcPr>
-            <w:tcW w:type="dxa" w:w="2041"/>
-            <w:shd w:val="clear" w:color="auto" w:fill="0F2D3A"/>
-          </w:tcPr>
-          <w:p>
-            <w:pPr>
-              <w:pStyle w:val="LumisTabela"/>
-              <w:keepNext/>
-            </w:pPr>
-            <w:r>
-              <w:rPr>
-                <w:b/>
-                <w:color w:val="FFFFFF"/>
-              </w:rPr>
-              <w:t>A empresa diz medir</w:t>
-            </w:r>
-          </w:p>
-        </w:tc>
-        <w:tc>
-          <w:tcPr>
-            <w:tcW w:type="dxa" w:w="2268"/>
-            <w:shd w:val="clear" w:color="auto" w:fill="0F2D3A"/>
-          </w:tcPr>
-          <w:p>
-            <w:pPr>
-              <w:pStyle w:val="LumisTabela"/>
-              <w:keepNext/>
-            </w:pPr>
-            <w:r>
-              <w:rPr>
-                <w:b/>
-                <w:color w:val="FFFFFF"/>
-              </w:rPr>
-              <w:t>O que tende a medir</w:t>
-            </w:r>
-          </w:p>
-        </w:tc>
-        <w:tc>
-          <w:tcPr>
-            <w:tcW w:type="dxa" w:w="2948"/>
-            <w:shd w:val="clear" w:color="auto" w:fill="0F2D3A"/>
-          </w:tcPr>
-          <w:p>
-            <w:pPr>
-              <w:pStyle w:val="LumisTabela"/>
-              <w:keepNext/>
-            </w:pPr>
-            <w:r>
-              <w:rPr>
-                <w:b/>
-                <w:color w:val="FFFFFF"/>
-              </w:rPr>
-              <w:t>Efeito</w:t>
-            </w:r>
-          </w:p>
-        </w:tc>
-      </w:tr>
-      <w:tr>
-        <w:trPr>
-          <w:cantSplit/>
-        </w:trPr>
-        <w:tc>
-          <w:tcPr>
-            <w:tcW w:type="dxa" w:w="1814"/>
-          </w:tcPr>
-          <w:p>
-            <w:pPr>
-              <w:pStyle w:val="LumisTabela"/>
-            </w:pPr>
-            <w:r>
-              <w:t>Nº de atendimentos</w:t>
-            </w:r>
-          </w:p>
-        </w:tc>
-        <w:tc>
-          <w:tcPr>
-            <w:tcW w:type="dxa" w:w="2041"/>
-          </w:tcPr>
-          <w:p>
-            <w:pPr>
-              <w:pStyle w:val="LumisTabela"/>
-            </w:pPr>
-            <w:r>
-              <w:t>Necessidade de cuidado</w:t>
-            </w:r>
-          </w:p>
-        </w:tc>
-        <w:tc>
-          <w:tcPr>
-            <w:tcW w:type="dxa" w:w="2268"/>
-          </w:tcPr>
-          <w:p>
-            <w:pPr>
-              <w:pStyle w:val="LumisTabela"/>
-            </w:pPr>
-            <w:r>
-              <w:t>Quem conseguiu ser atendido</w:t>
-            </w:r>
-          </w:p>
-        </w:tc>
-        <w:tc>
-          <w:tcPr>
-            <w:tcW w:type="dxa" w:w="2948"/>
-          </w:tcPr>
-          <w:p>
-            <w:pPr>
-              <w:pStyle w:val="LumisTabela"/>
-            </w:pPr>
-            <w:r>
-              <w:t>Quem tem menos acesso parece precisar de menos</w:t>
-            </w:r>
-          </w:p>
-        </w:tc>
-      </w:tr>
-      <w:tr>
-        <w:trPr>
-          <w:cantSplit/>
-        </w:trPr>
-        <w:tc>
-          <w:tcPr>
-            <w:tcW w:type="dxa" w:w="1814"/>
-            <w:shd w:val="clear" w:color="auto" w:fill="F1F6F4"/>
-          </w:tcPr>
-          <w:p>
-            <w:pPr>
-              <w:pStyle w:val="LumisTabela"/>
-            </w:pPr>
-            <w:r>
-              <w:t>Custo acumulado</w:t>
-            </w:r>
-          </w:p>
-        </w:tc>
-        <w:tc>
-          <w:tcPr>
-            <w:tcW w:type="dxa" w:w="2041"/>
-            <w:shd w:val="clear" w:color="auto" w:fill="F1F6F4"/>
-          </w:tcPr>
-          <w:p>
-            <w:pPr>
-              <w:pStyle w:val="LumisTabela"/>
-            </w:pPr>
-            <w:r>
-              <w:t>Gravidade</w:t>
-            </w:r>
-          </w:p>
-        </w:tc>
-        <w:tc>
-          <w:tcPr>
-            <w:tcW w:type="dxa" w:w="2268"/>
-            <w:shd w:val="clear" w:color="auto" w:fill="F1F6F4"/>
-          </w:tcPr>
-          <w:p>
-            <w:pPr>
-              <w:pStyle w:val="LumisTabela"/>
-            </w:pPr>
-            <w:r>
-              <w:t>Acesso a procedimentos pagos</w:t>
-            </w:r>
-          </w:p>
-        </w:tc>
-        <w:tc>
-          <w:tcPr>
-            <w:tcW w:type="dxa" w:w="2948"/>
-            <w:shd w:val="clear" w:color="auto" w:fill="F1F6F4"/>
-          </w:tcPr>
-          <w:p>
-            <w:pPr>
-              <w:pStyle w:val="LumisTabela"/>
-            </w:pPr>
-            <w:r>
-              <w:t>Quem gasta menos parece menos grave</w:t>
-            </w:r>
-          </w:p>
-        </w:tc>
-      </w:tr>
-      <w:tr>
-        <w:trPr>
-          <w:cantSplit/>
-        </w:trPr>
-        <w:tc>
-          <w:tcPr>
-            <w:tcW w:type="dxa" w:w="1814"/>
-          </w:tcPr>
-          <w:p>
-            <w:pPr>
-              <w:pStyle w:val="LumisTabela"/>
-            </w:pPr>
-            <w:r>
-              <w:t>Faixa de CEP</w:t>
-            </w:r>
-          </w:p>
-        </w:tc>
-        <w:tc>
-          <w:tcPr>
-            <w:tcW w:type="dxa" w:w="2041"/>
-          </w:tcPr>
-          <w:p>
-            <w:pPr>
-              <w:pStyle w:val="LumisTabela"/>
-            </w:pPr>
-            <w:r>
-              <w:t>Região de residência</w:t>
-            </w:r>
-          </w:p>
-        </w:tc>
-        <w:tc>
-          <w:tcPr>
-            <w:tcW w:type="dxa" w:w="2268"/>
-          </w:tcPr>
-          <w:p>
-            <w:pPr>
-              <w:pStyle w:val="LumisTabela"/>
-            </w:pPr>
-            <w:r>
-              <w:t>Renda e oferta de serviços</w:t>
-            </w:r>
-          </w:p>
-        </w:tc>
-        <w:tc>
-          <w:tcPr>
-            <w:tcW w:type="dxa" w:w="2948"/>
-          </w:tcPr>
-          <w:p>
-            <w:pPr>
-              <w:pStyle w:val="LumisTabela"/>
-            </w:pPr>
-            <w:r>
-              <w:t>Leva a desigualdade regional para o modelo</w:t>
-            </w:r>
-          </w:p>
-        </w:tc>
-      </w:tr>
-      <w:tr>
-        <w:trPr>
-          <w:cantSplit/>
-        </w:trPr>
-        <w:tc>
-          <w:tcPr>
-            <w:tcW w:type="dxa" w:w="1814"/>
-            <w:shd w:val="clear" w:color="auto" w:fill="F1F6F4"/>
-          </w:tcPr>
-          <w:p>
-            <w:pPr>
-              <w:pStyle w:val="LumisTabela"/>
-              <w:keepNext/>
-            </w:pPr>
-            <w:r>
-              <w:t>Tipo de plano</w:t>
-            </w:r>
-          </w:p>
-        </w:tc>
-        <w:tc>
-          <w:tcPr>
-            <w:tcW w:type="dxa" w:w="2041"/>
-            <w:shd w:val="clear" w:color="auto" w:fill="F1F6F4"/>
-          </w:tcPr>
-          <w:p>
-            <w:pPr>
-              <w:pStyle w:val="LumisTabela"/>
-              <w:keepNext/>
-            </w:pPr>
-            <w:r>
-              <w:t>Cobertura contratada</w:t>
-            </w:r>
-          </w:p>
-        </w:tc>
-        <w:tc>
-          <w:tcPr>
-            <w:tcW w:type="dxa" w:w="2268"/>
-            <w:shd w:val="clear" w:color="auto" w:fill="F1F6F4"/>
-          </w:tcPr>
-          <w:p>
-            <w:pPr>
-              <w:pStyle w:val="LumisTabela"/>
-              <w:keepNext/>
-            </w:pPr>
-            <w:r>
-              <w:t>Renda</w:t>
-            </w:r>
-          </w:p>
-        </w:tc>
-        <w:tc>
-          <w:tcPr>
-            <w:tcW w:type="dxa" w:w="2948"/>
-            <w:shd w:val="clear" w:color="auto" w:fill="F1F6F4"/>
-          </w:tcPr>
-          <w:p>
-            <w:pPr>
-              <w:pStyle w:val="LumisTabela"/>
-              <w:keepNext/>
-            </w:pPr>
-            <w:r>
-              <w:t>A prioridade passa a depender do plano</w:t>
-            </w:r>
-          </w:p>
-        </w:tc>
-      </w:tr>
-    </w:tbl>
-    <w:p>
-      <w:pPr>
-        <w:pStyle w:val="Legenda"/>
-      </w:pPr>
-      <w:r>
-        <w:t>Tabela 2. As variáveis que medem acesso. Juntas, são metade do peso do modelo. Fonte: Cap. 2, Quadro 8; leitura da equipe.</w:t>
-      </w:r>
-    </w:p>
-    <w:p>
-      <w:pPr/>
-      <w:r>
-        <w:t xml:space="preserve">O CEP reforça o caso: com a mesma idade, o erro cresce de A/B para D/E nas duas faixas etárias </w:t>
-      </w:r>
-      <w:r>
-        <w:rPr>
-          <w:rStyle w:val="TagFonte"/>
-        </w:rPr>
-        <w:t>[fonte: Cap. 2, Quadro 10]</w:t>
-      </w:r>
-      <w:r>
-        <w:t>. Por que os idosos são os mais afetados o anexo não permite separar, e os testes ficam para a Fase 3.</w:t>
+        <w:t xml:space="preserve"> Em 2019, um estudo publicado na revista Science mostrou que um algoritmo usado nos Estados Unidos previa o custo do paciente, e não a doença¹. Pacientes negros, com menos acesso, gastavam menos e recebiam o mesmo escore de pacientes brancos mais saudáveis. O caso não faz parte da história da Lumis e entra como comparação.</w:t>
       </w:r>
     </w:p>
     <w:p>
@@ -974,13 +265,13 @@
     <w:p>
       <w:pPr/>
       <w:r>
-        <w:t xml:space="preserve">Os 94% de acurácia vêm de uma amostra de 2023 com dois hospitais da mesma região. Em campo, o número que importa para priorização, o paciente que precisava de prioridade e não recebeu, mais que dobrou </w:t>
+        <w:t xml:space="preserve">Os 94% de acurácia vêm de uma amostra de 2023 com dois hospitais da mesma região. Em campo, a parcela de pacientes que precisavam de prioridade e não receberam mais que dobrou, e o erro se concentra em quem já é mais vulnerável </w:t>
       </w:r>
       <w:r>
         <w:rPr>
           <w:rStyle w:val="TagFonte"/>
         </w:rPr>
-        <w:t>[fonte: Cap. 2, Quadro 9]</w:t>
+        <w:t>[fonte: Cap. 2, Quadros 9 e 10]</w:t>
       </w:r>
       <w:r>
         <w:t>.</w:t>
@@ -995,7 +286,7 @@
         <w:drawing>
           <wp:inline xmlns:a="http://schemas.openxmlformats.org/drawingml/2006/main" xmlns:pic="http://schemas.openxmlformats.org/drawingml/2006/picture">
             <wp:extent cx="5760000" cy="2127510"/>
-            <wp:docPr id="1" name="Picture 1"/>
+            <wp:docPr id="3" name="Picture 3"/>
             <wp:cNvGraphicFramePr>
               <a:graphicFrameLocks noChangeAspect="1"/>
             </wp:cNvGraphicFramePr>
@@ -1007,7 +298,7 @@
                     <pic:cNvPicPr/>
                   </pic:nvPicPr>
                   <pic:blipFill>
-                    <a:blip r:embed="rId18"/>
+                    <a:blip r:embed="rId20"/>
                     <a:stretch>
                       <a:fillRect/>
                     </a:stretch>
@@ -1031,13 +322,13 @@
         <w:pStyle w:val="Legenda"/>
       </w:pPr>
       <w:r>
-        <w:t>Figura 1. Pacientes que precisavam de prioridade e não receberam, por grupo, 1º semestre de 2026. Fonte: Cap. 2, Quadros 9 e 10.</w:t>
+        <w:t>Figura 3. Pacientes que precisavam de prioridade e não receberam, por grupo, 1º semestre de 2026. Fonte: Cap. 2, Quadros 9 e 10.</w:t>
       </w:r>
     </w:p>
     <w:p>
       <w:pPr/>
       <w:r>
-        <w:t xml:space="preserve">O erro se concentra em quem já é mais vulnerável: o modelo deixa de priorizar idosos de CEP D/E três vezes mais que adultos de CEP A/B. Foi o Hospital Vila Ipê que mediu isso, e não a Lumis. Só 2% das decisões passam por revisão humana, e as reclamações dos pacientes de CEP D/E, que são a maioria, nunca foram cruzadas com o desempenho do modelo </w:t>
+        <w:t xml:space="preserve">Quem mediu o pior número foi o Hospital Vila Ipê, e não a Lumis. Só 2% das decisões passam por revisão humana, e as reclamações, que vêm na maioria de pacientes de CEP D/E, nunca foram cruzadas com o desempenho do modelo </w:t>
       </w:r>
       <w:r>
         <w:rPr>
@@ -1060,332 +351,16 @@
     <w:p>
       <w:pPr/>
       <w:r>
-        <w:t>O Vetor Capital avisou que número que não sobrevive a uma auditoria independente vira passivo. Na maior parte dos casos, o número está certo e a forma de divulgar é que não se sustenta.</w:t>
+        <w:t xml:space="preserve">O Vetor Capital avisou que número que não sobrevive a uma auditoria independente vira passivo. Passamos as métricas de hoje pelas quatro perguntas do capítulo </w:t>
       </w:r>
-    </w:p>
-    <w:tbl>
-      <w:tblPr>
-        <w:tblW w:type="auto" w:w="0"/>
-        <w:jc w:val="center"/>
-        <w:tblLayout w:type="fixed"/>
-        <w:tblLook w:firstColumn="1" w:firstRow="1" w:lastColumn="0" w:lastRow="0" w:noHBand="0" w:noVBand="1" w:val="04A0"/>
-        <w:tblBorders>
-          <w:top w:val="single" w:sz="4" w:color="D3DEDB"/>
-          <w:bottom w:val="single" w:sz="4" w:color="D3DEDB"/>
-          <w:insideH w:val="single" w:sz="4" w:color="D3DEDB"/>
-        </w:tblBorders>
-        <w:tblLayout w:type="fixed"/>
-      </w:tblPr>
-      <w:tblGrid>
-        <w:gridCol w:w="2494"/>
-        <w:gridCol w:w="3628"/>
-        <w:gridCol w:w="2948"/>
-      </w:tblGrid>
-      <w:tr>
-        <w:trPr>
-          <w:tblHeader w:val="true"/>
-          <w:cantSplit/>
-        </w:trPr>
-        <w:tc>
-          <w:tcPr>
-            <w:tcW w:type="dxa" w:w="2494"/>
-            <w:shd w:val="clear" w:color="auto" w:fill="0F2D3A"/>
-          </w:tcPr>
-          <w:p>
-            <w:pPr>
-              <w:pStyle w:val="LumisTabela"/>
-              <w:keepNext/>
-            </w:pPr>
-            <w:r>
-              <w:rPr>
-                <w:b/>
-                <w:color w:val="FFFFFF"/>
-              </w:rPr>
-              <w:t>Afirmação</w:t>
-            </w:r>
-          </w:p>
-        </w:tc>
-        <w:tc>
-          <w:tcPr>
-            <w:tcW w:type="dxa" w:w="3628"/>
-            <w:shd w:val="clear" w:color="auto" w:fill="0F2D3A"/>
-          </w:tcPr>
-          <w:p>
-            <w:pPr>
-              <w:pStyle w:val="LumisTabela"/>
-              <w:keepNext/>
-            </w:pPr>
-            <w:r>
-              <w:rPr>
-                <w:b/>
-                <w:color w:val="FFFFFF"/>
-              </w:rPr>
-              <w:t>O que de fato mostra</w:t>
-            </w:r>
-          </w:p>
-        </w:tc>
-        <w:tc>
-          <w:tcPr>
-            <w:tcW w:type="dxa" w:w="2948"/>
-            <w:shd w:val="clear" w:color="auto" w:fill="0F2D3A"/>
-          </w:tcPr>
-          <w:p>
-            <w:pPr>
-              <w:pStyle w:val="LumisTabela"/>
-              <w:keepNext/>
-            </w:pPr>
-            <w:r>
-              <w:rPr>
-                <w:b/>
-                <w:color w:val="FFFFFF"/>
-              </w:rPr>
-              <w:t>Destino</w:t>
-            </w:r>
-          </w:p>
-        </w:tc>
-      </w:tr>
-      <w:tr>
-        <w:trPr>
-          <w:cantSplit/>
-        </w:trPr>
-        <w:tc>
-          <w:tcPr>
-            <w:tcW w:type="dxa" w:w="2494"/>
-          </w:tcPr>
-          <w:p>
-            <w:pPr>
-              <w:pStyle w:val="LumisTabela"/>
-            </w:pPr>
-            <w:r>
-              <w:t>"Acurácia de 94%"</w:t>
-            </w:r>
-          </w:p>
-        </w:tc>
-        <w:tc>
-          <w:tcPr>
-            <w:tcW w:type="dxa" w:w="3628"/>
-          </w:tcPr>
-          <w:p>
-            <w:pPr>
-              <w:pStyle w:val="LumisTabela"/>
-            </w:pPr>
-            <w:r>
-              <w:t>Uma amostra de 2023 de dois hospitais, sem os grupos</w:t>
-            </w:r>
-          </w:p>
-        </w:tc>
-        <w:tc>
-          <w:tcPr>
-            <w:tcW w:type="dxa" w:w="2948"/>
-          </w:tcPr>
-          <w:p>
-            <w:pPr>
-              <w:pStyle w:val="LumisTabela"/>
-            </w:pPr>
-            <w:r>
-              <w:t>Trocar pelo erro em campo por grupo (indicador 1)</w:t>
-            </w:r>
-          </w:p>
-        </w:tc>
-      </w:tr>
-      <w:tr>
-        <w:trPr>
-          <w:cantSplit/>
-        </w:trPr>
-        <w:tc>
-          <w:tcPr>
-            <w:tcW w:type="dxa" w:w="2494"/>
-            <w:shd w:val="clear" w:color="auto" w:fill="F1F6F4"/>
-          </w:tcPr>
-          <w:p>
-            <w:pPr>
-              <w:pStyle w:val="LumisTabela"/>
-            </w:pPr>
-            <w:r>
-              <w:t>"Redução de 30% no tempo de triagem"</w:t>
-            </w:r>
-          </w:p>
-        </w:tc>
-        <w:tc>
-          <w:tcPr>
-            <w:tcW w:type="dxa" w:w="3628"/>
-            <w:shd w:val="clear" w:color="auto" w:fill="F1F6F4"/>
-          </w:tcPr>
-          <w:p>
-            <w:pPr>
-              <w:pStyle w:val="LumisTabela"/>
-            </w:pPr>
-            <w:r>
-              <w:t>Um piloto de seis semanas, sem grupo de comparação</w:t>
-            </w:r>
-          </w:p>
-        </w:tc>
-        <w:tc>
-          <w:tcPr>
-            <w:tcW w:type="dxa" w:w="2948"/>
-            <w:shd w:val="clear" w:color="auto" w:fill="F1F6F4"/>
-          </w:tcPr>
-          <w:p>
-            <w:pPr>
-              <w:pStyle w:val="LumisTabela"/>
-            </w:pPr>
-            <w:r>
-              <w:t>Retirar até haver estudo com comparação</w:t>
-            </w:r>
-          </w:p>
-        </w:tc>
-      </w:tr>
-      <w:tr>
-        <w:trPr>
-          <w:cantSplit/>
-        </w:trPr>
-        <w:tc>
-          <w:tcPr>
-            <w:tcW w:type="dxa" w:w="2494"/>
-          </w:tcPr>
-          <w:p>
-            <w:pPr>
-              <w:pStyle w:val="LumisTabela"/>
-            </w:pPr>
-            <w:r>
-              <w:t>"Mais de 5 milhões de vidas analisadas"</w:t>
-            </w:r>
-          </w:p>
-        </w:tc>
-        <w:tc>
-          <w:tcPr>
-            <w:tcW w:type="dxa" w:w="3628"/>
-          </w:tcPr>
-          <w:p>
-            <w:pPr>
-              <w:pStyle w:val="LumisTabela"/>
-            </w:pPr>
-            <w:r>
-              <w:t>Processamentos, com o mesmo paciente contado mais de uma vez</w:t>
-            </w:r>
-          </w:p>
-        </w:tc>
-        <w:tc>
-          <w:tcPr>
-            <w:tcW w:type="dxa" w:w="2948"/>
-          </w:tcPr>
-          <w:p>
-            <w:pPr>
-              <w:pStyle w:val="LumisTabela"/>
-            </w:pPr>
-            <w:r>
-              <w:t>Retirar já</w:t>
-            </w:r>
-          </w:p>
-        </w:tc>
-      </w:tr>
-      <w:tr>
-        <w:trPr>
-          <w:cantSplit/>
-        </w:trPr>
-        <w:tc>
-          <w:tcPr>
-            <w:tcW w:type="dxa" w:w="2494"/>
-            <w:shd w:val="clear" w:color="auto" w:fill="F1F6F4"/>
-          </w:tcPr>
-          <w:p>
-            <w:pPr>
-              <w:pStyle w:val="LumisTabela"/>
-            </w:pPr>
-            <w:r>
-              <w:t>"NPS 72"</w:t>
-            </w:r>
-          </w:p>
-        </w:tc>
-        <w:tc>
-          <w:tcPr>
-            <w:tcW w:type="dxa" w:w="3628"/>
-            <w:shd w:val="clear" w:color="auto" w:fill="F1F6F4"/>
-          </w:tcPr>
-          <w:p>
-            <w:pPr>
-              <w:pStyle w:val="LumisTabela"/>
-            </w:pPr>
-            <w:r>
-              <w:t>9 clientes indicados pelo comercial</w:t>
-            </w:r>
-          </w:p>
-        </w:tc>
-        <w:tc>
-          <w:tcPr>
-            <w:tcW w:type="dxa" w:w="2948"/>
-            <w:shd w:val="clear" w:color="auto" w:fill="F1F6F4"/>
-          </w:tcPr>
-          <w:p>
-            <w:pPr>
-              <w:pStyle w:val="LumisTabela"/>
-            </w:pPr>
-            <w:r>
-              <w:t>Trocar pelas reclamações por grupo (indicador 3)</w:t>
-            </w:r>
-          </w:p>
-        </w:tc>
-      </w:tr>
-      <w:tr>
-        <w:trPr>
-          <w:cantSplit/>
-        </w:trPr>
-        <w:tc>
-          <w:tcPr>
-            <w:tcW w:type="dxa" w:w="2494"/>
-          </w:tcPr>
-          <w:p>
-            <w:pPr>
-              <w:pStyle w:val="LumisTabela"/>
-              <w:keepNext/>
-            </w:pPr>
-            <w:r>
-              <w:t>"Disponibilidade de 99,9%"</w:t>
-            </w:r>
-          </w:p>
-        </w:tc>
-        <w:tc>
-          <w:tcPr>
-            <w:tcW w:type="dxa" w:w="3628"/>
-          </w:tcPr>
-          <w:p>
-            <w:pPr>
-              <w:pStyle w:val="LumisTabela"/>
-              <w:keepNext/>
-            </w:pPr>
-            <w:r>
-              <w:t>Só a interface técnica, sem o serviço completo</w:t>
-            </w:r>
-          </w:p>
-        </w:tc>
-        <w:tc>
-          <w:tcPr>
-            <w:tcW w:type="dxa" w:w="2948"/>
-          </w:tcPr>
-          <w:p>
-            <w:pPr>
-              <w:pStyle w:val="LumisTabela"/>
-              <w:keepNext/>
-            </w:pPr>
-            <w:r>
-              <w:t>Tirar do material comercial</w:t>
-            </w:r>
-          </w:p>
-        </w:tc>
-      </w:tr>
-    </w:tbl>
-    <w:p>
-      <w:pPr>
-        <w:pStyle w:val="Legenda"/>
-      </w:pPr>
       <w:r>
-        <w:t>Tabela 3. As cinco afirmações do painel comercial. As quatro perguntas aplicadas a cada uma estão no Anexo. Fonte: Cap. 2, Quadro 11.</w:t>
+        <w:rPr>
+          <w:rStyle w:val="TagFonte"/>
+        </w:rPr>
+        <w:t>[fonte: Cap. 2, 2.3]</w:t>
       </w:r>
-    </w:p>
-    <w:p>
-      <w:pPr/>
       <w:r>
-        <w:t xml:space="preserve">Os "5 milhões de vidas" são o caso mais grave: a duplicidade foi achada em janeiro, corrigida no sistema e continua no material comercial </w:t>
+        <w:t xml:space="preserve">, e nenhuma fica como está. O caso mais grave são os "5 milhões de vidas": a contagem repetida foi achada em janeiro e continua no material comercial </w:t>
       </w:r>
       <w:r>
         <w:rPr>
@@ -1394,7 +369,55 @@
         <w:t>[fonte: Cap. 2, Quadro 14]</w:t>
       </w:r>
       <w:r>
-        <w:t>. Manter as cinco afirmações como estão contradiz nosso compromisso de Transparência (C1).</w:t>
+        <w:t>. Manter esses números contradiz o compromisso de Transparência da nossa Declaração de Intenção.</w:t>
+      </w:r>
+    </w:p>
+    <w:p>
+      <w:pPr>
+        <w:keepNext/>
+        <w:jc w:val="center"/>
+      </w:pPr>
+      <w:r>
+        <w:drawing>
+          <wp:inline xmlns:a="http://schemas.openxmlformats.org/drawingml/2006/main" xmlns:pic="http://schemas.openxmlformats.org/drawingml/2006/picture">
+            <wp:extent cx="5760000" cy="3484724"/>
+            <wp:docPr id="4" name="Picture 4"/>
+            <wp:cNvGraphicFramePr>
+              <a:graphicFrameLocks noChangeAspect="1"/>
+            </wp:cNvGraphicFramePr>
+            <a:graphic>
+              <a:graphicData uri="http://schemas.openxmlformats.org/drawingml/2006/picture">
+                <pic:pic>
+                  <pic:nvPicPr>
+                    <pic:cNvPr id="0" name="v2_fig4_metricas.png"/>
+                    <pic:cNvPicPr/>
+                  </pic:nvPicPr>
+                  <pic:blipFill>
+                    <a:blip r:embed="rId21"/>
+                    <a:stretch>
+                      <a:fillRect/>
+                    </a:stretch>
+                  </pic:blipFill>
+                  <pic:spPr>
+                    <a:xfrm>
+                      <a:off x="0" y="0"/>
+                      <a:ext cx="5760000" cy="3484724"/>
+                    </a:xfrm>
+                    <a:prstGeom prst="rect"/>
+                  </pic:spPr>
+                </pic:pic>
+              </a:graphicData>
+            </a:graphic>
+          </wp:inline>
+        </w:drawing>
+      </w:r>
+    </w:p>
+    <w:p>
+      <w:pPr>
+        <w:pStyle w:val="Legenda"/>
+      </w:pPr>
+      <w:r>
+        <w:t>Figura 4. As métricas de hoje e as quatro perguntas. Todas saem ou são trocadas. Fonte: Cap. 2, Quadros 9, 11 e 14.</w:t>
       </w:r>
     </w:p>
     <w:p>
@@ -1408,441 +431,7 @@
     <w:p>
       <w:pPr/>
       <w:r>
-        <w:t>No lugar dos números de vitrine, propomos cinco indicadores. Cada um tem um ponto de ação, uma decisão que ele dispara e um responsável. Os pontos de ação são proposta da equipe, e os cargos são provisórios até a Entrega 3.</w:t>
-      </w:r>
-    </w:p>
-    <w:tbl>
-      <w:tblPr>
-        <w:tblW w:type="auto" w:w="0"/>
-        <w:jc w:val="center"/>
-        <w:tblLayout w:type="fixed"/>
-        <w:tblLook w:firstColumn="1" w:firstRow="1" w:lastColumn="0" w:lastRow="0" w:noHBand="0" w:noVBand="1" w:val="04A0"/>
-        <w:tblBorders>
-          <w:top w:val="single" w:sz="4" w:color="D3DEDB"/>
-          <w:bottom w:val="single" w:sz="4" w:color="D3DEDB"/>
-          <w:insideH w:val="single" w:sz="4" w:color="D3DEDB"/>
-        </w:tblBorders>
-        <w:tblLayout w:type="fixed"/>
-      </w:tblPr>
-      <w:tblGrid>
-        <w:gridCol w:w="2381"/>
-        <w:gridCol w:w="2268"/>
-        <w:gridCol w:w="2608"/>
-        <w:gridCol w:w="1814"/>
-      </w:tblGrid>
-      <w:tr>
-        <w:trPr>
-          <w:tblHeader w:val="true"/>
-          <w:cantSplit/>
-        </w:trPr>
-        <w:tc>
-          <w:tcPr>
-            <w:tcW w:type="dxa" w:w="2381"/>
-            <w:shd w:val="clear" w:color="auto" w:fill="0F2D3A"/>
-          </w:tcPr>
-          <w:p>
-            <w:pPr>
-              <w:pStyle w:val="LumisTabela"/>
-              <w:keepNext/>
-            </w:pPr>
-            <w:r>
-              <w:rPr>
-                <w:b/>
-                <w:color w:val="FFFFFF"/>
-              </w:rPr>
-              <w:t>Indicador</w:t>
-            </w:r>
-          </w:p>
-        </w:tc>
-        <w:tc>
-          <w:tcPr>
-            <w:tcW w:type="dxa" w:w="2268"/>
-            <w:shd w:val="clear" w:color="auto" w:fill="0F2D3A"/>
-          </w:tcPr>
-          <w:p>
-            <w:pPr>
-              <w:pStyle w:val="LumisTabela"/>
-              <w:keepNext/>
-            </w:pPr>
-            <w:r>
-              <w:rPr>
-                <w:b/>
-                <w:color w:val="FFFFFF"/>
-              </w:rPr>
-              <w:t>Quando age [hipótese]</w:t>
-            </w:r>
-          </w:p>
-        </w:tc>
-        <w:tc>
-          <w:tcPr>
-            <w:tcW w:type="dxa" w:w="2608"/>
-            <w:shd w:val="clear" w:color="auto" w:fill="0F2D3A"/>
-          </w:tcPr>
-          <w:p>
-            <w:pPr>
-              <w:pStyle w:val="LumisTabela"/>
-              <w:keepNext/>
-            </w:pPr>
-            <w:r>
-              <w:rPr>
-                <w:b/>
-                <w:color w:val="FFFFFF"/>
-              </w:rPr>
-              <w:t>O que decide</w:t>
-            </w:r>
-          </w:p>
-        </w:tc>
-        <w:tc>
-          <w:tcPr>
-            <w:tcW w:type="dxa" w:w="1814"/>
-            <w:shd w:val="clear" w:color="auto" w:fill="0F2D3A"/>
-          </w:tcPr>
-          <w:p>
-            <w:pPr>
-              <w:pStyle w:val="LumisTabela"/>
-              <w:keepNext/>
-            </w:pPr>
-            <w:r>
-              <w:rPr>
-                <w:b/>
-                <w:color w:val="FFFFFF"/>
-              </w:rPr>
-              <w:t>Quem responde</w:t>
-            </w:r>
-          </w:p>
-        </w:tc>
-      </w:tr>
-      <w:tr>
-        <w:trPr>
-          <w:cantSplit/>
-        </w:trPr>
-        <w:tc>
-          <w:tcPr>
-            <w:tcW w:type="dxa" w:w="2381"/>
-          </w:tcPr>
-          <w:p>
-            <w:pPr>
-              <w:pStyle w:val="LumisTabela"/>
-            </w:pPr>
-            <w:r>
-              <w:rPr>
-                <w:b/>
-              </w:rPr>
-              <w:t>1. Erro em campo por grupo</w:t>
-            </w:r>
-            <w:r>
-              <w:t xml:space="preserve"> (idade, CEP e cliente)</w:t>
-            </w:r>
-          </w:p>
-        </w:tc>
-        <w:tc>
-          <w:tcPr>
-            <w:tcW w:type="dxa" w:w="2268"/>
-          </w:tcPr>
-          <w:p>
-            <w:pPr>
-              <w:pStyle w:val="LumisTabela"/>
-            </w:pPr>
-            <w:r>
-              <w:t>Grupo com o dobro do erro do melhor grupo</w:t>
-            </w:r>
-          </w:p>
-        </w:tc>
-        <w:tc>
-          <w:tcPr>
-            <w:tcW w:type="dxa" w:w="2608"/>
-          </w:tcPr>
-          <w:p>
-            <w:pPr>
-              <w:pStyle w:val="LumisTabela"/>
-            </w:pPr>
-            <w:r>
-              <w:t>Suspender a recomendação automática no grupo; barrar versão que piore algum grupo</w:t>
-            </w:r>
-          </w:p>
-        </w:tc>
-        <w:tc>
-          <w:tcPr>
-            <w:tcW w:type="dxa" w:w="1814"/>
-          </w:tcPr>
-          <w:p>
-            <w:pPr>
-              <w:pStyle w:val="LumisTabela"/>
-            </w:pPr>
-            <w:r>
-              <w:t>Yuri Nakamura mede; a CEO decide</w:t>
-            </w:r>
-          </w:p>
-        </w:tc>
-      </w:tr>
-      <w:tr>
-        <w:trPr>
-          <w:cantSplit/>
-        </w:trPr>
-        <w:tc>
-          <w:tcPr>
-            <w:tcW w:type="dxa" w:w="2381"/>
-            <w:shd w:val="clear" w:color="auto" w:fill="F1F6F4"/>
-          </w:tcPr>
-          <w:p>
-            <w:pPr>
-              <w:pStyle w:val="LumisTabela"/>
-            </w:pPr>
-            <w:r>
-              <w:rPr>
-                <w:b/>
-              </w:rPr>
-              <w:t>2. Direito de uso dos dados</w:t>
-            </w:r>
-            <w:r>
-              <w:t xml:space="preserve"> (por contrato)</w:t>
-            </w:r>
-          </w:p>
-        </w:tc>
-        <w:tc>
-          <w:tcPr>
-            <w:tcW w:type="dxa" w:w="2268"/>
-            <w:shd w:val="clear" w:color="auto" w:fill="F1F6F4"/>
-          </w:tcPr>
-          <w:p>
-            <w:pPr>
-              <w:pStyle w:val="LumisTabela"/>
-            </w:pPr>
-            <w:r>
-              <w:t>Dado sem autorização e parecer jurídico; contrato a seis meses do fim</w:t>
-            </w:r>
-          </w:p>
-        </w:tc>
-        <w:tc>
-          <w:tcPr>
-            <w:tcW w:type="dxa" w:w="2608"/>
-            <w:shd w:val="clear" w:color="auto" w:fill="F1F6F4"/>
-          </w:tcPr>
-          <w:p>
-            <w:pPr>
-              <w:pStyle w:val="LumisTabela"/>
-            </w:pPr>
-            <w:r>
-              <w:t>O que entra no próximo treino; ordem de renegociação</w:t>
-            </w:r>
-          </w:p>
-        </w:tc>
-        <w:tc>
-          <w:tcPr>
-            <w:tcW w:type="dxa" w:w="1814"/>
-            <w:shd w:val="clear" w:color="auto" w:fill="F1F6F4"/>
-          </w:tcPr>
-          <w:p>
-            <w:pPr>
-              <w:pStyle w:val="LumisTabela"/>
-            </w:pPr>
-            <w:r>
-              <w:t>Ana Beatriz Rangel (DPO)</w:t>
-            </w:r>
-          </w:p>
-        </w:tc>
-      </w:tr>
-      <w:tr>
-        <w:trPr>
-          <w:cantSplit/>
-        </w:trPr>
-        <w:tc>
-          <w:tcPr>
-            <w:tcW w:type="dxa" w:w="2381"/>
-          </w:tcPr>
-          <w:p>
-            <w:pPr>
-              <w:pStyle w:val="LumisTabela"/>
-            </w:pPr>
-            <w:r>
-              <w:rPr>
-                <w:b/>
-              </w:rPr>
-              <w:t>3. Reclamações por faixa de CEP</w:t>
-            </w:r>
-          </w:p>
-        </w:tc>
-        <w:tc>
-          <w:tcPr>
-            <w:tcW w:type="dxa" w:w="2268"/>
-          </w:tcPr>
-          <w:p>
-            <w:pPr>
-              <w:pStyle w:val="LumisTabela"/>
-            </w:pPr>
-            <w:r>
-              <w:t>Grupo com uma vez e meia mais reclamações do que o seu peso na base</w:t>
-            </w:r>
-          </w:p>
-        </w:tc>
-        <w:tc>
-          <w:tcPr>
-            <w:tcW w:type="dxa" w:w="2608"/>
-          </w:tcPr>
-          <w:p>
-            <w:pPr>
-              <w:pStyle w:val="LumisTabela"/>
-            </w:pPr>
-            <w:r>
-              <w:t>Revisão clínica dos casos e análise do grupo no indicador 1</w:t>
-            </w:r>
-          </w:p>
-        </w:tc>
-        <w:tc>
-          <w:tcPr>
-            <w:tcW w:type="dxa" w:w="1814"/>
-          </w:tcPr>
-          <w:p>
-            <w:pPr>
-              <w:pStyle w:val="LumisTabela"/>
-            </w:pPr>
-            <w:r>
-              <w:t>Head of AI Management</w:t>
-            </w:r>
-          </w:p>
-        </w:tc>
-      </w:tr>
-      <w:tr>
-        <w:trPr>
-          <w:cantSplit/>
-        </w:trPr>
-        <w:tc>
-          <w:tcPr>
-            <w:tcW w:type="dxa" w:w="2381"/>
-            <w:shd w:val="clear" w:color="auto" w:fill="F1F6F4"/>
-          </w:tcPr>
-          <w:p>
-            <w:pPr>
-              <w:pStyle w:val="LumisTabela"/>
-            </w:pPr>
-            <w:r>
-              <w:rPr>
-                <w:b/>
-              </w:rPr>
-              <w:t>4. Incidentes descobertos antes do cliente</w:t>
-            </w:r>
-          </w:p>
-        </w:tc>
-        <w:tc>
-          <w:tcPr>
-            <w:tcW w:type="dxa" w:w="2268"/>
-            <w:shd w:val="clear" w:color="auto" w:fill="F1F6F4"/>
-          </w:tcPr>
-          <w:p>
-            <w:pPr>
-              <w:pStyle w:val="LumisTabela"/>
-            </w:pPr>
-            <w:r>
-              <w:t>Cliente descobre primeiro, ou incidente aberto há mais de 30 dias</w:t>
-            </w:r>
-          </w:p>
-        </w:tc>
-        <w:tc>
-          <w:tcPr>
-            <w:tcW w:type="dxa" w:w="2608"/>
-            <w:shd w:val="clear" w:color="auto" w:fill="F1F6F4"/>
-          </w:tcPr>
-          <w:p>
-            <w:pPr>
-              <w:pStyle w:val="LumisTabela"/>
-            </w:pPr>
-            <w:r>
-              <w:t>Rever o monitoramento; levar o caso ao conselho</w:t>
-            </w:r>
-          </w:p>
-        </w:tc>
-        <w:tc>
-          <w:tcPr>
-            <w:tcW w:type="dxa" w:w="1814"/>
-            <w:shd w:val="clear" w:color="auto" w:fill="F1F6F4"/>
-          </w:tcPr>
-          <w:p>
-            <w:pPr>
-              <w:pStyle w:val="LumisTabela"/>
-            </w:pPr>
-            <w:r>
-              <w:t>Head of AI Management</w:t>
-            </w:r>
-          </w:p>
-        </w:tc>
-      </w:tr>
-      <w:tr>
-        <w:trPr>
-          <w:cantSplit/>
-        </w:trPr>
-        <w:tc>
-          <w:tcPr>
-            <w:tcW w:type="dxa" w:w="2381"/>
-          </w:tcPr>
-          <w:p>
-            <w:pPr>
-              <w:pStyle w:val="LumisTabela"/>
-              <w:keepNext/>
-            </w:pPr>
-            <w:r>
-              <w:rPr>
-                <w:b/>
-              </w:rPr>
-              <w:t>5. Afirmações públicas auditáveis</w:t>
-            </w:r>
-          </w:p>
-        </w:tc>
-        <w:tc>
-          <w:tcPr>
-            <w:tcW w:type="dxa" w:w="2268"/>
-          </w:tcPr>
-          <w:p>
-            <w:pPr>
-              <w:pStyle w:val="LumisTabela"/>
-              <w:keepNext/>
-            </w:pPr>
-            <w:r>
-              <w:t>Afirmação que alguém de fora não consegue refazer</w:t>
-            </w:r>
-          </w:p>
-        </w:tc>
-        <w:tc>
-          <w:tcPr>
-            <w:tcW w:type="dxa" w:w="2608"/>
-          </w:tcPr>
-          <w:p>
-            <w:pPr>
-              <w:pStyle w:val="LumisTabela"/>
-              <w:keepNext/>
-            </w:pPr>
-            <w:r>
-              <w:t>Retirar do material antes da próxima apresentação</w:t>
-            </w:r>
-          </w:p>
-        </w:tc>
-        <w:tc>
-          <w:tcPr>
-            <w:tcW w:type="dxa" w:w="1814"/>
-          </w:tcPr>
-          <w:p>
-            <w:pPr>
-              <w:pStyle w:val="LumisTabela"/>
-              <w:keepNext/>
-            </w:pPr>
-            <w:r>
-              <w:t>Camila Torres propõe; Head of AI aprova</w:t>
-            </w:r>
-          </w:p>
-        </w:tc>
-      </w:tr>
-    </w:tbl>
-    <w:p>
-      <w:pPr>
-        <w:pStyle w:val="Legenda"/>
-      </w:pPr>
-      <w:r>
-        <w:t>Tabela 4. Os cinco indicadores. Valores de hoje, as quatro perguntas e os indicadores descartados estão no Anexo. Fonte: Cap. 2, Quadros 7, 10, 13, 14 e 17; propostas da equipe.</w:t>
-      </w:r>
-    </w:p>
-    <w:p>
-      <w:pPr/>
-      <w:r>
-        <w:t>Como a Lumis mede o erro do próprio produto, cada indicador tem conferência de fora: o cliente refaz a conta do próprio grupo, como o Vila Ipê já fez, e um auditor confere a cada trimestre. Para a revisão quinzenal ter casos suficientes, a revisão humana sobe de 2% para 10% nos grupos críticos. O NIST pede que todo sistema de IA tenha responsável e meio definidos para ser desligado⁴.</w:t>
+        <w:t>No lugar delas, propomos cinco indicadores. Cada um muda uma decisão concreta e se abre por grupo. Como a Lumis mede o erro do próprio produto, cada um tem alguém de fora que confere.</w:t>
       </w:r>
     </w:p>
     <w:p>
@@ -1854,16 +443,55 @@
         <w:t>A decisão de agora.</w:t>
       </w:r>
       <w:r>
-        <w:t xml:space="preserve"> Dois grupos já passam do ponto de ação do indicador 1: idosos de CEP C e de CEP D/E. Pelo nosso compromisso de Não Amplificação de Danos (C2), o uso é suspenso até a correção quando há padrão de viés. Por isso recomendamos restringir já a recomendação automática nesses grupos (D-026). Cerca de um quarto das decisões de priorização volta à triagem do próprio hospital, enquanto o modelo segue rodando em paralelo, sem decidir, para medir a correção. Quanto isso pesa em cada hospital </w:t>
+        <w:t xml:space="preserve"> Dois grupos já passam do limite do indicador 1, o dobro do erro do melhor grupo: idosos de CEP C e de CEP D/E. O compromisso de Não Amplificação de Danos, da nossa Declaração de Intenção, manda suspender o uso até a correção quando há padrão de viés. Por isso recomendamos restringir já a recomendação automática nesses grupos. Cerca de um quarto das decisões volta à triagem do hospital, e o modelo segue rodando em paralelo para medir a correção. A Entrega 3 define quem executa a restrição.</w:t>
       </w:r>
+    </w:p>
+    <w:p>
+      <w:pPr>
+        <w:keepNext/>
+        <w:jc w:val="center"/>
+      </w:pPr>
       <w:r>
-        <w:rPr>
-          <w:rStyle w:val="TagNoconsta"/>
-        </w:rPr>
-        <w:t>[não consta]</w:t>
+        <w:drawing>
+          <wp:inline xmlns:a="http://schemas.openxmlformats.org/drawingml/2006/main" xmlns:pic="http://schemas.openxmlformats.org/drawingml/2006/picture">
+            <wp:extent cx="5760000" cy="3688819"/>
+            <wp:docPr id="5" name="Picture 5"/>
+            <wp:cNvGraphicFramePr>
+              <a:graphicFrameLocks noChangeAspect="1"/>
+            </wp:cNvGraphicFramePr>
+            <a:graphic>
+              <a:graphicData uri="http://schemas.openxmlformats.org/drawingml/2006/picture">
+                <pic:pic>
+                  <pic:nvPicPr>
+                    <pic:cNvPr id="0" name="v2_fig5_indicadores.png"/>
+                    <pic:cNvPicPr/>
+                  </pic:nvPicPr>
+                  <pic:blipFill>
+                    <a:blip r:embed="rId22"/>
+                    <a:stretch>
+                      <a:fillRect/>
+                    </a:stretch>
+                  </pic:blipFill>
+                  <pic:spPr>
+                    <a:xfrm>
+                      <a:off x="0" y="0"/>
+                      <a:ext cx="5760000" cy="3688819"/>
+                    </a:xfrm>
+                    <a:prstGeom prst="rect"/>
+                  </pic:spPr>
+                </pic:pic>
+              </a:graphicData>
+            </a:graphic>
+          </wp:inline>
+        </w:drawing>
       </w:r>
+    </w:p>
+    <w:p>
+      <w:pPr>
+        <w:pStyle w:val="Legenda"/>
+      </w:pPr>
       <w:r>
-        <w:t>, e a Entrega 3 define quem executa a restrição.</w:t>
+        <w:t>Figura 5. Os cinco indicadores e as quatro perguntas. Os limites que disparam cada decisão são proposta da equipe. Fonte: Cap. 2, Quadros 7, 10, 14 e 17.</w:t>
       </w:r>
     </w:p>
     <w:p>
@@ -1877,7 +505,7 @@
     <w:p>
       <w:pPr/>
       <w:r>
-        <w:t>A base de clientes só vira vantagem difícil de copiar quando tiver direito de uso limpo e erro por grupo que alguém de fora consiga refazer, como a Entrega 1 já apontava. Por isso, o memorando leva três condições prévias ao aporte: regularizar os contratos antes do vencimento, tirar do mercado os números que não se sustentam e medir o erro por grupo com conferência externa.</w:t>
+        <w:t>A base de clientes só vira vantagem difícil de copiar quando tiver direito de uso limpo e erro por grupo que alguém de fora consiga refazer. Por isso, o memorando leva três condições prévias ao aporte: regularizar os contratos antes do vencimento, tirar do mercado os números que não se sustentam e medir o erro por grupo com conferência externa.</w:t>
       </w:r>
     </w:p>
     <w:p>
@@ -1901,7 +529,7 @@
         <w:pStyle w:val="LumisNota"/>
       </w:pPr>
       <w:r>
-        <w:t>2. BRASIL. Lei nº 13.709/2018 (LGPD), arts. 5º, 6º, 11 e 52. Consulta em 06/10/2026.</w:t>
+        <w:t>2. BRASIL. Lei nº 13.709/2018 (LGPD), arts. 5º, 6º e 11. Consulta em 06/10/2026.</w:t>
       </w:r>
     </w:p>
     <w:p>
@@ -1917,1583 +545,7 @@
         <w:pStyle w:val="LumisNota"/>
       </w:pPr>
       <w:r>
-        <w:t>4. NIST. Artificial Intelligence Risk Management Framework (AI RMF 1.0). NIST AI 100-1, 2023.</w:t>
-      </w:r>
-    </w:p>
-    <w:p>
-      <w:pPr>
-        <w:pStyle w:val="LumisNota"/>
-      </w:pPr>
-      <w:r>
-        <w:t>Dados da Lumis: Cap. 2, Anexo A. Contas e propostas são da equipe. As empresas reais citadas são análogos e não fazem parte do caso Lumis.</w:t>
-      </w:r>
-    </w:p>
-    <w:p>
-      <w:pPr>
-        <w:pStyle w:val="Ttulo1"/>
-        <w:pageBreakBefore/>
-      </w:pPr>
-      <w:r>
-        <w:t>Anexo: as quatro perguntas</w:t>
-      </w:r>
-    </w:p>
-    <w:p>
-      <w:pPr>
-        <w:pStyle w:val="Ttulo2"/>
-      </w:pPr>
-      <w:r>
-        <w:t>A1. As quatro perguntas aplicadas às afirmações do mercado</w:t>
-      </w:r>
-    </w:p>
-    <w:tbl>
-      <w:tblPr>
-        <w:tblW w:type="auto" w:w="0"/>
-        <w:jc w:val="center"/>
-        <w:tblLayout w:type="fixed"/>
-        <w:tblLook w:firstColumn="1" w:firstRow="1" w:lastColumn="0" w:lastRow="0" w:noHBand="0" w:noVBand="1" w:val="04A0"/>
-        <w:tblBorders>
-          <w:top w:val="single" w:sz="4" w:color="D3DEDB"/>
-          <w:bottom w:val="single" w:sz="4" w:color="D3DEDB"/>
-          <w:insideH w:val="single" w:sz="4" w:color="D3DEDB"/>
-        </w:tblBorders>
-        <w:tblLayout w:type="fixed"/>
-      </w:tblPr>
-      <w:tblGrid>
-        <w:gridCol w:w="1587"/>
-        <w:gridCol w:w="1927"/>
-        <w:gridCol w:w="1814"/>
-        <w:gridCol w:w="1701"/>
-        <w:gridCol w:w="2041"/>
-      </w:tblGrid>
-      <w:tr>
-        <w:trPr>
-          <w:tblHeader w:val="true"/>
-          <w:cantSplit/>
-        </w:trPr>
-        <w:tc>
-          <w:tcPr>
-            <w:tcW w:type="dxa" w:w="1587"/>
-            <w:shd w:val="clear" w:color="auto" w:fill="0F2D3A"/>
-          </w:tcPr>
-          <w:p>
-            <w:pPr>
-              <w:pStyle w:val="LumisTabela"/>
-              <w:keepNext/>
-            </w:pPr>
-            <w:r>
-              <w:rPr>
-                <w:b/>
-                <w:color w:val="FFFFFF"/>
-              </w:rPr>
-              <w:t>Afirmação</w:t>
-            </w:r>
-          </w:p>
-        </w:tc>
-        <w:tc>
-          <w:tcPr>
-            <w:tcW w:type="dxa" w:w="1928"/>
-            <w:shd w:val="clear" w:color="auto" w:fill="0F2D3A"/>
-          </w:tcPr>
-          <w:p>
-            <w:pPr>
-              <w:pStyle w:val="LumisTabela"/>
-              <w:keepNext/>
-            </w:pPr>
-            <w:r>
-              <w:rPr>
-                <w:b/>
-                <w:color w:val="FFFFFF"/>
-              </w:rPr>
-              <w:t>Medida em quê?</w:t>
-            </w:r>
-          </w:p>
-        </w:tc>
-        <w:tc>
-          <w:tcPr>
-            <w:tcW w:type="dxa" w:w="1814"/>
-            <w:shd w:val="clear" w:color="auto" w:fill="0F2D3A"/>
-          </w:tcPr>
-          <w:p>
-            <w:pPr>
-              <w:pStyle w:val="LumisTabela"/>
-              <w:keepNext/>
-            </w:pPr>
-            <w:r>
-              <w:rPr>
-                <w:b/>
-                <w:color w:val="FFFFFF"/>
-              </w:rPr>
-              <w:t>Medida por quem?</w:t>
-            </w:r>
-          </w:p>
-        </w:tc>
-        <w:tc>
-          <w:tcPr>
-            <w:tcW w:type="dxa" w:w="1701"/>
-            <w:shd w:val="clear" w:color="auto" w:fill="0F2D3A"/>
-          </w:tcPr>
-          <w:p>
-            <w:pPr>
-              <w:pStyle w:val="LumisTabela"/>
-              <w:keepNext/>
-            </w:pPr>
-            <w:r>
-              <w:rPr>
-                <w:b/>
-                <w:color w:val="FFFFFF"/>
-              </w:rPr>
-              <w:t>Muda alguma decisão?</w:t>
-            </w:r>
-          </w:p>
-        </w:tc>
-        <w:tc>
-          <w:tcPr>
-            <w:tcW w:type="dxa" w:w="2041"/>
-            <w:shd w:val="clear" w:color="auto" w:fill="0F2D3A"/>
-          </w:tcPr>
-          <w:p>
-            <w:pPr>
-              <w:pStyle w:val="LumisTabela"/>
-              <w:keepNext/>
-            </w:pPr>
-            <w:r>
-              <w:rPr>
-                <w:b/>
-                <w:color w:val="FFFFFF"/>
-              </w:rPr>
-              <w:t>Esconde qual distribuição?</w:t>
-            </w:r>
-          </w:p>
-        </w:tc>
-      </w:tr>
-      <w:tr>
-        <w:trPr>
-          <w:cantSplit/>
-        </w:trPr>
-        <w:tc>
-          <w:tcPr>
-            <w:tcW w:type="dxa" w:w="1587"/>
-          </w:tcPr>
-          <w:p>
-            <w:pPr>
-              <w:pStyle w:val="LumisTabela"/>
-            </w:pPr>
-            <w:r>
-              <w:t>Acurácia de 94%</w:t>
-            </w:r>
-          </w:p>
-        </w:tc>
-        <w:tc>
-          <w:tcPr>
-            <w:tcW w:type="dxa" w:w="1928"/>
-          </w:tcPr>
-          <w:p>
-            <w:pPr>
-              <w:pStyle w:val="LumisTabela"/>
-            </w:pPr>
-            <w:r>
-              <w:t>48 mil registros de 2023, dois hospitais da mesma região</w:t>
-            </w:r>
-          </w:p>
-        </w:tc>
-        <w:tc>
-          <w:tcPr>
-            <w:tcW w:type="dxa" w:w="1814"/>
-          </w:tcPr>
-          <w:p>
-            <w:pPr>
-              <w:pStyle w:val="LumisTabela"/>
-            </w:pPr>
-            <w:r>
-              <w:t xml:space="preserve">Quem apurou </w:t>
-            </w:r>
-            <w:r>
-              <w:rPr>
-                <w:rStyle w:val="TagNoconsta"/>
-              </w:rPr>
-              <w:t>[não consta]</w:t>
-            </w:r>
-          </w:p>
-        </w:tc>
-        <w:tc>
-          <w:tcPr>
-            <w:tcW w:type="dxa" w:w="1701"/>
-          </w:tcPr>
-          <w:p>
-            <w:pPr>
-              <w:pStyle w:val="LumisTabela"/>
-            </w:pPr>
-            <w:r>
-              <w:t>Não. Virou discurso comercial</w:t>
-            </w:r>
-          </w:p>
-        </w:tc>
-        <w:tc>
-          <w:tcPr>
-            <w:tcW w:type="dxa" w:w="2041"/>
-          </w:tcPr>
-          <w:p>
-            <w:pPr>
-              <w:pStyle w:val="LumisTabela"/>
-            </w:pPr>
-            <w:r>
-              <w:t>O erro em campo e os grupos: 31,8% no pior</w:t>
-            </w:r>
-          </w:p>
-        </w:tc>
-      </w:tr>
-      <w:tr>
-        <w:trPr>
-          <w:cantSplit/>
-        </w:trPr>
-        <w:tc>
-          <w:tcPr>
-            <w:tcW w:type="dxa" w:w="1587"/>
-            <w:shd w:val="clear" w:color="auto" w:fill="F1F6F4"/>
-          </w:tcPr>
-          <w:p>
-            <w:pPr>
-              <w:pStyle w:val="LumisTabela"/>
-            </w:pPr>
-            <w:r>
-              <w:t>Redução de 30% na triagem</w:t>
-            </w:r>
-          </w:p>
-        </w:tc>
-        <w:tc>
-          <w:tcPr>
-            <w:tcW w:type="dxa" w:w="1928"/>
-            <w:shd w:val="clear" w:color="auto" w:fill="F1F6F4"/>
-          </w:tcPr>
-          <w:p>
-            <w:pPr>
-              <w:pStyle w:val="LumisTabela"/>
-            </w:pPr>
-            <w:r>
-              <w:t>Seis semanas, um hospital, sem comparação</w:t>
-            </w:r>
-          </w:p>
-        </w:tc>
-        <w:tc>
-          <w:tcPr>
-            <w:tcW w:type="dxa" w:w="1814"/>
-            <w:shd w:val="clear" w:color="auto" w:fill="F1F6F4"/>
-          </w:tcPr>
-          <w:p>
-            <w:pPr>
-              <w:pStyle w:val="LumisTabela"/>
-            </w:pPr>
-            <w:r>
-              <w:rPr>
-                <w:rStyle w:val="TagNoconsta"/>
-              </w:rPr>
-              <w:t>[não consta]</w:t>
-            </w:r>
-          </w:p>
-        </w:tc>
-        <w:tc>
-          <w:tcPr>
-            <w:tcW w:type="dxa" w:w="1701"/>
-            <w:shd w:val="clear" w:color="auto" w:fill="F1F6F4"/>
-          </w:tcPr>
-          <w:p>
-            <w:pPr>
-              <w:pStyle w:val="LumisTabela"/>
-            </w:pPr>
-            <w:r>
-              <w:t>Não, sem comparação</w:t>
-            </w:r>
-          </w:p>
-        </w:tc>
-        <w:tc>
-          <w:tcPr>
-            <w:tcW w:type="dxa" w:w="2041"/>
-            <w:shd w:val="clear" w:color="auto" w:fill="F1F6F4"/>
-          </w:tcPr>
-          <w:p>
-            <w:pPr>
-              <w:pStyle w:val="LumisTabela"/>
-            </w:pPr>
-            <w:r>
-              <w:t>Não abre por grupo nem por hospital</w:t>
-            </w:r>
-          </w:p>
-        </w:tc>
-      </w:tr>
-      <w:tr>
-        <w:trPr>
-          <w:cantSplit/>
-        </w:trPr>
-        <w:tc>
-          <w:tcPr>
-            <w:tcW w:type="dxa" w:w="1587"/>
-          </w:tcPr>
-          <w:p>
-            <w:pPr>
-              <w:pStyle w:val="LumisTabela"/>
-            </w:pPr>
-            <w:r>
-              <w:t>5 milhões de vidas</w:t>
-            </w:r>
-          </w:p>
-        </w:tc>
-        <w:tc>
-          <w:tcPr>
-            <w:tcW w:type="dxa" w:w="1928"/>
-          </w:tcPr>
-          <w:p>
-            <w:pPr>
-              <w:pStyle w:val="LumisTabela"/>
-            </w:pPr>
-            <w:r>
-              <w:t>Registros processados, com repetição</w:t>
-            </w:r>
-          </w:p>
-        </w:tc>
-        <w:tc>
-          <w:tcPr>
-            <w:tcW w:type="dxa" w:w="1814"/>
-          </w:tcPr>
-          <w:p>
-            <w:pPr>
-              <w:pStyle w:val="LumisTabela"/>
-            </w:pPr>
-            <w:r>
-              <w:t>Duplicidade achada pela auditoria interna em 01/2026</w:t>
-            </w:r>
-          </w:p>
-        </w:tc>
-        <w:tc>
-          <w:tcPr>
-            <w:tcW w:type="dxa" w:w="1701"/>
-          </w:tcPr>
-          <w:p>
-            <w:pPr>
-              <w:pStyle w:val="LumisTabela"/>
-            </w:pPr>
-            <w:r>
-              <w:t>Não. É volume</w:t>
-            </w:r>
-          </w:p>
-        </w:tc>
-        <w:tc>
-          <w:tcPr>
-            <w:tcW w:type="dxa" w:w="2041"/>
-          </w:tcPr>
-          <w:p>
-            <w:pPr>
-              <w:pStyle w:val="LumisTabela"/>
-            </w:pPr>
-            <w:r>
-              <w:t xml:space="preserve">Quantas pessoas únicas há </w:t>
-            </w:r>
-            <w:r>
-              <w:rPr>
-                <w:rStyle w:val="TagNoconsta"/>
-              </w:rPr>
-              <w:t>[não consta]</w:t>
-            </w:r>
-          </w:p>
-        </w:tc>
-      </w:tr>
-      <w:tr>
-        <w:trPr>
-          <w:cantSplit/>
-        </w:trPr>
-        <w:tc>
-          <w:tcPr>
-            <w:tcW w:type="dxa" w:w="1587"/>
-            <w:shd w:val="clear" w:color="auto" w:fill="F1F6F4"/>
-          </w:tcPr>
-          <w:p>
-            <w:pPr>
-              <w:pStyle w:val="LumisTabela"/>
-            </w:pPr>
-            <w:r>
-              <w:t>NPS 72</w:t>
-            </w:r>
-          </w:p>
-        </w:tc>
-        <w:tc>
-          <w:tcPr>
-            <w:tcW w:type="dxa" w:w="1928"/>
-            <w:shd w:val="clear" w:color="auto" w:fill="F1F6F4"/>
-          </w:tcPr>
-          <w:p>
-            <w:pPr>
-              <w:pStyle w:val="LumisTabela"/>
-            </w:pPr>
-            <w:r>
-              <w:t>9 respondentes</w:t>
-            </w:r>
-          </w:p>
-        </w:tc>
-        <w:tc>
-          <w:tcPr>
-            <w:tcW w:type="dxa" w:w="1814"/>
-            <w:shd w:val="clear" w:color="auto" w:fill="F1F6F4"/>
-          </w:tcPr>
-          <w:p>
-            <w:pPr>
-              <w:pStyle w:val="LumisTabela"/>
-            </w:pPr>
-            <w:r>
-              <w:t>Escolhidos pelo comercial</w:t>
-            </w:r>
-          </w:p>
-        </w:tc>
-        <w:tc>
-          <w:tcPr>
-            <w:tcW w:type="dxa" w:w="1701"/>
-            <w:shd w:val="clear" w:color="auto" w:fill="F1F6F4"/>
-          </w:tcPr>
-          <w:p>
-            <w:pPr>
-              <w:pStyle w:val="LumisTabela"/>
-            </w:pPr>
-            <w:r>
-              <w:t>Não</w:t>
-            </w:r>
-          </w:p>
-        </w:tc>
-        <w:tc>
-          <w:tcPr>
-            <w:tcW w:type="dxa" w:w="2041"/>
-            <w:shd w:val="clear" w:color="auto" w:fill="F1F6F4"/>
-          </w:tcPr>
-          <w:p>
-            <w:pPr>
-              <w:pStyle w:val="LumisTabela"/>
-            </w:pPr>
-            <w:r>
-              <w:t>As 38 contas e as 74 reclamações</w:t>
-            </w:r>
-          </w:p>
-        </w:tc>
-      </w:tr>
-      <w:tr>
-        <w:trPr>
-          <w:cantSplit/>
-        </w:trPr>
-        <w:tc>
-          <w:tcPr>
-            <w:tcW w:type="dxa" w:w="1587"/>
-          </w:tcPr>
-          <w:p>
-            <w:pPr>
-              <w:pStyle w:val="LumisTabela"/>
-              <w:keepNext/>
-            </w:pPr>
-            <w:r>
-              <w:t>Disponibilidade de 99,9%</w:t>
-            </w:r>
-          </w:p>
-        </w:tc>
-        <w:tc>
-          <w:tcPr>
-            <w:tcW w:type="dxa" w:w="1928"/>
-          </w:tcPr>
-          <w:p>
-            <w:pPr>
-              <w:pStyle w:val="LumisTabela"/>
-              <w:keepNext/>
-            </w:pPr>
-            <w:r>
-              <w:t>Só a interface técnica</w:t>
-            </w:r>
-          </w:p>
-        </w:tc>
-        <w:tc>
-          <w:tcPr>
-            <w:tcW w:type="dxa" w:w="1814"/>
-          </w:tcPr>
-          <w:p>
-            <w:pPr>
-              <w:pStyle w:val="LumisTabela"/>
-              <w:keepNext/>
-            </w:pPr>
-            <w:r>
-              <w:rPr>
-                <w:rStyle w:val="TagNoconsta"/>
-              </w:rPr>
-              <w:t>[não consta]</w:t>
-            </w:r>
-          </w:p>
-        </w:tc>
-        <w:tc>
-          <w:tcPr>
-            <w:tcW w:type="dxa" w:w="1701"/>
-          </w:tcPr>
-          <w:p>
-            <w:pPr>
-              <w:pStyle w:val="LumisTabela"/>
-              <w:keepNext/>
-            </w:pPr>
-            <w:r>
-              <w:t>Pouco. É operacional</w:t>
-            </w:r>
-          </w:p>
-        </w:tc>
-        <w:tc>
-          <w:tcPr>
-            <w:tcW w:type="dxa" w:w="2041"/>
-          </w:tcPr>
-          <w:p>
-            <w:pPr>
-              <w:pStyle w:val="LumisTabela"/>
-              <w:keepNext/>
-            </w:pPr>
-            <w:r>
-              <w:t>O serviço completo e a qualidade da resposta</w:t>
-            </w:r>
-          </w:p>
-        </w:tc>
-      </w:tr>
-    </w:tbl>
-    <w:p>
-      <w:pPr>
-        <w:pStyle w:val="Legenda"/>
-      </w:pPr>
-      <w:r>
-        <w:t>Tabela A1. Fonte: Cap. 2, Quadros 9, 11, 14 e 17; as quatro perguntas: Cap. 2, 2.3.</w:t>
-      </w:r>
-    </w:p>
-    <w:p>
-      <w:pPr>
-        <w:pStyle w:val="Ttulo2"/>
-      </w:pPr>
-      <w:r>
-        <w:t>A2. As quatro perguntas aplicadas aos indicadores propostos</w:t>
-      </w:r>
-    </w:p>
-    <w:tbl>
-      <w:tblPr>
-        <w:tblW w:type="auto" w:w="0"/>
-        <w:jc w:val="center"/>
-        <w:tblLayout w:type="fixed"/>
-        <w:tblLook w:firstColumn="1" w:firstRow="1" w:lastColumn="0" w:lastRow="0" w:noHBand="0" w:noVBand="1" w:val="04A0"/>
-        <w:tblBorders>
-          <w:top w:val="single" w:sz="4" w:color="D3DEDB"/>
-          <w:bottom w:val="single" w:sz="4" w:color="D3DEDB"/>
-          <w:insideH w:val="single" w:sz="4" w:color="D3DEDB"/>
-        </w:tblBorders>
-        <w:tblLayout w:type="fixed"/>
-      </w:tblPr>
-      <w:tblGrid>
-        <w:gridCol w:w="1814"/>
-        <w:gridCol w:w="1814"/>
-        <w:gridCol w:w="1927"/>
-        <w:gridCol w:w="1587"/>
-        <w:gridCol w:w="1927"/>
-      </w:tblGrid>
-      <w:tr>
-        <w:trPr>
-          <w:tblHeader w:val="true"/>
-          <w:cantSplit/>
-        </w:trPr>
-        <w:tc>
-          <w:tcPr>
-            <w:tcW w:type="dxa" w:w="1814"/>
-            <w:shd w:val="clear" w:color="auto" w:fill="0F2D3A"/>
-          </w:tcPr>
-          <w:p>
-            <w:pPr>
-              <w:pStyle w:val="LumisTabela"/>
-              <w:keepNext/>
-            </w:pPr>
-            <w:r>
-              <w:rPr>
-                <w:b/>
-                <w:color w:val="FFFFFF"/>
-              </w:rPr>
-              <w:t>Indicador e valor de hoje</w:t>
-            </w:r>
-          </w:p>
-        </w:tc>
-        <w:tc>
-          <w:tcPr>
-            <w:tcW w:type="dxa" w:w="1814"/>
-            <w:shd w:val="clear" w:color="auto" w:fill="0F2D3A"/>
-          </w:tcPr>
-          <w:p>
-            <w:pPr>
-              <w:pStyle w:val="LumisTabela"/>
-              <w:keepNext/>
-            </w:pPr>
-            <w:r>
-              <w:rPr>
-                <w:b/>
-                <w:color w:val="FFFFFF"/>
-              </w:rPr>
-              <w:t>Medida em quê?</w:t>
-            </w:r>
-          </w:p>
-        </w:tc>
-        <w:tc>
-          <w:tcPr>
-            <w:tcW w:type="dxa" w:w="1928"/>
-            <w:shd w:val="clear" w:color="auto" w:fill="0F2D3A"/>
-          </w:tcPr>
-          <w:p>
-            <w:pPr>
-              <w:pStyle w:val="LumisTabela"/>
-              <w:keepNext/>
-            </w:pPr>
-            <w:r>
-              <w:rPr>
-                <w:b/>
-                <w:color w:val="FFFFFF"/>
-              </w:rPr>
-              <w:t>Medida por quem?</w:t>
-            </w:r>
-          </w:p>
-        </w:tc>
-        <w:tc>
-          <w:tcPr>
-            <w:tcW w:type="dxa" w:w="1587"/>
-            <w:shd w:val="clear" w:color="auto" w:fill="0F2D3A"/>
-          </w:tcPr>
-          <w:p>
-            <w:pPr>
-              <w:pStyle w:val="LumisTabela"/>
-              <w:keepNext/>
-            </w:pPr>
-            <w:r>
-              <w:rPr>
-                <w:b/>
-                <w:color w:val="FFFFFF"/>
-              </w:rPr>
-              <w:t>Muda alguma decisão?</w:t>
-            </w:r>
-          </w:p>
-        </w:tc>
-        <w:tc>
-          <w:tcPr>
-            <w:tcW w:type="dxa" w:w="1928"/>
-            <w:shd w:val="clear" w:color="auto" w:fill="0F2D3A"/>
-          </w:tcPr>
-          <w:p>
-            <w:pPr>
-              <w:pStyle w:val="LumisTabela"/>
-              <w:keepNext/>
-            </w:pPr>
-            <w:r>
-              <w:rPr>
-                <w:b/>
-                <w:color w:val="FFFFFF"/>
-              </w:rPr>
-              <w:t>Esconde qual distribuição?</w:t>
-            </w:r>
-          </w:p>
-        </w:tc>
-      </w:tr>
-      <w:tr>
-        <w:trPr>
-          <w:cantSplit/>
-        </w:trPr>
-        <w:tc>
-          <w:tcPr>
-            <w:tcW w:type="dxa" w:w="1814"/>
-          </w:tcPr>
-          <w:p>
-            <w:pPr>
-              <w:pStyle w:val="LumisTabela"/>
-            </w:pPr>
-            <w:r>
-              <w:t>1. Erro por grupo: pior grupo 3,0 vezes o melhor</w:t>
-            </w:r>
-          </w:p>
-        </w:tc>
-        <w:tc>
-          <w:tcPr>
-            <w:tcW w:type="dxa" w:w="1814"/>
-          </w:tcPr>
-          <w:p>
-            <w:pPr>
-              <w:pStyle w:val="LumisTabela"/>
-            </w:pPr>
-            <w:r>
-              <w:t>Revisão humana (10% nos grupos críticos) e desfecho do cliente</w:t>
-            </w:r>
-          </w:p>
-        </w:tc>
-        <w:tc>
-          <w:tcPr>
-            <w:tcW w:type="dxa" w:w="1928"/>
-          </w:tcPr>
-          <w:p>
-            <w:pPr>
-              <w:pStyle w:val="LumisTabela"/>
-            </w:pPr>
-            <w:r>
-              <w:t>Pela Lumis. Cliente e auditor refazem</w:t>
-            </w:r>
-          </w:p>
-        </w:tc>
-        <w:tc>
-          <w:tcPr>
-            <w:tcW w:type="dxa" w:w="1587"/>
-          </w:tcPr>
-          <w:p>
-            <w:pPr>
-              <w:pStyle w:val="LumisTabela"/>
-            </w:pPr>
-            <w:r>
-              <w:t>Sim: restrição de grupo e liberação de versão</w:t>
-            </w:r>
-          </w:p>
-        </w:tc>
-        <w:tc>
-          <w:tcPr>
-            <w:tcW w:type="dxa" w:w="1928"/>
-          </w:tcPr>
-          <w:p>
-            <w:pPr>
-              <w:pStyle w:val="LumisTabela"/>
-            </w:pPr>
-            <w:r>
-              <w:t>Diferenças por cliente; grupos que o caso não abre, como sexo</w:t>
-            </w:r>
-          </w:p>
-        </w:tc>
-      </w:tr>
-      <w:tr>
-        <w:trPr>
-          <w:cantSplit/>
-        </w:trPr>
-        <w:tc>
-          <w:tcPr>
-            <w:tcW w:type="dxa" w:w="1814"/>
-            <w:shd w:val="clear" w:color="auto" w:fill="F1F6F4"/>
-          </w:tcPr>
-          <w:p>
-            <w:pPr>
-              <w:pStyle w:val="LumisTabela"/>
-            </w:pPr>
-            <w:r>
-              <w:t>2. Direito de uso: 0% com parecer jurídico</w:t>
-            </w:r>
-          </w:p>
-        </w:tc>
-        <w:tc>
-          <w:tcPr>
-            <w:tcW w:type="dxa" w:w="1814"/>
-            <w:shd w:val="clear" w:color="auto" w:fill="F1F6F4"/>
-          </w:tcPr>
-          <w:p>
-            <w:pPr>
-              <w:pStyle w:val="LumisTabela"/>
-            </w:pPr>
-            <w:r>
-              <w:t>Contratos contra a base de treino</w:t>
-            </w:r>
-          </w:p>
-        </w:tc>
-        <w:tc>
-          <w:tcPr>
-            <w:tcW w:type="dxa" w:w="1928"/>
-            <w:shd w:val="clear" w:color="auto" w:fill="F1F6F4"/>
-          </w:tcPr>
-          <w:p>
-            <w:pPr>
-              <w:pStyle w:val="LumisTabela"/>
-            </w:pPr>
-            <w:r>
-              <w:t>Pela DPO. Parecer externo confere</w:t>
-            </w:r>
-          </w:p>
-        </w:tc>
-        <w:tc>
-          <w:tcPr>
-            <w:tcW w:type="dxa" w:w="1587"/>
-            <w:shd w:val="clear" w:color="auto" w:fill="F1F6F4"/>
-          </w:tcPr>
-          <w:p>
-            <w:pPr>
-              <w:pStyle w:val="LumisTabela"/>
-            </w:pPr>
-            <w:r>
-              <w:t>Sim: treino e renegociação</w:t>
-            </w:r>
-          </w:p>
-        </w:tc>
-        <w:tc>
-          <w:tcPr>
-            <w:tcW w:type="dxa" w:w="1928"/>
-            <w:shd w:val="clear" w:color="auto" w:fill="F1F6F4"/>
-          </w:tcPr>
-          <w:p>
-            <w:pPr>
-              <w:pStyle w:val="LumisTabela"/>
-            </w:pPr>
-            <w:r>
-              <w:t>A concentração na Sanare e o período antes do contrato</w:t>
-            </w:r>
-          </w:p>
-        </w:tc>
-      </w:tr>
-      <w:tr>
-        <w:trPr>
-          <w:cantSplit/>
-        </w:trPr>
-        <w:tc>
-          <w:tcPr>
-            <w:tcW w:type="dxa" w:w="1814"/>
-          </w:tcPr>
-          <w:p>
-            <w:pPr>
-              <w:pStyle w:val="LumisTabela"/>
-            </w:pPr>
-            <w:r>
-              <w:t>3. Reclamações: CEP D/E com 2,5 vezes o seu peso</w:t>
-            </w:r>
-          </w:p>
-        </w:tc>
-        <w:tc>
-          <w:tcPr>
-            <w:tcW w:type="dxa" w:w="1814"/>
-          </w:tcPr>
-          <w:p>
-            <w:pPr>
-              <w:pStyle w:val="LumisTabela"/>
-            </w:pPr>
-            <w:r>
-              <w:t>Registro formal, janela de 90 dias</w:t>
-            </w:r>
-          </w:p>
-        </w:tc>
-        <w:tc>
-          <w:tcPr>
-            <w:tcW w:type="dxa" w:w="1928"/>
-          </w:tcPr>
-          <w:p>
-            <w:pPr>
-              <w:pStyle w:val="LumisTabela"/>
-            </w:pPr>
-            <w:r>
-              <w:t xml:space="preserve">Time de sucesso do cliente, cargo </w:t>
-            </w:r>
-            <w:r>
-              <w:rPr>
-                <w:rStyle w:val="TagNoconsta"/>
-              </w:rPr>
-              <w:t>[não consta]</w:t>
-            </w:r>
-            <w:r>
-              <w:t>. O cliente confere</w:t>
-            </w:r>
-          </w:p>
-        </w:tc>
-        <w:tc>
-          <w:tcPr>
-            <w:tcW w:type="dxa" w:w="1587"/>
-          </w:tcPr>
-          <w:p>
-            <w:pPr>
-              <w:pStyle w:val="LumisTabela"/>
-            </w:pPr>
-            <w:r>
-              <w:t>Sim: revisão clínica</w:t>
-            </w:r>
-          </w:p>
-        </w:tc>
-        <w:tc>
-          <w:tcPr>
-            <w:tcW w:type="dxa" w:w="1928"/>
-          </w:tcPr>
-          <w:p>
-            <w:pPr>
-              <w:pStyle w:val="LumisTabela"/>
-            </w:pPr>
-            <w:r>
-              <w:t>Quem não reclama</w:t>
-            </w:r>
-          </w:p>
-        </w:tc>
-      </w:tr>
-      <w:tr>
-        <w:trPr>
-          <w:cantSplit/>
-        </w:trPr>
-        <w:tc>
-          <w:tcPr>
-            <w:tcW w:type="dxa" w:w="1814"/>
-            <w:shd w:val="clear" w:color="auto" w:fill="F1F6F4"/>
-          </w:tcPr>
-          <w:p>
-            <w:pPr>
-              <w:pStyle w:val="LumisTabela"/>
-            </w:pPr>
-            <w:r>
-              <w:t>4. Incidentes: 2 de 4 descobertos pelo cliente</w:t>
-            </w:r>
-          </w:p>
-        </w:tc>
-        <w:tc>
-          <w:tcPr>
-            <w:tcW w:type="dxa" w:w="1814"/>
-            <w:shd w:val="clear" w:color="auto" w:fill="F1F6F4"/>
-          </w:tcPr>
-          <w:p>
-            <w:pPr>
-              <w:pStyle w:val="LumisTabela"/>
-            </w:pPr>
-            <w:r>
-              <w:t>Registro de incidentes e notificações dos clientes</w:t>
-            </w:r>
-          </w:p>
-        </w:tc>
-        <w:tc>
-          <w:tcPr>
-            <w:tcW w:type="dxa" w:w="1928"/>
-            <w:shd w:val="clear" w:color="auto" w:fill="F1F6F4"/>
-          </w:tcPr>
-          <w:p>
-            <w:pPr>
-              <w:pStyle w:val="LumisTabela"/>
-            </w:pPr>
-            <w:r>
-              <w:t>Head of AI Management. A DPO confere</w:t>
-            </w:r>
-          </w:p>
-        </w:tc>
-        <w:tc>
-          <w:tcPr>
-            <w:tcW w:type="dxa" w:w="1587"/>
-            <w:shd w:val="clear" w:color="auto" w:fill="F1F6F4"/>
-          </w:tcPr>
-          <w:p>
-            <w:pPr>
-              <w:pStyle w:val="LumisTabela"/>
-            </w:pPr>
-            <w:r>
-              <w:t>Sim: monitoramento e liberação</w:t>
-            </w:r>
-          </w:p>
-        </w:tc>
-        <w:tc>
-          <w:tcPr>
-            <w:tcW w:type="dxa" w:w="1928"/>
-            <w:shd w:val="clear" w:color="auto" w:fill="F1F6F4"/>
-          </w:tcPr>
-          <w:p>
-            <w:pPr>
-              <w:pStyle w:val="LumisTabela"/>
-            </w:pPr>
-            <w:r>
-              <w:t>A gravidade e o incidente que ninguém viu</w:t>
-            </w:r>
-          </w:p>
-        </w:tc>
-      </w:tr>
-      <w:tr>
-        <w:trPr>
-          <w:cantSplit/>
-        </w:trPr>
-        <w:tc>
-          <w:tcPr>
-            <w:tcW w:type="dxa" w:w="1814"/>
-          </w:tcPr>
-          <w:p>
-            <w:pPr>
-              <w:pStyle w:val="LumisTabela"/>
-              <w:keepNext/>
-            </w:pPr>
-            <w:r>
-              <w:t>5. Afirmações auditáveis: 0 de 5</w:t>
-            </w:r>
-          </w:p>
-        </w:tc>
-        <w:tc>
-          <w:tcPr>
-            <w:tcW w:type="dxa" w:w="1814"/>
-          </w:tcPr>
-          <w:p>
-            <w:pPr>
-              <w:pStyle w:val="LumisTabela"/>
-              <w:keepNext/>
-            </w:pPr>
-            <w:r>
-              <w:t>Material público contra checklist de relato</w:t>
-            </w:r>
-          </w:p>
-        </w:tc>
-        <w:tc>
-          <w:tcPr>
-            <w:tcW w:type="dxa" w:w="1928"/>
-          </w:tcPr>
-          <w:p>
-            <w:pPr>
-              <w:pStyle w:val="LumisTabela"/>
-              <w:keepNext/>
-            </w:pPr>
-            <w:r>
-              <w:t>Por quem não vende. Cliente ou auditor refaz</w:t>
-            </w:r>
-          </w:p>
-        </w:tc>
-        <w:tc>
-          <w:tcPr>
-            <w:tcW w:type="dxa" w:w="1587"/>
-          </w:tcPr>
-          <w:p>
-            <w:pPr>
-              <w:pStyle w:val="LumisTabela"/>
-              <w:keepNext/>
-            </w:pPr>
-            <w:r>
-              <w:t>Sim: publicar ou retirar</w:t>
-            </w:r>
-          </w:p>
-        </w:tc>
-        <w:tc>
-          <w:tcPr>
-            <w:tcW w:type="dxa" w:w="1928"/>
-          </w:tcPr>
-          <w:p>
-            <w:pPr>
-              <w:pStyle w:val="LumisTabela"/>
-              <w:keepNext/>
-            </w:pPr>
-            <w:r>
-              <w:t>O grupo que quem escolhe o recorte deixa de fora</w:t>
-            </w:r>
-          </w:p>
-        </w:tc>
-      </w:tr>
-    </w:tbl>
-    <w:p>
-      <w:pPr>
-        <w:pStyle w:val="Legenda"/>
-      </w:pPr>
-      <w:r>
-        <w:t>Tabela A2. Fonte: análise da equipe sobre o Cap. 2, Quadros 7, 10, 13, 14 e 17.</w:t>
-      </w:r>
-    </w:p>
-    <w:p>
-      <w:pPr>
-        <w:pStyle w:val="Ttulo2"/>
-      </w:pPr>
-      <w:r>
-        <w:t>A3. As quatro perguntas aplicadas aos indicadores descartados</w:t>
-      </w:r>
-    </w:p>
-    <w:tbl>
-      <w:tblPr>
-        <w:tblW w:type="auto" w:w="0"/>
-        <w:jc w:val="center"/>
-        <w:tblLayout w:type="fixed"/>
-        <w:tblLook w:firstColumn="1" w:firstRow="1" w:lastColumn="0" w:lastRow="0" w:noHBand="0" w:noVBand="1" w:val="04A0"/>
-        <w:tblBorders>
-          <w:top w:val="single" w:sz="4" w:color="D3DEDB"/>
-          <w:bottom w:val="single" w:sz="4" w:color="D3DEDB"/>
-          <w:insideH w:val="single" w:sz="4" w:color="D3DEDB"/>
-        </w:tblBorders>
-        <w:tblLayout w:type="fixed"/>
-      </w:tblPr>
-      <w:tblGrid>
-        <w:gridCol w:w="1927"/>
-        <w:gridCol w:w="1587"/>
-        <w:gridCol w:w="1814"/>
-        <w:gridCol w:w="2041"/>
-        <w:gridCol w:w="1701"/>
-      </w:tblGrid>
-      <w:tr>
-        <w:trPr>
-          <w:tblHeader w:val="true"/>
-          <w:cantSplit/>
-        </w:trPr>
-        <w:tc>
-          <w:tcPr>
-            <w:tcW w:type="dxa" w:w="1928"/>
-            <w:shd w:val="clear" w:color="auto" w:fill="0F2D3A"/>
-          </w:tcPr>
-          <w:p>
-            <w:pPr>
-              <w:pStyle w:val="LumisTabela"/>
-              <w:keepNext/>
-            </w:pPr>
-            <w:r>
-              <w:rPr>
-                <w:b/>
-                <w:color w:val="FFFFFF"/>
-              </w:rPr>
-              <w:t>Candidato</w:t>
-            </w:r>
-          </w:p>
-        </w:tc>
-        <w:tc>
-          <w:tcPr>
-            <w:tcW w:type="dxa" w:w="1587"/>
-            <w:shd w:val="clear" w:color="auto" w:fill="0F2D3A"/>
-          </w:tcPr>
-          <w:p>
-            <w:pPr>
-              <w:pStyle w:val="LumisTabela"/>
-              <w:keepNext/>
-            </w:pPr>
-            <w:r>
-              <w:rPr>
-                <w:b/>
-                <w:color w:val="FFFFFF"/>
-              </w:rPr>
-              <w:t>Medida em quê?</w:t>
-            </w:r>
-          </w:p>
-        </w:tc>
-        <w:tc>
-          <w:tcPr>
-            <w:tcW w:type="dxa" w:w="1814"/>
-            <w:shd w:val="clear" w:color="auto" w:fill="0F2D3A"/>
-          </w:tcPr>
-          <w:p>
-            <w:pPr>
-              <w:pStyle w:val="LumisTabela"/>
-              <w:keepNext/>
-            </w:pPr>
-            <w:r>
-              <w:rPr>
-                <w:b/>
-                <w:color w:val="FFFFFF"/>
-              </w:rPr>
-              <w:t>Medida por quem?</w:t>
-            </w:r>
-          </w:p>
-        </w:tc>
-        <w:tc>
-          <w:tcPr>
-            <w:tcW w:type="dxa" w:w="2041"/>
-            <w:shd w:val="clear" w:color="auto" w:fill="0F2D3A"/>
-          </w:tcPr>
-          <w:p>
-            <w:pPr>
-              <w:pStyle w:val="LumisTabela"/>
-              <w:keepNext/>
-            </w:pPr>
-            <w:r>
-              <w:rPr>
-                <w:b/>
-                <w:color w:val="FFFFFF"/>
-              </w:rPr>
-              <w:t>Muda alguma decisão?</w:t>
-            </w:r>
-          </w:p>
-        </w:tc>
-        <w:tc>
-          <w:tcPr>
-            <w:tcW w:type="dxa" w:w="1701"/>
-            <w:shd w:val="clear" w:color="auto" w:fill="0F2D3A"/>
-          </w:tcPr>
-          <w:p>
-            <w:pPr>
-              <w:pStyle w:val="LumisTabela"/>
-              <w:keepNext/>
-            </w:pPr>
-            <w:r>
-              <w:rPr>
-                <w:b/>
-                <w:color w:val="FFFFFF"/>
-              </w:rPr>
-              <w:t>Esconde qual distribuição?</w:t>
-            </w:r>
-          </w:p>
-        </w:tc>
-      </w:tr>
-      <w:tr>
-        <w:trPr>
-          <w:cantSplit/>
-        </w:trPr>
-        <w:tc>
-          <w:tcPr>
-            <w:tcW w:type="dxa" w:w="1928"/>
-          </w:tcPr>
-          <w:p>
-            <w:pPr>
-              <w:pStyle w:val="LumisTabela"/>
-              <w:keepNext/>
-            </w:pPr>
-            <w:r>
-              <w:t>Acurácia global em campo</w:t>
-            </w:r>
-          </w:p>
-        </w:tc>
-        <w:tc>
-          <w:tcPr>
-            <w:tcW w:type="dxa" w:w="1587"/>
-          </w:tcPr>
-          <w:p>
-            <w:pPr>
-              <w:pStyle w:val="LumisTabela"/>
-              <w:keepNext/>
-            </w:pPr>
-            <w:r>
-              <w:t>Base completa</w:t>
-            </w:r>
-          </w:p>
-        </w:tc>
-        <w:tc>
-          <w:tcPr>
-            <w:tcW w:type="dxa" w:w="1814"/>
-          </w:tcPr>
-          <w:p>
-            <w:pPr>
-              <w:pStyle w:val="LumisTabela"/>
-              <w:keepNext/>
-            </w:pPr>
-            <w:r>
-              <w:rPr>
-                <w:rStyle w:val="TagNoconsta"/>
-              </w:rPr>
-              <w:t>[não consta]</w:t>
-            </w:r>
-          </w:p>
-        </w:tc>
-        <w:tc>
-          <w:tcPr>
-            <w:tcW w:type="dxa" w:w="2041"/>
-          </w:tcPr>
-          <w:p>
-            <w:pPr>
-              <w:pStyle w:val="LumisTabela"/>
-              <w:keepNext/>
-            </w:pPr>
-            <w:r>
-              <w:t>Pouco</w:t>
-            </w:r>
-          </w:p>
-        </w:tc>
-        <w:tc>
-          <w:tcPr>
-            <w:tcW w:type="dxa" w:w="1701"/>
-          </w:tcPr>
-          <w:p>
-            <w:pPr>
-              <w:pStyle w:val="LumisTabela"/>
-              <w:keepNext/>
-            </w:pPr>
-            <w:r>
-              <w:t>O erro grave e os grupos</w:t>
-            </w:r>
-          </w:p>
-        </w:tc>
-      </w:tr>
-      <w:tr>
-        <w:trPr>
-          <w:cantSplit/>
-        </w:trPr>
-        <w:tc>
-          <w:tcPr>
-            <w:tcW w:type="dxa" w:w="1928"/>
-            <w:shd w:val="clear" w:color="auto" w:fill="F1F6F4"/>
-          </w:tcPr>
-          <w:p>
-            <w:pPr>
-              <w:pStyle w:val="LumisTabela"/>
-              <w:keepNext/>
-            </w:pPr>
-            <w:r>
-              <w:t>Comparação com a versão aprovada</w:t>
-            </w:r>
-          </w:p>
-        </w:tc>
-        <w:tc>
-          <w:tcPr>
-            <w:tcW w:type="dxa" w:w="1587"/>
-            <w:shd w:val="clear" w:color="auto" w:fill="F1F6F4"/>
-          </w:tcPr>
-          <w:p>
-            <w:pPr>
-              <w:pStyle w:val="LumisTabela"/>
-              <w:keepNext/>
-            </w:pPr>
-            <w:r>
-              <w:t>Troca de versão</w:t>
-            </w:r>
-          </w:p>
-        </w:tc>
-        <w:tc>
-          <w:tcPr>
-            <w:tcW w:type="dxa" w:w="1814"/>
-            <w:shd w:val="clear" w:color="auto" w:fill="F1F6F4"/>
-          </w:tcPr>
-          <w:p>
-            <w:pPr>
-              <w:pStyle w:val="LumisTabela"/>
-              <w:keepNext/>
-            </w:pPr>
-            <w:r>
-              <w:t>Pelo CTO, que também libera a versão</w:t>
-            </w:r>
-          </w:p>
-        </w:tc>
-        <w:tc>
-          <w:tcPr>
-            <w:tcW w:type="dxa" w:w="2041"/>
-            <w:shd w:val="clear" w:color="auto" w:fill="F1F6F4"/>
-          </w:tcPr>
-          <w:p>
-            <w:pPr>
-              <w:pStyle w:val="LumisTabela"/>
-              <w:keepNext/>
-            </w:pPr>
-            <w:r>
-              <w:t>Repete o indicador 1 e vira a regra de liberação dele</w:t>
-            </w:r>
-          </w:p>
-        </w:tc>
-        <w:tc>
-          <w:tcPr>
-            <w:tcW w:type="dxa" w:w="1701"/>
-            <w:shd w:val="clear" w:color="auto" w:fill="F1F6F4"/>
-          </w:tcPr>
-          <w:p>
-            <w:pPr>
-              <w:pStyle w:val="LumisTabela"/>
-              <w:keepNext/>
-            </w:pPr>
-            <w:r>
-              <w:t>O mesmo que o indicador 1</w:t>
-            </w:r>
-          </w:p>
-        </w:tc>
-      </w:tr>
-      <w:tr>
-        <w:trPr>
-          <w:cantSplit/>
-        </w:trPr>
-        <w:tc>
-          <w:tcPr>
-            <w:tcW w:type="dxa" w:w="1928"/>
-          </w:tcPr>
-          <w:p>
-            <w:pPr>
-              <w:pStyle w:val="LumisTabela"/>
-              <w:keepNext/>
-            </w:pPr>
-            <w:r>
-              <w:t>Disponibilidade de ponta a ponta</w:t>
-            </w:r>
-          </w:p>
-        </w:tc>
-        <w:tc>
-          <w:tcPr>
-            <w:tcW w:type="dxa" w:w="1587"/>
-          </w:tcPr>
-          <w:p>
-            <w:pPr>
-              <w:pStyle w:val="LumisTabela"/>
-              <w:keepNext/>
-            </w:pPr>
-            <w:r>
-              <w:t>Cadeia técnica</w:t>
-            </w:r>
-          </w:p>
-        </w:tc>
-        <w:tc>
-          <w:tcPr>
-            <w:tcW w:type="dxa" w:w="1814"/>
-          </w:tcPr>
-          <w:p>
-            <w:pPr>
-              <w:pStyle w:val="LumisTabela"/>
-              <w:keepNext/>
-            </w:pPr>
-            <w:r>
-              <w:t>Pelo CTO</w:t>
-            </w:r>
-          </w:p>
-        </w:tc>
-        <w:tc>
-          <w:tcPr>
-            <w:tcW w:type="dxa" w:w="2041"/>
-          </w:tcPr>
-          <w:p>
-            <w:pPr>
-              <w:pStyle w:val="LumisTabela"/>
-              <w:keepNext/>
-            </w:pPr>
-            <w:r>
-              <w:t>Decisão técnica, que não chega ao conselho</w:t>
-            </w:r>
-          </w:p>
-        </w:tc>
-        <w:tc>
-          <w:tcPr>
-            <w:tcW w:type="dxa" w:w="1701"/>
-          </w:tcPr>
-          <w:p>
-            <w:pPr>
-              <w:pStyle w:val="LumisTabela"/>
-              <w:keepNext/>
-            </w:pPr>
-            <w:r>
-              <w:t>Não abre por grupo</w:t>
-            </w:r>
-          </w:p>
-        </w:tc>
-      </w:tr>
-      <w:tr>
-        <w:trPr>
-          <w:cantSplit/>
-        </w:trPr>
-        <w:tc>
-          <w:tcPr>
-            <w:tcW w:type="dxa" w:w="1928"/>
-            <w:shd w:val="clear" w:color="auto" w:fill="F1F6F4"/>
-          </w:tcPr>
-          <w:p>
-            <w:pPr>
-              <w:pStyle w:val="LumisTabela"/>
-              <w:keepNext/>
-            </w:pPr>
-            <w:r>
-              <w:t>Auditorias contratuais concluídas</w:t>
-            </w:r>
-          </w:p>
-        </w:tc>
-        <w:tc>
-          <w:tcPr>
-            <w:tcW w:type="dxa" w:w="1587"/>
-            <w:shd w:val="clear" w:color="auto" w:fill="F1F6F4"/>
-          </w:tcPr>
-          <w:p>
-            <w:pPr>
-              <w:pStyle w:val="LumisTabela"/>
-              <w:keepNext/>
-            </w:pPr>
-            <w:r>
-              <w:t>Número de auditorias</w:t>
-            </w:r>
-          </w:p>
-        </w:tc>
-        <w:tc>
-          <w:tcPr>
-            <w:tcW w:type="dxa" w:w="1814"/>
-            <w:shd w:val="clear" w:color="auto" w:fill="F1F6F4"/>
-          </w:tcPr>
-          <w:p>
-            <w:pPr>
-              <w:pStyle w:val="LumisTabela"/>
-              <w:keepNext/>
-            </w:pPr>
-            <w:r>
-              <w:t>Pela DPO</w:t>
-            </w:r>
-          </w:p>
-        </w:tc>
-        <w:tc>
-          <w:tcPr>
-            <w:tcW w:type="dxa" w:w="2041"/>
-            <w:shd w:val="clear" w:color="auto" w:fill="F1F6F4"/>
-          </w:tcPr>
-          <w:p>
-            <w:pPr>
-              <w:pStyle w:val="LumisTabela"/>
-              <w:keepNext/>
-            </w:pPr>
-            <w:r>
-              <w:t>Não. Mede atividade</w:t>
-            </w:r>
-          </w:p>
-        </w:tc>
-        <w:tc>
-          <w:tcPr>
-            <w:tcW w:type="dxa" w:w="1701"/>
-            <w:shd w:val="clear" w:color="auto" w:fill="F1F6F4"/>
-          </w:tcPr>
-          <w:p>
-            <w:pPr>
-              <w:pStyle w:val="LumisTabela"/>
-              <w:keepNext/>
-            </w:pPr>
-            <w:r>
-              <w:t>Quantos registros estão afetados</w:t>
-            </w:r>
-          </w:p>
-        </w:tc>
-      </w:tr>
-      <w:tr>
-        <w:trPr>
-          <w:cantSplit/>
-        </w:trPr>
-        <w:tc>
-          <w:tcPr>
-            <w:tcW w:type="dxa" w:w="1928"/>
-          </w:tcPr>
-          <w:p>
-            <w:pPr>
-              <w:pStyle w:val="LumisTabela"/>
-              <w:keepNext/>
-            </w:pPr>
-            <w:r>
-              <w:t>Pacientes únicos analisados</w:t>
-            </w:r>
-          </w:p>
-        </w:tc>
-        <w:tc>
-          <w:tcPr>
-            <w:tcW w:type="dxa" w:w="1587"/>
-          </w:tcPr>
-          <w:p>
-            <w:pPr>
-              <w:pStyle w:val="LumisTabela"/>
-              <w:keepNext/>
-            </w:pPr>
-            <w:r>
-              <w:t>Base sem duplicidade</w:t>
-            </w:r>
-          </w:p>
-        </w:tc>
-        <w:tc>
-          <w:tcPr>
-            <w:tcW w:type="dxa" w:w="1814"/>
-          </w:tcPr>
-          <w:p>
-            <w:pPr>
-              <w:pStyle w:val="LumisTabela"/>
-              <w:keepNext/>
-            </w:pPr>
-            <w:r>
-              <w:t>Pela área de Dados</w:t>
-            </w:r>
-          </w:p>
-        </w:tc>
-        <w:tc>
-          <w:tcPr>
-            <w:tcW w:type="dxa" w:w="2041"/>
-          </w:tcPr>
-          <w:p>
-            <w:pPr>
-              <w:pStyle w:val="LumisTabela"/>
-              <w:keepNext/>
-            </w:pPr>
-            <w:r>
-              <w:t>Não. É volume</w:t>
-            </w:r>
-          </w:p>
-        </w:tc>
-        <w:tc>
-          <w:tcPr>
-            <w:tcW w:type="dxa" w:w="1701"/>
-          </w:tcPr>
-          <w:p>
-            <w:pPr>
-              <w:pStyle w:val="LumisTabela"/>
-              <w:keepNext/>
-            </w:pPr>
-            <w:r>
-              <w:t>Quem foi mal atendido</w:t>
-            </w:r>
-          </w:p>
-        </w:tc>
-      </w:tr>
-    </w:tbl>
-    <w:p>
-      <w:pPr>
-        <w:pStyle w:val="Legenda"/>
-      </w:pPr>
-      <w:r>
-        <w:t>Tabela A3. Fonte: análise da equipe sobre o Cap. 2, Quadros 9, 11 e 13.</w:t>
+        <w:t>Dados da Lumis: Cap. 2, Anexo A. Contas e propostas são da equipe. A empresa real citada é análogo e não faz parte do caso Lumis.</w:t>
       </w:r>
     </w:p>
     <w:sectPr>

</xml_diff>